<commit_message>
feat: implementa pasaje de parámetros por QueryString - Creación de prototipo "Catálogo de Cursos" independiente para prácticas. - Implementación de Response.Redirect para enviar ID y nombre del curso desde la página origen. - Uso de Request.QueryString en el Page_Load de la página destino para capturar y renderizar la información. - Comprensión del flujo cliente-servidor y preparación para el uso de variables de Session.
</commit_message>
<xml_diff>
--- a/Unidad 4 - Eventos/DOCUMENTACIÓN TÉCNICA DE EVENTOS.docx
+++ b/Unidad 4 - Eventos/DOCUMENTACIÓN TÉCNICA DE EVENTOS.docx
@@ -383,7 +383,7 @@
       </w:pPr>
       <w:r>
         <w:pict w14:anchorId="66B3528E">
-          <v:rect id="_x0000_i1031" style="width:0;height:1.5pt" o:hralign="center" o:hrstd="t" o:hr="t" fillcolor="#a0a0a0" stroked="f"/>
+          <v:rect id="_x0000_i1025" style="width:0;height:1.5pt" o:hralign="center" o:hrstd="t" o:hr="t" fillcolor="#a0a0a0" stroked="f"/>
         </w:pict>
       </w:r>
     </w:p>
@@ -690,6 +690,529 @@
       <w:r>
         <w:t>, cada vez que el usuario haga clic en un botón, la página volverá a cargar la lista original y podrías perder los cambios que el usuario hizo en la pantalla.</w:t>
       </w:r>
+    </w:p>
+    <w:p>
+      <w:pPr>
+        <w:jc w:val="both"/>
+      </w:pPr>
+    </w:p>
+    <w:p>
+      <w:pPr>
+        <w:jc w:val="both"/>
+      </w:pPr>
+      <w:r>
+        <w:t>TU NAVEGADOR                      SERVIDOR</w:t>
+      </w:r>
+    </w:p>
+    <w:p>
+      <w:pPr>
+        <w:jc w:val="both"/>
+      </w:pPr>
+      <w:r>
+        <w:t>|                                                                 |</w:t>
+      </w:r>
+    </w:p>
+    <w:p>
+      <w:pPr>
+        <w:jc w:val="both"/>
+      </w:pPr>
+      <w:r>
+        <w:t>|----[Haces clic en botón]------&gt; |</w:t>
+      </w:r>
+    </w:p>
+    <w:p>
+      <w:pPr>
+        <w:jc w:val="both"/>
+      </w:pPr>
+      <w:r>
+        <w:t>|                                                                  |</w:t>
+      </w:r>
+    </w:p>
+    <w:p>
+      <w:pPr>
+        <w:jc w:val="both"/>
+      </w:pPr>
+      <w:r>
+        <w:t>|                                                                  |----&gt; Lee datos</w:t>
+      </w:r>
+    </w:p>
+    <w:p>
+      <w:pPr>
+        <w:jc w:val="both"/>
+      </w:pPr>
+      <w:r>
+        <w:t>|                                                                  |----&gt; Procesa</w:t>
+      </w:r>
+    </w:p>
+    <w:p>
+      <w:pPr>
+        <w:jc w:val="both"/>
+      </w:pPr>
+      <w:r>
+        <w:t>|                                                                  |----&gt; Genera HTML</w:t>
+      </w:r>
+    </w:p>
+    <w:p>
+      <w:pPr>
+        <w:jc w:val="both"/>
+      </w:pPr>
+      <w:r>
+        <w:t>|                                                                  |</w:t>
+      </w:r>
+    </w:p>
+    <w:p>
+      <w:pPr>
+        <w:jc w:val="both"/>
+      </w:pPr>
+      <w:r>
+        <w:t>|&lt;---[Página actualizada]--------- |</w:t>
+      </w:r>
+    </w:p>
+    <w:p>
+      <w:pPr>
+        <w:jc w:val="both"/>
+      </w:pPr>
+      <w:r>
+        <w:t>|                                                                   |</w:t>
+      </w:r>
+    </w:p>
+    <w:p>
+      <w:pPr>
+        <w:jc w:val="both"/>
+      </w:pPr>
+      <w:r>
+        <w:t>¡La página se ve diferente!             |</w:t>
+      </w:r>
+    </w:p>
+    <w:p>
+      <w:pPr>
+        <w:jc w:val="both"/>
+      </w:pPr>
+    </w:p>
+    <w:p>
+      <w:pPr>
+        <w:jc w:val="both"/>
+        <w:rPr>
+          <w:b/>
+          <w:bCs/>
+        </w:rPr>
+      </w:pPr>
+      <w:r>
+        <w:rPr>
+          <w:rFonts w:ascii="Segoe UI Emoji" w:hAnsi="Segoe UI Emoji" w:cs="Segoe UI Emoji"/>
+          <w:b/>
+          <w:bCs/>
+        </w:rPr>
+        <w:t>📌</w:t>
+      </w:r>
+      <w:r>
+        <w:rPr>
+          <w:b/>
+          <w:bCs/>
+        </w:rPr>
+        <w:t xml:space="preserve"> Parámetros por URL - </w:t>
+      </w:r>
+      <w:proofErr w:type="spellStart"/>
+      <w:r>
+        <w:rPr>
+          <w:b/>
+          <w:bCs/>
+        </w:rPr>
+        <w:t>QuickWatch</w:t>
+      </w:r>
+      <w:proofErr w:type="spellEnd"/>
+    </w:p>
+    <w:p>
+      <w:pPr>
+        <w:jc w:val="both"/>
+      </w:pPr>
+      <w:r>
+        <w:t>Imagina que los parámetros por URL son como </w:t>
+      </w:r>
+      <w:r>
+        <w:rPr>
+          <w:b/>
+          <w:bCs/>
+        </w:rPr>
+        <w:t>escribir una dirección en un sobre</w:t>
+      </w:r>
+      <w:r>
+        <w:t> para que el destinatario sepa exactamente qué quieres.</w:t>
+      </w:r>
+    </w:p>
+    <w:p>
+      <w:pPr>
+        <w:jc w:val="both"/>
+      </w:pPr>
+      <w:r>
+        <w:pict w14:anchorId="2A81E5FE">
+          <v:rect id="_x0000_i1032" style="width:0;height:.75pt" o:hralign="center" o:hrstd="t" o:hr="t" fillcolor="#a0a0a0" stroked="f"/>
+        </w:pict>
+      </w:r>
+    </w:p>
+    <w:p>
+      <w:pPr>
+        <w:jc w:val="both"/>
+        <w:rPr>
+          <w:b/>
+          <w:bCs/>
+        </w:rPr>
+      </w:pPr>
+      <w:r>
+        <w:rPr>
+          <w:rFonts w:ascii="Segoe UI Emoji" w:hAnsi="Segoe UI Emoji" w:cs="Segoe UI Emoji"/>
+          <w:b/>
+          <w:bCs/>
+        </w:rPr>
+        <w:t>🧩</w:t>
+      </w:r>
+      <w:r>
+        <w:rPr>
+          <w:b/>
+          <w:bCs/>
+        </w:rPr>
+        <w:t> ¿Qué son los Parámetros por URL?</w:t>
+      </w:r>
+    </w:p>
+    <w:p>
+      <w:pPr>
+        <w:jc w:val="both"/>
+      </w:pPr>
+      <w:r>
+        <w:t>Son </w:t>
+      </w:r>
+      <w:r>
+        <w:rPr>
+          <w:b/>
+          <w:bCs/>
+        </w:rPr>
+        <w:t>datos adicionales</w:t>
+      </w:r>
+      <w:r>
+        <w:t> que se envían al servidor </w:t>
+      </w:r>
+      <w:r>
+        <w:rPr>
+          <w:b/>
+          <w:bCs/>
+        </w:rPr>
+        <w:t>a través de la barra de direcciones del navegador</w:t>
+      </w:r>
+      <w:r>
+        <w:t>.</w:t>
+      </w:r>
+    </w:p>
+    <w:p>
+      <w:pPr>
+        <w:jc w:val="both"/>
+      </w:pPr>
+      <w:r>
+        <w:rPr>
+          <w:b/>
+          <w:bCs/>
+        </w:rPr>
+        <w:t>Ejemplo visual:</w:t>
+      </w:r>
+    </w:p>
+    <w:p>
+      <w:pPr>
+        <w:jc w:val="both"/>
+      </w:pPr>
+      <w:r>
+        <w:t>https://www.tienda.com/producto?id=123&amp;color=rojo</w:t>
+      </w:r>
+    </w:p>
+    <w:p>
+      <w:pPr>
+        <w:jc w:val="both"/>
+      </w:pPr>
+      <w:r>
+        <w:t xml:space="preserve">        </w:t>
+      </w:r>
+      <w:r>
+        <w:t xml:space="preserve">                      </w:t>
+      </w:r>
+      <w:r>
+        <w:t xml:space="preserve"> ↑              </w:t>
+      </w:r>
+      <w:r>
+        <w:t xml:space="preserve">                </w:t>
+      </w:r>
+      <w:r>
+        <w:t xml:space="preserve">↑     </w:t>
+      </w:r>
+      <w:r>
+        <w:t xml:space="preserve"> </w:t>
+      </w:r>
+      <w:r>
+        <w:t xml:space="preserve"> </w:t>
+      </w:r>
+      <w:r>
+        <w:t xml:space="preserve">            </w:t>
+      </w:r>
+      <w:r>
+        <w:t xml:space="preserve"> ↑      </w:t>
+      </w:r>
+      <w:r>
+        <w:t xml:space="preserve">  </w:t>
+      </w:r>
+      <w:r>
+        <w:t xml:space="preserve">↑     </w:t>
+      </w:r>
+      <w:r>
+        <w:t xml:space="preserve">    </w:t>
+      </w:r>
+      <w:r>
+        <w:t xml:space="preserve"> ↑</w:t>
+      </w:r>
+    </w:p>
+    <w:p>
+      <w:pPr>
+        <w:jc w:val="both"/>
+      </w:pPr>
+      <w:r>
+        <w:t xml:space="preserve">       </w:t>
+      </w:r>
+      <w:r>
+        <w:t xml:space="preserve">                     </w:t>
+      </w:r>
+      <w:r>
+        <w:t xml:space="preserve">DOMINIO    </w:t>
+      </w:r>
+      <w:proofErr w:type="gramStart"/>
+      <w:r>
+        <w:t>PÁGINA  ?</w:t>
+      </w:r>
+      <w:proofErr w:type="gramEnd"/>
+      <w:r>
+        <w:t xml:space="preserve"> </w:t>
+      </w:r>
+      <w:proofErr w:type="gramStart"/>
+      <w:r>
+        <w:t>INICIO  CLAVE</w:t>
+      </w:r>
+      <w:proofErr w:type="gramEnd"/>
+      <w:r>
+        <w:t xml:space="preserve">  VALOR</w:t>
+      </w:r>
+    </w:p>
+    <w:p>
+      <w:pPr>
+        <w:jc w:val="both"/>
+      </w:pPr>
+    </w:p>
+    <w:p>
+      <w:pPr>
+        <w:jc w:val="both"/>
+        <w:rPr>
+          <w:b/>
+          <w:bCs/>
+        </w:rPr>
+      </w:pPr>
+    </w:p>
+    <w:p>
+      <w:pPr>
+        <w:jc w:val="both"/>
+        <w:rPr>
+          <w:b/>
+          <w:bCs/>
+        </w:rPr>
+      </w:pPr>
+    </w:p>
+    <w:p>
+      <w:pPr>
+        <w:jc w:val="both"/>
+        <w:rPr>
+          <w:b/>
+          <w:bCs/>
+        </w:rPr>
+      </w:pPr>
+    </w:p>
+    <w:p>
+      <w:pPr>
+        <w:jc w:val="both"/>
+        <w:rPr>
+          <w:b/>
+          <w:bCs/>
+        </w:rPr>
+      </w:pPr>
+      <w:r>
+        <w:rPr>
+          <w:b/>
+          <w:bCs/>
+        </w:rPr>
+        <w:lastRenderedPageBreak/>
+        <w:t>Los parámetros en la URL son como dar TODAS las instrucciones desde el principio:</w:t>
+      </w:r>
+    </w:p>
+    <w:p>
+      <w:pPr>
+        <w:jc w:val="both"/>
+      </w:pPr>
+      <w:r>
+        <w:drawing>
+          <wp:anchor distT="0" distB="0" distL="114300" distR="114300" simplePos="0" relativeHeight="251658240" behindDoc="1" locked="0" layoutInCell="1" allowOverlap="1" wp14:anchorId="599BBE94" wp14:editId="2FB82038">
+            <wp:simplePos x="0" y="0"/>
+            <wp:positionH relativeFrom="column">
+              <wp:posOffset>0</wp:posOffset>
+            </wp:positionH>
+            <wp:positionV relativeFrom="paragraph">
+              <wp:posOffset>-1179</wp:posOffset>
+            </wp:positionV>
+            <wp:extent cx="6645910" cy="1196975"/>
+            <wp:effectExtent l="0" t="0" r="2540" b="3175"/>
+            <wp:wrapTight wrapText="bothSides">
+              <wp:wrapPolygon edited="0">
+                <wp:start x="0" y="0"/>
+                <wp:lineTo x="0" y="21314"/>
+                <wp:lineTo x="21546" y="21314"/>
+                <wp:lineTo x="21546" y="0"/>
+                <wp:lineTo x="0" y="0"/>
+              </wp:wrapPolygon>
+            </wp:wrapTight>
+            <wp:docPr id="1" name="Imagen 1"/>
+            <wp:cNvGraphicFramePr>
+              <a:graphicFrameLocks xmlns:a="http://schemas.openxmlformats.org/drawingml/2006/main" noChangeAspect="1"/>
+            </wp:cNvGraphicFramePr>
+            <a:graphic xmlns:a="http://schemas.openxmlformats.org/drawingml/2006/main">
+              <a:graphicData uri="http://schemas.openxmlformats.org/drawingml/2006/picture">
+                <pic:pic xmlns:pic="http://schemas.openxmlformats.org/drawingml/2006/picture">
+                  <pic:nvPicPr>
+                    <pic:cNvPr id="1" name=""/>
+                    <pic:cNvPicPr/>
+                  </pic:nvPicPr>
+                  <pic:blipFill>
+                    <a:blip r:embed="rId5">
+                      <a:extLst>
+                        <a:ext uri="{28A0092B-C50C-407E-A947-70E740481C1C}">
+                          <a14:useLocalDpi xmlns:a14="http://schemas.microsoft.com/office/drawing/2010/main" val="0"/>
+                        </a:ext>
+                      </a:extLst>
+                    </a:blip>
+                    <a:stretch>
+                      <a:fillRect/>
+                    </a:stretch>
+                  </pic:blipFill>
+                  <pic:spPr>
+                    <a:xfrm>
+                      <a:off x="0" y="0"/>
+                      <a:ext cx="6645910" cy="1196975"/>
+                    </a:xfrm>
+                    <a:prstGeom prst="rect">
+                      <a:avLst/>
+                    </a:prstGeom>
+                  </pic:spPr>
+                </pic:pic>
+              </a:graphicData>
+            </a:graphic>
+          </wp:anchor>
+        </w:drawing>
+      </w:r>
+    </w:p>
+    <w:p>
+      <w:pPr>
+        <w:jc w:val="both"/>
+      </w:pPr>
+      <w:r>
+        <w:drawing>
+          <wp:anchor distT="0" distB="0" distL="114300" distR="114300" simplePos="0" relativeHeight="251659264" behindDoc="0" locked="0" layoutInCell="1" allowOverlap="1" wp14:anchorId="5579D058" wp14:editId="78FCC131">
+            <wp:simplePos x="0" y="0"/>
+            <wp:positionH relativeFrom="column">
+              <wp:posOffset>0</wp:posOffset>
+            </wp:positionH>
+            <wp:positionV relativeFrom="paragraph">
+              <wp:posOffset>1542</wp:posOffset>
+            </wp:positionV>
+            <wp:extent cx="6645910" cy="2523490"/>
+            <wp:effectExtent l="0" t="0" r="2540" b="0"/>
+            <wp:wrapSquare wrapText="bothSides"/>
+            <wp:docPr id="2" name="Imagen 2"/>
+            <wp:cNvGraphicFramePr>
+              <a:graphicFrameLocks xmlns:a="http://schemas.openxmlformats.org/drawingml/2006/main" noChangeAspect="1"/>
+            </wp:cNvGraphicFramePr>
+            <a:graphic xmlns:a="http://schemas.openxmlformats.org/drawingml/2006/main">
+              <a:graphicData uri="http://schemas.openxmlformats.org/drawingml/2006/picture">
+                <pic:pic xmlns:pic="http://schemas.openxmlformats.org/drawingml/2006/picture">
+                  <pic:nvPicPr>
+                    <pic:cNvPr id="1" name=""/>
+                    <pic:cNvPicPr/>
+                  </pic:nvPicPr>
+                  <pic:blipFill>
+                    <a:blip r:embed="rId6">
+                      <a:extLst>
+                        <a:ext uri="{28A0092B-C50C-407E-A947-70E740481C1C}">
+                          <a14:useLocalDpi xmlns:a14="http://schemas.microsoft.com/office/drawing/2010/main" val="0"/>
+                        </a:ext>
+                      </a:extLst>
+                    </a:blip>
+                    <a:stretch>
+                      <a:fillRect/>
+                    </a:stretch>
+                  </pic:blipFill>
+                  <pic:spPr>
+                    <a:xfrm>
+                      <a:off x="0" y="0"/>
+                      <a:ext cx="6645910" cy="2523490"/>
+                    </a:xfrm>
+                    <a:prstGeom prst="rect">
+                      <a:avLst/>
+                    </a:prstGeom>
+                  </pic:spPr>
+                </pic:pic>
+              </a:graphicData>
+            </a:graphic>
+          </wp:anchor>
+        </w:drawing>
+      </w:r>
+    </w:p>
+    <w:p>
+      <w:pPr>
+        <w:jc w:val="both"/>
+        <w:rPr>
+          <w:b/>
+          <w:bCs/>
+        </w:rPr>
+      </w:pPr>
+      <w:r>
+        <w:rPr>
+          <w:rFonts w:ascii="Segoe UI Emoji" w:hAnsi="Segoe UI Emoji" w:cs="Segoe UI Emoji"/>
+          <w:b/>
+          <w:bCs/>
+        </w:rPr>
+        <w:t>🎓</w:t>
+      </w:r>
+      <w:r>
+        <w:rPr>
+          <w:b/>
+          <w:bCs/>
+        </w:rPr>
+        <w:t> Máxima para recordar</w:t>
+      </w:r>
+    </w:p>
+    <w:p>
+      <w:pPr>
+        <w:jc w:val="both"/>
+        <w:rPr>
+          <w:b/>
+          <w:bCs/>
+        </w:rPr>
+      </w:pPr>
+      <w:r>
+        <w:rPr>
+          <w:b/>
+          <w:bCs/>
+        </w:rPr>
+        <w:t>Los parámetros por URL son como una nota adhesiva en la frente de un mensajero: le dices exactamente qué debe hacer sin necesidad de abrir la caja.</w:t>
+      </w:r>
+    </w:p>
+    <w:p>
+      <w:pPr>
+        <w:jc w:val="both"/>
+        <w:rPr>
+          <w:b/>
+          <w:bCs/>
+        </w:rPr>
+      </w:pPr>
     </w:p>
     <w:p>
       <w:pPr>

</xml_diff>

<commit_message>
feat: configurar columnas de GridView manualmente. - Desactivación de AutoGenerateColumns en ListaCursos.aspx para control total del diseño. - Implementación de la colección <Columns> en el control GridView. - Uso de <asp:BoundField> para mapear propiedades específicas (ID, Nombre, Nivel). - Personalización de los encabezados de tabla mediante la propiedad HeaderText. - Mantenimiento de la integridad de los datos en el DataSource sin exponer campos innecesarios.
</commit_message>
<xml_diff>
--- a/Unidad 4 - Eventos/DOCUMENTACIÓN TÉCNICA DE EVENTOS.docx
+++ b/Unidad 4 - Eventos/DOCUMENTACIÓN TÉCNICA DE EVENTOS.docx
@@ -3299,6 +3299,1028 @@
         <w:rPr>
           <w:sz w:val="32"/>
           <w:szCs w:val="32"/>
+          <w:u w:val="double"/>
+        </w:rPr>
+      </w:pPr>
+      <w:r>
+        <w:rPr>
+          <w:b/>
+          <w:bCs/>
+          <w:sz w:val="32"/>
+          <w:szCs w:val="32"/>
+          <w:u w:val="double"/>
+        </w:rPr>
+        <w:lastRenderedPageBreak/>
+        <w:t xml:space="preserve">TEMA: Control </w:t>
+      </w:r>
+      <w:proofErr w:type="spellStart"/>
+      <w:r>
+        <w:rPr>
+          <w:b/>
+          <w:bCs/>
+          <w:sz w:val="32"/>
+          <w:szCs w:val="32"/>
+          <w:u w:val="double"/>
+        </w:rPr>
+        <w:t>GridView</w:t>
+      </w:r>
+      <w:proofErr w:type="spellEnd"/>
+      <w:r>
+        <w:rPr>
+          <w:b/>
+          <w:bCs/>
+          <w:sz w:val="32"/>
+          <w:szCs w:val="32"/>
+          <w:u w:val="double"/>
+        </w:rPr>
+        <w:t xml:space="preserve"> y Vinculación de Datos (</w:t>
+      </w:r>
+      <w:proofErr w:type="spellStart"/>
+      <w:r>
+        <w:rPr>
+          <w:b/>
+          <w:bCs/>
+          <w:sz w:val="32"/>
+          <w:szCs w:val="32"/>
+          <w:u w:val="double"/>
+        </w:rPr>
+        <w:t>DataBinding</w:t>
+      </w:r>
+      <w:proofErr w:type="spellEnd"/>
+      <w:r>
+        <w:rPr>
+          <w:b/>
+          <w:bCs/>
+          <w:sz w:val="32"/>
+          <w:szCs w:val="32"/>
+          <w:u w:val="double"/>
+        </w:rPr>
+        <w:t>)</w:t>
+      </w:r>
+    </w:p>
+    <w:p>
+      <w:pPr>
+        <w:tabs>
+          <w:tab w:val="left" w:pos="2323"/>
+        </w:tabs>
+        <w:rPr>
+          <w:sz w:val="32"/>
+          <w:szCs w:val="32"/>
+        </w:rPr>
+      </w:pPr>
+      <w:r>
+        <w:rPr>
+          <w:b/>
+          <w:bCs/>
+          <w:sz w:val="32"/>
+          <w:szCs w:val="32"/>
+        </w:rPr>
+        <w:t xml:space="preserve">1. ¿Qué es el </w:t>
+      </w:r>
+      <w:proofErr w:type="spellStart"/>
+      <w:r>
+        <w:rPr>
+          <w:b/>
+          <w:bCs/>
+          <w:sz w:val="32"/>
+          <w:szCs w:val="32"/>
+        </w:rPr>
+        <w:t>GridView</w:t>
+      </w:r>
+      <w:proofErr w:type="spellEnd"/>
+      <w:r>
+        <w:rPr>
+          <w:b/>
+          <w:bCs/>
+          <w:sz w:val="32"/>
+          <w:szCs w:val="32"/>
+        </w:rPr>
+        <w:t>?</w:t>
+      </w:r>
+      <w:r>
+        <w:rPr>
+          <w:sz w:val="32"/>
+          <w:szCs w:val="32"/>
+        </w:rPr>
+        <w:t xml:space="preserve"> Es un control de servidor de ASP.NET que permite mostrar el contenido de un origen de datos (listas, tablas de BD, </w:t>
+      </w:r>
+      <w:proofErr w:type="spellStart"/>
+      <w:r>
+        <w:rPr>
+          <w:sz w:val="32"/>
+          <w:szCs w:val="32"/>
+        </w:rPr>
+        <w:t>arrays</w:t>
+      </w:r>
+      <w:proofErr w:type="spellEnd"/>
+      <w:r>
+        <w:rPr>
+          <w:sz w:val="32"/>
+          <w:szCs w:val="32"/>
+        </w:rPr>
+        <w:t xml:space="preserve">) en una tabla HTML (&lt;table&gt;). Es fundamental en el desarrollo </w:t>
+      </w:r>
+      <w:proofErr w:type="spellStart"/>
+      <w:r>
+        <w:rPr>
+          <w:sz w:val="32"/>
+          <w:szCs w:val="32"/>
+        </w:rPr>
+        <w:t>Backend</w:t>
+      </w:r>
+      <w:proofErr w:type="spellEnd"/>
+      <w:r>
+        <w:rPr>
+          <w:sz w:val="32"/>
+          <w:szCs w:val="32"/>
+        </w:rPr>
+        <w:t xml:space="preserve"> para mostrar reportes, catálogos o paneles de administración.</w:t>
+      </w:r>
+    </w:p>
+    <w:p>
+      <w:pPr>
+        <w:tabs>
+          <w:tab w:val="left" w:pos="2323"/>
+        </w:tabs>
+        <w:rPr>
+          <w:sz w:val="32"/>
+          <w:szCs w:val="32"/>
+        </w:rPr>
+      </w:pPr>
+      <w:r>
+        <w:rPr>
+          <w:b/>
+          <w:bCs/>
+          <w:sz w:val="32"/>
+          <w:szCs w:val="32"/>
+        </w:rPr>
+        <w:t xml:space="preserve">2. Propiedad </w:t>
+      </w:r>
+      <w:proofErr w:type="spellStart"/>
+      <w:r>
+        <w:rPr>
+          <w:b/>
+          <w:bCs/>
+          <w:sz w:val="32"/>
+          <w:szCs w:val="32"/>
+        </w:rPr>
+        <w:t>AutoGenerateColumns</w:t>
+      </w:r>
+      <w:proofErr w:type="spellEnd"/>
+    </w:p>
+    <w:p>
+      <w:pPr>
+        <w:numPr>
+          <w:ilvl w:val="0"/>
+          <w:numId w:val="7"/>
+        </w:numPr>
+        <w:tabs>
+          <w:tab w:val="left" w:pos="2323"/>
+        </w:tabs>
+        <w:rPr>
+          <w:sz w:val="32"/>
+          <w:szCs w:val="32"/>
+        </w:rPr>
+      </w:pPr>
+      <w:r>
+        <w:rPr>
+          <w:b/>
+          <w:bCs/>
+          <w:sz w:val="32"/>
+          <w:szCs w:val="32"/>
+        </w:rPr>
+        <w:t>Definición:</w:t>
+      </w:r>
+      <w:r>
+        <w:rPr>
+          <w:sz w:val="32"/>
+          <w:szCs w:val="32"/>
+        </w:rPr>
+        <w:t xml:space="preserve"> Es una propiedad booleana (true / false).</w:t>
+      </w:r>
+    </w:p>
+    <w:p>
+      <w:pPr>
+        <w:numPr>
+          <w:ilvl w:val="0"/>
+          <w:numId w:val="7"/>
+        </w:numPr>
+        <w:tabs>
+          <w:tab w:val="left" w:pos="2323"/>
+        </w:tabs>
+        <w:rPr>
+          <w:sz w:val="32"/>
+          <w:szCs w:val="32"/>
+        </w:rPr>
+      </w:pPr>
+      <w:r>
+        <w:rPr>
+          <w:b/>
+          <w:bCs/>
+          <w:sz w:val="32"/>
+          <w:szCs w:val="32"/>
+        </w:rPr>
+        <w:t>Funcionamiento:</w:t>
+      </w:r>
+      <w:r>
+        <w:rPr>
+          <w:sz w:val="32"/>
+          <w:szCs w:val="32"/>
+        </w:rPr>
+        <w:t xml:space="preserve"> Cuando está en true (valor por defecto), el control analiza el objeto que le pasamos y crea automáticamente una columna por cada propiedad pública que encuentre.</w:t>
+      </w:r>
+    </w:p>
+    <w:p>
+      <w:pPr>
+        <w:numPr>
+          <w:ilvl w:val="0"/>
+          <w:numId w:val="7"/>
+        </w:numPr>
+        <w:tabs>
+          <w:tab w:val="left" w:pos="2323"/>
+        </w:tabs>
+        <w:rPr>
+          <w:sz w:val="32"/>
+          <w:szCs w:val="32"/>
+        </w:rPr>
+      </w:pPr>
+      <w:r>
+        <w:rPr>
+          <w:b/>
+          <w:bCs/>
+          <w:sz w:val="32"/>
+          <w:szCs w:val="32"/>
+        </w:rPr>
+        <w:t>Uso:</w:t>
+      </w:r>
+      <w:r>
+        <w:rPr>
+          <w:sz w:val="32"/>
+          <w:szCs w:val="32"/>
+        </w:rPr>
+        <w:t xml:space="preserve"> Es ideal para prototipos rápidos. En proyectos profesionales, se suele poner en false para definir manualmente qué columnas mostrar y qué encabezados usar.</w:t>
+      </w:r>
+    </w:p>
+    <w:p>
+      <w:pPr>
+        <w:tabs>
+          <w:tab w:val="left" w:pos="2323"/>
+        </w:tabs>
+        <w:rPr>
+          <w:sz w:val="32"/>
+          <w:szCs w:val="32"/>
+        </w:rPr>
+      </w:pPr>
+      <w:r>
+        <w:rPr>
+          <w:b/>
+          <w:bCs/>
+          <w:sz w:val="32"/>
+          <w:szCs w:val="32"/>
+        </w:rPr>
+        <w:t xml:space="preserve">3. El proceso de </w:t>
+      </w:r>
+      <w:proofErr w:type="spellStart"/>
+      <w:r>
+        <w:rPr>
+          <w:b/>
+          <w:bCs/>
+          <w:sz w:val="32"/>
+          <w:szCs w:val="32"/>
+        </w:rPr>
+        <w:t>DataBinding</w:t>
+      </w:r>
+      <w:proofErr w:type="spellEnd"/>
+      <w:r>
+        <w:rPr>
+          <w:b/>
+          <w:bCs/>
+          <w:sz w:val="32"/>
+          <w:szCs w:val="32"/>
+        </w:rPr>
+        <w:t xml:space="preserve"> (Vinculación)</w:t>
+      </w:r>
+      <w:r>
+        <w:rPr>
+          <w:sz w:val="32"/>
+          <w:szCs w:val="32"/>
+        </w:rPr>
+        <w:t xml:space="preserve"> Para que el </w:t>
+      </w:r>
+      <w:proofErr w:type="spellStart"/>
+      <w:r>
+        <w:rPr>
+          <w:sz w:val="32"/>
+          <w:szCs w:val="32"/>
+        </w:rPr>
+        <w:t>GridView</w:t>
+      </w:r>
+      <w:proofErr w:type="spellEnd"/>
+      <w:r>
+        <w:rPr>
+          <w:sz w:val="32"/>
+          <w:szCs w:val="32"/>
+        </w:rPr>
+        <w:t xml:space="preserve"> muestre datos, se requieren dos pasos obligatorios en el </w:t>
+      </w:r>
+      <w:proofErr w:type="spellStart"/>
+      <w:r>
+        <w:rPr>
+          <w:sz w:val="32"/>
+          <w:szCs w:val="32"/>
+        </w:rPr>
+        <w:t>Code-Behind</w:t>
+      </w:r>
+      <w:proofErr w:type="spellEnd"/>
+      <w:r>
+        <w:rPr>
+          <w:sz w:val="32"/>
+          <w:szCs w:val="32"/>
+        </w:rPr>
+        <w:t>:</w:t>
+      </w:r>
+    </w:p>
+    <w:p>
+      <w:pPr>
+        <w:numPr>
+          <w:ilvl w:val="0"/>
+          <w:numId w:val="8"/>
+        </w:numPr>
+        <w:tabs>
+          <w:tab w:val="left" w:pos="2323"/>
+        </w:tabs>
+        <w:rPr>
+          <w:sz w:val="32"/>
+          <w:szCs w:val="32"/>
+        </w:rPr>
+      </w:pPr>
+      <w:proofErr w:type="spellStart"/>
+      <w:r>
+        <w:rPr>
+          <w:b/>
+          <w:bCs/>
+          <w:sz w:val="32"/>
+          <w:szCs w:val="32"/>
+        </w:rPr>
+        <w:t>DataSource</w:t>
+      </w:r>
+      <w:proofErr w:type="spellEnd"/>
+      <w:r>
+        <w:rPr>
+          <w:b/>
+          <w:bCs/>
+          <w:sz w:val="32"/>
+          <w:szCs w:val="32"/>
+        </w:rPr>
+        <w:t>:</w:t>
+      </w:r>
+      <w:r>
+        <w:rPr>
+          <w:sz w:val="32"/>
+          <w:szCs w:val="32"/>
+        </w:rPr>
+        <w:t xml:space="preserve"> Se le asigna la fuente de información (ej. una </w:t>
+      </w:r>
+      <w:proofErr w:type="spellStart"/>
+      <w:r>
+        <w:rPr>
+          <w:sz w:val="32"/>
+          <w:szCs w:val="32"/>
+        </w:rPr>
+        <w:t>List</w:t>
+      </w:r>
+      <w:proofErr w:type="spellEnd"/>
+      <w:r>
+        <w:rPr>
+          <w:sz w:val="32"/>
+          <w:szCs w:val="32"/>
+        </w:rPr>
+        <w:t>&lt;Curso&gt;).</w:t>
+      </w:r>
+    </w:p>
+    <w:p>
+      <w:pPr>
+        <w:numPr>
+          <w:ilvl w:val="0"/>
+          <w:numId w:val="8"/>
+        </w:numPr>
+        <w:tabs>
+          <w:tab w:val="left" w:pos="2323"/>
+        </w:tabs>
+        <w:rPr>
+          <w:sz w:val="32"/>
+          <w:szCs w:val="32"/>
+        </w:rPr>
+      </w:pPr>
+      <w:proofErr w:type="spellStart"/>
+      <w:proofErr w:type="gramStart"/>
+      <w:r>
+        <w:rPr>
+          <w:b/>
+          <w:bCs/>
+          <w:sz w:val="32"/>
+          <w:szCs w:val="32"/>
+        </w:rPr>
+        <w:t>DataBind</w:t>
+      </w:r>
+      <w:proofErr w:type="spellEnd"/>
+      <w:r>
+        <w:rPr>
+          <w:b/>
+          <w:bCs/>
+          <w:sz w:val="32"/>
+          <w:szCs w:val="32"/>
+        </w:rPr>
+        <w:t>(</w:t>
+      </w:r>
+      <w:proofErr w:type="gramEnd"/>
+      <w:r>
+        <w:rPr>
+          <w:b/>
+          <w:bCs/>
+          <w:sz w:val="32"/>
+          <w:szCs w:val="32"/>
+        </w:rPr>
+        <w:t>):</w:t>
+      </w:r>
+      <w:r>
+        <w:rPr>
+          <w:sz w:val="32"/>
+          <w:szCs w:val="32"/>
+        </w:rPr>
+        <w:t xml:space="preserve"> Es el método que le ordena al control: "</w:t>
+      </w:r>
+      <w:proofErr w:type="spellStart"/>
+      <w:r>
+        <w:rPr>
+          <w:sz w:val="32"/>
+          <w:szCs w:val="32"/>
+        </w:rPr>
+        <w:t>Tomá</w:t>
+      </w:r>
+      <w:proofErr w:type="spellEnd"/>
+      <w:r>
+        <w:rPr>
+          <w:sz w:val="32"/>
+          <w:szCs w:val="32"/>
+        </w:rPr>
+        <w:t xml:space="preserve"> los datos del </w:t>
+      </w:r>
+      <w:proofErr w:type="spellStart"/>
+      <w:r>
+        <w:rPr>
+          <w:sz w:val="32"/>
+          <w:szCs w:val="32"/>
+        </w:rPr>
+        <w:t>DataSource</w:t>
+      </w:r>
+      <w:proofErr w:type="spellEnd"/>
+      <w:r>
+        <w:rPr>
+          <w:sz w:val="32"/>
+          <w:szCs w:val="32"/>
+        </w:rPr>
+        <w:t xml:space="preserve"> y </w:t>
+      </w:r>
+      <w:proofErr w:type="spellStart"/>
+      <w:r>
+        <w:rPr>
+          <w:sz w:val="32"/>
+          <w:szCs w:val="32"/>
+        </w:rPr>
+        <w:t>dibujalos</w:t>
+      </w:r>
+      <w:proofErr w:type="spellEnd"/>
+      <w:r>
+        <w:rPr>
+          <w:sz w:val="32"/>
+          <w:szCs w:val="32"/>
+        </w:rPr>
+        <w:t xml:space="preserve"> en el HTML".</w:t>
+      </w:r>
+    </w:p>
+    <w:p>
+      <w:pPr>
+        <w:tabs>
+          <w:tab w:val="left" w:pos="2323"/>
+        </w:tabs>
+        <w:rPr>
+          <w:sz w:val="32"/>
+          <w:szCs w:val="32"/>
+        </w:rPr>
+      </w:pPr>
+    </w:p>
+    <w:p>
+      <w:pPr>
+        <w:tabs>
+          <w:tab w:val="left" w:pos="2323"/>
+        </w:tabs>
+        <w:rPr>
+          <w:sz w:val="32"/>
+          <w:szCs w:val="32"/>
+        </w:rPr>
+      </w:pPr>
+      <w:r>
+        <w:rPr>
+          <w:b/>
+          <w:bCs/>
+          <w:sz w:val="32"/>
+          <w:szCs w:val="32"/>
+        </w:rPr>
+        <w:t xml:space="preserve">TEMA: Configuración Manual de Columnas en </w:t>
+      </w:r>
+      <w:proofErr w:type="spellStart"/>
+      <w:r>
+        <w:rPr>
+          <w:b/>
+          <w:bCs/>
+          <w:sz w:val="32"/>
+          <w:szCs w:val="32"/>
+        </w:rPr>
+        <w:t>GridView</w:t>
+      </w:r>
+      <w:proofErr w:type="spellEnd"/>
+    </w:p>
+    <w:p>
+      <w:pPr>
+        <w:tabs>
+          <w:tab w:val="left" w:pos="2323"/>
+        </w:tabs>
+        <w:rPr>
+          <w:sz w:val="32"/>
+          <w:szCs w:val="32"/>
+        </w:rPr>
+      </w:pPr>
+      <w:r>
+        <w:rPr>
+          <w:b/>
+          <w:bCs/>
+          <w:sz w:val="32"/>
+          <w:szCs w:val="32"/>
+        </w:rPr>
+        <w:t>1. Desactivar la generación automática:</w:t>
+      </w:r>
+      <w:r>
+        <w:rPr>
+          <w:sz w:val="32"/>
+          <w:szCs w:val="32"/>
+        </w:rPr>
+        <w:t xml:space="preserve"> Se debe establecer la propiedad </w:t>
+      </w:r>
+      <w:proofErr w:type="spellStart"/>
+      <w:r>
+        <w:rPr>
+          <w:sz w:val="32"/>
+          <w:szCs w:val="32"/>
+        </w:rPr>
+        <w:t>AutoGenerateColumns</w:t>
+      </w:r>
+      <w:proofErr w:type="spellEnd"/>
+      <w:r>
+        <w:rPr>
+          <w:sz w:val="32"/>
+          <w:szCs w:val="32"/>
+        </w:rPr>
+        <w:t xml:space="preserve">="false". Al hacer esto, si no definimos columnas manualmente, la grilla aparecerá </w:t>
+      </w:r>
+      <w:proofErr w:type="gramStart"/>
+      <w:r>
+        <w:rPr>
+          <w:sz w:val="32"/>
+          <w:szCs w:val="32"/>
+        </w:rPr>
+        <w:t>vacía</w:t>
+      </w:r>
+      <w:proofErr w:type="gramEnd"/>
+      <w:r>
+        <w:rPr>
+          <w:sz w:val="32"/>
+          <w:szCs w:val="32"/>
+        </w:rPr>
+        <w:t xml:space="preserve"> aunque tenga datos vinculados (</w:t>
+      </w:r>
+      <w:proofErr w:type="spellStart"/>
+      <w:r>
+        <w:rPr>
+          <w:sz w:val="32"/>
+          <w:szCs w:val="32"/>
+        </w:rPr>
+        <w:t>DataBind</w:t>
+      </w:r>
+      <w:proofErr w:type="spellEnd"/>
+      <w:r>
+        <w:rPr>
+          <w:sz w:val="32"/>
+          <w:szCs w:val="32"/>
+        </w:rPr>
+        <w:t>).</w:t>
+      </w:r>
+    </w:p>
+    <w:p>
+      <w:pPr>
+        <w:tabs>
+          <w:tab w:val="left" w:pos="2323"/>
+        </w:tabs>
+        <w:rPr>
+          <w:sz w:val="32"/>
+          <w:szCs w:val="32"/>
+        </w:rPr>
+      </w:pPr>
+      <w:r>
+        <w:rPr>
+          <w:b/>
+          <w:bCs/>
+          <w:sz w:val="32"/>
+          <w:szCs w:val="32"/>
+        </w:rPr>
+        <w:t>2. La colección &lt;</w:t>
+      </w:r>
+      <w:proofErr w:type="spellStart"/>
+      <w:r>
+        <w:rPr>
+          <w:b/>
+          <w:bCs/>
+          <w:sz w:val="32"/>
+          <w:szCs w:val="32"/>
+        </w:rPr>
+        <w:t>Columns</w:t>
+      </w:r>
+      <w:proofErr w:type="spellEnd"/>
+      <w:r>
+        <w:rPr>
+          <w:b/>
+          <w:bCs/>
+          <w:sz w:val="32"/>
+          <w:szCs w:val="32"/>
+        </w:rPr>
+        <w:t>&gt;:</w:t>
+      </w:r>
+      <w:r>
+        <w:rPr>
+          <w:sz w:val="32"/>
+          <w:szCs w:val="32"/>
+        </w:rPr>
+        <w:t xml:space="preserve"> Es el contenedor interno del </w:t>
+      </w:r>
+      <w:proofErr w:type="spellStart"/>
+      <w:r>
+        <w:rPr>
+          <w:sz w:val="32"/>
+          <w:szCs w:val="32"/>
+        </w:rPr>
+        <w:t>GridView</w:t>
+      </w:r>
+      <w:proofErr w:type="spellEnd"/>
+      <w:r>
+        <w:rPr>
+          <w:sz w:val="32"/>
+          <w:szCs w:val="32"/>
+        </w:rPr>
+        <w:t xml:space="preserve"> donde se declaran las columnas específicas que se van a renderizar en el HTML final.</w:t>
+      </w:r>
+    </w:p>
+    <w:p>
+      <w:pPr>
+        <w:tabs>
+          <w:tab w:val="left" w:pos="2323"/>
+        </w:tabs>
+        <w:rPr>
+          <w:sz w:val="32"/>
+          <w:szCs w:val="32"/>
+        </w:rPr>
+      </w:pPr>
+      <w:r>
+        <w:rPr>
+          <w:b/>
+          <w:bCs/>
+          <w:sz w:val="32"/>
+          <w:szCs w:val="32"/>
+        </w:rPr>
+        <w:lastRenderedPageBreak/>
+        <w:t>3. El control &lt;</w:t>
+      </w:r>
+      <w:proofErr w:type="spellStart"/>
+      <w:proofErr w:type="gramStart"/>
+      <w:r>
+        <w:rPr>
+          <w:b/>
+          <w:bCs/>
+          <w:sz w:val="32"/>
+          <w:szCs w:val="32"/>
+        </w:rPr>
+        <w:t>asp:BoundField</w:t>
+      </w:r>
+      <w:proofErr w:type="spellEnd"/>
+      <w:proofErr w:type="gramEnd"/>
+      <w:r>
+        <w:rPr>
+          <w:b/>
+          <w:bCs/>
+          <w:sz w:val="32"/>
+          <w:szCs w:val="32"/>
+        </w:rPr>
+        <w:t>&gt;:</w:t>
+      </w:r>
+      <w:r>
+        <w:rPr>
+          <w:sz w:val="32"/>
+          <w:szCs w:val="32"/>
+        </w:rPr>
+        <w:t xml:space="preserve"> Es el tipo de columna más utilizado. Se encarga de "enlazar" (</w:t>
+      </w:r>
+      <w:proofErr w:type="spellStart"/>
+      <w:r>
+        <w:rPr>
+          <w:sz w:val="32"/>
+          <w:szCs w:val="32"/>
+        </w:rPr>
+        <w:t>bind</w:t>
+      </w:r>
+      <w:proofErr w:type="spellEnd"/>
+      <w:r>
+        <w:rPr>
+          <w:sz w:val="32"/>
+          <w:szCs w:val="32"/>
+        </w:rPr>
+        <w:t>) una propiedad del origen de datos y mostrarla como texto simple. Tiene dos propiedades fundamentales:</w:t>
+      </w:r>
+    </w:p>
+    <w:p>
+      <w:pPr>
+        <w:numPr>
+          <w:ilvl w:val="0"/>
+          <w:numId w:val="9"/>
+        </w:numPr>
+        <w:tabs>
+          <w:tab w:val="left" w:pos="2323"/>
+        </w:tabs>
+        <w:rPr>
+          <w:sz w:val="32"/>
+          <w:szCs w:val="32"/>
+        </w:rPr>
+      </w:pPr>
+      <w:proofErr w:type="spellStart"/>
+      <w:r>
+        <w:rPr>
+          <w:b/>
+          <w:bCs/>
+          <w:sz w:val="32"/>
+          <w:szCs w:val="32"/>
+        </w:rPr>
+        <w:t>DataField</w:t>
+      </w:r>
+      <w:proofErr w:type="spellEnd"/>
+      <w:r>
+        <w:rPr>
+          <w:b/>
+          <w:bCs/>
+          <w:sz w:val="32"/>
+          <w:szCs w:val="32"/>
+        </w:rPr>
+        <w:t>:</w:t>
+      </w:r>
+      <w:r>
+        <w:rPr>
+          <w:sz w:val="32"/>
+          <w:szCs w:val="32"/>
+        </w:rPr>
+        <w:t xml:space="preserve"> (Fundamental) Es el nombre </w:t>
+      </w:r>
+      <w:r>
+        <w:rPr>
+          <w:b/>
+          <w:bCs/>
+          <w:sz w:val="32"/>
+          <w:szCs w:val="32"/>
+        </w:rPr>
+        <w:t>exacto</w:t>
+      </w:r>
+      <w:r>
+        <w:rPr>
+          <w:sz w:val="32"/>
+          <w:szCs w:val="32"/>
+        </w:rPr>
+        <w:t xml:space="preserve"> de la propiedad o columna en la base de datos/lista (</w:t>
+      </w:r>
+      <w:proofErr w:type="spellStart"/>
+      <w:r>
+        <w:rPr>
+          <w:sz w:val="32"/>
+          <w:szCs w:val="32"/>
+        </w:rPr>
+        <w:t>Ej</w:t>
+      </w:r>
+      <w:proofErr w:type="spellEnd"/>
+      <w:r>
+        <w:rPr>
+          <w:sz w:val="32"/>
+          <w:szCs w:val="32"/>
+        </w:rPr>
+        <w:t>: "Nombre"). Si se escribe mal, el programa lanzará una excepción.</w:t>
+      </w:r>
+    </w:p>
+    <w:p>
+      <w:pPr>
+        <w:numPr>
+          <w:ilvl w:val="0"/>
+          <w:numId w:val="9"/>
+        </w:numPr>
+        <w:tabs>
+          <w:tab w:val="left" w:pos="2323"/>
+        </w:tabs>
+        <w:rPr>
+          <w:sz w:val="32"/>
+          <w:szCs w:val="32"/>
+        </w:rPr>
+      </w:pPr>
+      <w:proofErr w:type="spellStart"/>
+      <w:r>
+        <w:rPr>
+          <w:b/>
+          <w:bCs/>
+          <w:sz w:val="32"/>
+          <w:szCs w:val="32"/>
+        </w:rPr>
+        <w:t>HeaderText</w:t>
+      </w:r>
+      <w:proofErr w:type="spellEnd"/>
+      <w:r>
+        <w:rPr>
+          <w:b/>
+          <w:bCs/>
+          <w:sz w:val="32"/>
+          <w:szCs w:val="32"/>
+        </w:rPr>
+        <w:t>:</w:t>
+      </w:r>
+      <w:r>
+        <w:rPr>
+          <w:sz w:val="32"/>
+          <w:szCs w:val="32"/>
+        </w:rPr>
+        <w:t xml:space="preserve"> Es el texto amigable que verá el usuario en el encabezado de la tabla (</w:t>
+      </w:r>
+      <w:proofErr w:type="spellStart"/>
+      <w:r>
+        <w:rPr>
+          <w:sz w:val="32"/>
+          <w:szCs w:val="32"/>
+        </w:rPr>
+        <w:t>Ej</w:t>
+      </w:r>
+      <w:proofErr w:type="spellEnd"/>
+      <w:r>
+        <w:rPr>
+          <w:sz w:val="32"/>
+          <w:szCs w:val="32"/>
+        </w:rPr>
+        <w:t>: "Nombre del Curso").</w:t>
+      </w:r>
+    </w:p>
+    <w:p>
+      <w:pPr>
+        <w:tabs>
+          <w:tab w:val="left" w:pos="2323"/>
+        </w:tabs>
+        <w:rPr>
+          <w:sz w:val="32"/>
+          <w:szCs w:val="32"/>
+        </w:rPr>
+      </w:pPr>
+      <w:r>
+        <w:rPr>
+          <w:sz w:val="32"/>
+          <w:szCs w:val="32"/>
+        </w:rPr>
+        <w:pict w14:anchorId="5ED3DBC3">
+          <v:rect id="_x0000_i1033" style="width:0;height:1.5pt" o:hralign="center" o:hrstd="t" o:hr="t" fillcolor="#a0a0a0" stroked="f"/>
+        </w:pict>
+      </w:r>
+    </w:p>
+    <w:p>
+      <w:pPr>
+        <w:tabs>
+          <w:tab w:val="left" w:pos="2323"/>
+        </w:tabs>
+        <w:rPr>
+          <w:b/>
+          <w:bCs/>
+          <w:sz w:val="32"/>
+          <w:szCs w:val="32"/>
+        </w:rPr>
+      </w:pPr>
+      <w:r>
+        <w:rPr>
+          <w:rFonts w:ascii="Segoe UI Emoji" w:hAnsi="Segoe UI Emoji" w:cs="Segoe UI Emoji"/>
+          <w:b/>
+          <w:bCs/>
+          <w:sz w:val="32"/>
+          <w:szCs w:val="32"/>
+        </w:rPr>
+        <w:t>💡</w:t>
+      </w:r>
+      <w:r>
+        <w:rPr>
+          <w:b/>
+          <w:bCs/>
+          <w:sz w:val="32"/>
+          <w:szCs w:val="32"/>
+        </w:rPr>
+        <w:t xml:space="preserve"> El truco del </w:t>
+      </w:r>
+      <w:proofErr w:type="spellStart"/>
+      <w:r>
+        <w:rPr>
+          <w:b/>
+          <w:bCs/>
+          <w:sz w:val="32"/>
+          <w:szCs w:val="32"/>
+        </w:rPr>
+        <w:t>Backend</w:t>
+      </w:r>
+      <w:proofErr w:type="spellEnd"/>
+    </w:p>
+    <w:p>
+      <w:pPr>
+        <w:tabs>
+          <w:tab w:val="left" w:pos="2323"/>
+        </w:tabs>
+        <w:rPr>
+          <w:sz w:val="32"/>
+          <w:szCs w:val="32"/>
+        </w:rPr>
+      </w:pPr>
+      <w:r>
+        <w:rPr>
+          <w:sz w:val="32"/>
+          <w:szCs w:val="32"/>
+        </w:rPr>
+        <w:t xml:space="preserve">Si ejecutas tu proyecto ahora y vas a ListaCursos.aspx, vas a ver la tabla armada perfectamente. Si en el </w:t>
+      </w:r>
+      <w:proofErr w:type="spellStart"/>
+      <w:r>
+        <w:rPr>
+          <w:sz w:val="32"/>
+          <w:szCs w:val="32"/>
+        </w:rPr>
+        <w:t>BoundField</w:t>
+      </w:r>
+      <w:proofErr w:type="spellEnd"/>
+      <w:r>
+        <w:rPr>
+          <w:sz w:val="32"/>
+          <w:szCs w:val="32"/>
+        </w:rPr>
+        <w:t xml:space="preserve"> borraras la columna del "ID", la tabla mostraría solo dos columnas, pero </w:t>
+      </w:r>
+      <w:r>
+        <w:rPr>
+          <w:b/>
+          <w:bCs/>
+          <w:sz w:val="32"/>
+          <w:szCs w:val="32"/>
+        </w:rPr>
+        <w:t>el dato del ID seguiría existiendo en la memoria del servidor</w:t>
+      </w:r>
+      <w:r>
+        <w:rPr>
+          <w:sz w:val="32"/>
+          <w:szCs w:val="32"/>
+        </w:rPr>
+        <w:t>. Esto es clave para la seguridad: el usuario ve lo que vos querés que vea, pero vos tenés todos los datos listos para usarlos.</w:t>
+      </w:r>
+    </w:p>
+    <w:p>
+      <w:pPr>
+        <w:tabs>
+          <w:tab w:val="left" w:pos="2323"/>
+        </w:tabs>
+        <w:rPr>
+          <w:sz w:val="32"/>
+          <w:szCs w:val="32"/>
+          <w:u w:val="single"/>
+        </w:rPr>
+      </w:pPr>
+    </w:p>
+    <w:p>
+      <w:pPr>
+        <w:tabs>
+          <w:tab w:val="left" w:pos="2323"/>
+        </w:tabs>
+        <w:rPr>
+          <w:sz w:val="32"/>
+          <w:szCs w:val="32"/>
+        </w:rPr>
+      </w:pPr>
+    </w:p>
+    <w:p>
+      <w:pPr>
+        <w:tabs>
+          <w:tab w:val="left" w:pos="2323"/>
+        </w:tabs>
+        <w:rPr>
+          <w:sz w:val="32"/>
+          <w:szCs w:val="32"/>
         </w:rPr>
       </w:pPr>
     </w:p>
@@ -3326,6 +4348,119 @@
 <file path=word/numbering.xml><?xml version="1.0" encoding="utf-8"?>
 <w:numbering xmlns:wpc="http://schemas.microsoft.com/office/word/2010/wordprocessingCanvas" xmlns:cx="http://schemas.microsoft.com/office/drawing/2014/chartex" xmlns:cx1="http://schemas.microsoft.com/office/drawing/2015/9/8/chartex" xmlns:cx2="http://schemas.microsoft.com/office/drawing/2015/10/21/chartex" xmlns:cx3="http://schemas.microsoft.com/office/drawing/2016/5/9/chartex" xmlns:cx4="http://schemas.microsoft.com/office/drawing/2016/5/10/chartex" xmlns:cx5="http://schemas.microsoft.com/office/drawing/2016/5/11/chartex" xmlns:cx6="http://schemas.microsoft.com/office/drawing/2016/5/12/chartex" xmlns:cx7="http://schemas.microsoft.com/office/drawing/2016/5/13/chartex" xmlns:cx8="http://schemas.microsoft.com/office/drawing/2016/5/14/chartex" xmlns:mc="http://schemas.openxmlformats.org/markup-compatibility/2006" xmlns:aink="http://schemas.microsoft.com/office/drawing/2016/ink" xmlns:am3d="http://schemas.microsoft.com/office/drawing/2017/model3d" xmlns:o="urn:schemas-microsoft-com:office:office" xmlns:oel="http://schemas.microsoft.com/office/2019/extlst" xmlns:r="http://schemas.openxmlformats.org/officeDocument/2006/relationships" xmlns:m="http://schemas.openxmlformats.org/officeDocument/2006/math" xmlns:v="urn:schemas-microsoft-com:vml" xmlns:wp14="http://schemas.microsoft.com/office/word/2010/wordprocessingDrawing" xmlns:wp="http://schemas.openxmlformats.org/drawingml/2006/wordprocessingDrawing" xmlns:w10="urn:schemas-microsoft-com:office:word" xmlns:w="http://schemas.openxmlformats.org/wordprocessingml/2006/main" xmlns:w14="http://schemas.microsoft.com/office/word/2010/wordml" xmlns:w15="http://schemas.microsoft.com/office/word/2012/wordml" xmlns:w16cex="http://schemas.microsoft.com/office/word/2018/wordml/cex" xmlns:w16cid="http://schemas.microsoft.com/office/word/2016/wordml/cid" xmlns:w16="http://schemas.microsoft.com/office/word/2018/wordml" xmlns:w16sdtdh="http://schemas.microsoft.com/office/word/2020/wordml/sdtdatahash" xmlns:w16se="http://schemas.microsoft.com/office/word/2015/wordml/symex" xmlns:wpg="http://schemas.microsoft.com/office/word/2010/wordprocessingGroup" xmlns:wpi="http://schemas.microsoft.com/office/word/2010/wordprocessingInk" xmlns:wne="http://schemas.microsoft.com/office/word/2006/wordml" xmlns:wps="http://schemas.microsoft.com/office/word/2010/wordprocessingShape" mc:Ignorable="w14 w15 w16se w16cid w16 w16cex w16sdtdh wp14">
   <w:abstractNum w:abstractNumId="0" w15:restartNumberingAfterBreak="0">
+    <w:nsid w:val="01C74D9A"/>
+    <w:multiLevelType w:val="multilevel"/>
+    <w:tmpl w:val="BAB2E67A"/>
+    <w:lvl w:ilvl="0">
+      <w:start w:val="1"/>
+      <w:numFmt w:val="decimal"/>
+      <w:lvlText w:val="%1."/>
+      <w:lvlJc w:val="left"/>
+      <w:pPr>
+        <w:tabs>
+          <w:tab w:val="num" w:pos="720"/>
+        </w:tabs>
+        <w:ind w:left="720" w:hanging="360"/>
+      </w:pPr>
+    </w:lvl>
+    <w:lvl w:ilvl="1" w:tentative="1">
+      <w:start w:val="1"/>
+      <w:numFmt w:val="decimal"/>
+      <w:lvlText w:val="%2."/>
+      <w:lvlJc w:val="left"/>
+      <w:pPr>
+        <w:tabs>
+          <w:tab w:val="num" w:pos="1440"/>
+        </w:tabs>
+        <w:ind w:left="1440" w:hanging="360"/>
+      </w:pPr>
+    </w:lvl>
+    <w:lvl w:ilvl="2" w:tentative="1">
+      <w:start w:val="1"/>
+      <w:numFmt w:val="decimal"/>
+      <w:lvlText w:val="%3."/>
+      <w:lvlJc w:val="left"/>
+      <w:pPr>
+        <w:tabs>
+          <w:tab w:val="num" w:pos="2160"/>
+        </w:tabs>
+        <w:ind w:left="2160" w:hanging="360"/>
+      </w:pPr>
+    </w:lvl>
+    <w:lvl w:ilvl="3" w:tentative="1">
+      <w:start w:val="1"/>
+      <w:numFmt w:val="decimal"/>
+      <w:lvlText w:val="%4."/>
+      <w:lvlJc w:val="left"/>
+      <w:pPr>
+        <w:tabs>
+          <w:tab w:val="num" w:pos="2880"/>
+        </w:tabs>
+        <w:ind w:left="2880" w:hanging="360"/>
+      </w:pPr>
+    </w:lvl>
+    <w:lvl w:ilvl="4" w:tentative="1">
+      <w:start w:val="1"/>
+      <w:numFmt w:val="decimal"/>
+      <w:lvlText w:val="%5."/>
+      <w:lvlJc w:val="left"/>
+      <w:pPr>
+        <w:tabs>
+          <w:tab w:val="num" w:pos="3600"/>
+        </w:tabs>
+        <w:ind w:left="3600" w:hanging="360"/>
+      </w:pPr>
+    </w:lvl>
+    <w:lvl w:ilvl="5" w:tentative="1">
+      <w:start w:val="1"/>
+      <w:numFmt w:val="decimal"/>
+      <w:lvlText w:val="%6."/>
+      <w:lvlJc w:val="left"/>
+      <w:pPr>
+        <w:tabs>
+          <w:tab w:val="num" w:pos="4320"/>
+        </w:tabs>
+        <w:ind w:left="4320" w:hanging="360"/>
+      </w:pPr>
+    </w:lvl>
+    <w:lvl w:ilvl="6" w:tentative="1">
+      <w:start w:val="1"/>
+      <w:numFmt w:val="decimal"/>
+      <w:lvlText w:val="%7."/>
+      <w:lvlJc w:val="left"/>
+      <w:pPr>
+        <w:tabs>
+          <w:tab w:val="num" w:pos="5040"/>
+        </w:tabs>
+        <w:ind w:left="5040" w:hanging="360"/>
+      </w:pPr>
+    </w:lvl>
+    <w:lvl w:ilvl="7" w:tentative="1">
+      <w:start w:val="1"/>
+      <w:numFmt w:val="decimal"/>
+      <w:lvlText w:val="%8."/>
+      <w:lvlJc w:val="left"/>
+      <w:pPr>
+        <w:tabs>
+          <w:tab w:val="num" w:pos="5760"/>
+        </w:tabs>
+        <w:ind w:left="5760" w:hanging="360"/>
+      </w:pPr>
+    </w:lvl>
+    <w:lvl w:ilvl="8" w:tentative="1">
+      <w:start w:val="1"/>
+      <w:numFmt w:val="decimal"/>
+      <w:lvlText w:val="%9."/>
+      <w:lvlJc w:val="left"/>
+      <w:pPr>
+        <w:tabs>
+          <w:tab w:val="num" w:pos="6480"/>
+        </w:tabs>
+        <w:ind w:left="6480" w:hanging="360"/>
+      </w:pPr>
+    </w:lvl>
+  </w:abstractNum>
+  <w:abstractNum w:abstractNumId="1" w15:restartNumberingAfterBreak="0">
     <w:nsid w:val="0FD7502C"/>
     <w:multiLevelType w:val="multilevel"/>
     <w:tmpl w:val="D06C6780"/>
@@ -3474,7 +4609,7 @@
       </w:rPr>
     </w:lvl>
   </w:abstractNum>
-  <w:abstractNum w:abstractNumId="1" w15:restartNumberingAfterBreak="0">
+  <w:abstractNum w:abstractNumId="2" w15:restartNumberingAfterBreak="0">
     <w:nsid w:val="1CD97958"/>
     <w:multiLevelType w:val="multilevel"/>
     <w:tmpl w:val="F42021D8"/>
@@ -3623,7 +4758,7 @@
       </w:rPr>
     </w:lvl>
   </w:abstractNum>
-  <w:abstractNum w:abstractNumId="2" w15:restartNumberingAfterBreak="0">
+  <w:abstractNum w:abstractNumId="3" w15:restartNumberingAfterBreak="0">
     <w:nsid w:val="2A9679DF"/>
     <w:multiLevelType w:val="multilevel"/>
     <w:tmpl w:val="6FF2F92A"/>
@@ -3772,7 +4907,7 @@
       </w:rPr>
     </w:lvl>
   </w:abstractNum>
-  <w:abstractNum w:abstractNumId="3" w15:restartNumberingAfterBreak="0">
+  <w:abstractNum w:abstractNumId="4" w15:restartNumberingAfterBreak="0">
     <w:nsid w:val="3C5140D7"/>
     <w:multiLevelType w:val="multilevel"/>
     <w:tmpl w:val="524A6932"/>
@@ -3921,7 +5056,305 @@
       </w:rPr>
     </w:lvl>
   </w:abstractNum>
-  <w:abstractNum w:abstractNumId="4" w15:restartNumberingAfterBreak="0">
+  <w:abstractNum w:abstractNumId="5" w15:restartNumberingAfterBreak="0">
+    <w:nsid w:val="54A92773"/>
+    <w:multiLevelType w:val="multilevel"/>
+    <w:tmpl w:val="1E52947E"/>
+    <w:lvl w:ilvl="0">
+      <w:start w:val="1"/>
+      <w:numFmt w:val="bullet"/>
+      <w:lvlText w:val=""/>
+      <w:lvlJc w:val="left"/>
+      <w:pPr>
+        <w:tabs>
+          <w:tab w:val="num" w:pos="720"/>
+        </w:tabs>
+        <w:ind w:left="720" w:hanging="360"/>
+      </w:pPr>
+      <w:rPr>
+        <w:rFonts w:ascii="Symbol" w:hAnsi="Symbol" w:hint="default"/>
+        <w:sz w:val="20"/>
+      </w:rPr>
+    </w:lvl>
+    <w:lvl w:ilvl="1" w:tentative="1">
+      <w:start w:val="1"/>
+      <w:numFmt w:val="bullet"/>
+      <w:lvlText w:val="o"/>
+      <w:lvlJc w:val="left"/>
+      <w:pPr>
+        <w:tabs>
+          <w:tab w:val="num" w:pos="1440"/>
+        </w:tabs>
+        <w:ind w:left="1440" w:hanging="360"/>
+      </w:pPr>
+      <w:rPr>
+        <w:rFonts w:ascii="Courier New" w:hAnsi="Courier New" w:hint="default"/>
+        <w:sz w:val="20"/>
+      </w:rPr>
+    </w:lvl>
+    <w:lvl w:ilvl="2" w:tentative="1">
+      <w:start w:val="1"/>
+      <w:numFmt w:val="bullet"/>
+      <w:lvlText w:val=""/>
+      <w:lvlJc w:val="left"/>
+      <w:pPr>
+        <w:tabs>
+          <w:tab w:val="num" w:pos="2160"/>
+        </w:tabs>
+        <w:ind w:left="2160" w:hanging="360"/>
+      </w:pPr>
+      <w:rPr>
+        <w:rFonts w:ascii="Wingdings" w:hAnsi="Wingdings" w:hint="default"/>
+        <w:sz w:val="20"/>
+      </w:rPr>
+    </w:lvl>
+    <w:lvl w:ilvl="3" w:tentative="1">
+      <w:start w:val="1"/>
+      <w:numFmt w:val="bullet"/>
+      <w:lvlText w:val=""/>
+      <w:lvlJc w:val="left"/>
+      <w:pPr>
+        <w:tabs>
+          <w:tab w:val="num" w:pos="2880"/>
+        </w:tabs>
+        <w:ind w:left="2880" w:hanging="360"/>
+      </w:pPr>
+      <w:rPr>
+        <w:rFonts w:ascii="Wingdings" w:hAnsi="Wingdings" w:hint="default"/>
+        <w:sz w:val="20"/>
+      </w:rPr>
+    </w:lvl>
+    <w:lvl w:ilvl="4" w:tentative="1">
+      <w:start w:val="1"/>
+      <w:numFmt w:val="bullet"/>
+      <w:lvlText w:val=""/>
+      <w:lvlJc w:val="left"/>
+      <w:pPr>
+        <w:tabs>
+          <w:tab w:val="num" w:pos="3600"/>
+        </w:tabs>
+        <w:ind w:left="3600" w:hanging="360"/>
+      </w:pPr>
+      <w:rPr>
+        <w:rFonts w:ascii="Wingdings" w:hAnsi="Wingdings" w:hint="default"/>
+        <w:sz w:val="20"/>
+      </w:rPr>
+    </w:lvl>
+    <w:lvl w:ilvl="5" w:tentative="1">
+      <w:start w:val="1"/>
+      <w:numFmt w:val="bullet"/>
+      <w:lvlText w:val=""/>
+      <w:lvlJc w:val="left"/>
+      <w:pPr>
+        <w:tabs>
+          <w:tab w:val="num" w:pos="4320"/>
+        </w:tabs>
+        <w:ind w:left="4320" w:hanging="360"/>
+      </w:pPr>
+      <w:rPr>
+        <w:rFonts w:ascii="Wingdings" w:hAnsi="Wingdings" w:hint="default"/>
+        <w:sz w:val="20"/>
+      </w:rPr>
+    </w:lvl>
+    <w:lvl w:ilvl="6" w:tentative="1">
+      <w:start w:val="1"/>
+      <w:numFmt w:val="bullet"/>
+      <w:lvlText w:val=""/>
+      <w:lvlJc w:val="left"/>
+      <w:pPr>
+        <w:tabs>
+          <w:tab w:val="num" w:pos="5040"/>
+        </w:tabs>
+        <w:ind w:left="5040" w:hanging="360"/>
+      </w:pPr>
+      <w:rPr>
+        <w:rFonts w:ascii="Wingdings" w:hAnsi="Wingdings" w:hint="default"/>
+        <w:sz w:val="20"/>
+      </w:rPr>
+    </w:lvl>
+    <w:lvl w:ilvl="7" w:tentative="1">
+      <w:start w:val="1"/>
+      <w:numFmt w:val="bullet"/>
+      <w:lvlText w:val=""/>
+      <w:lvlJc w:val="left"/>
+      <w:pPr>
+        <w:tabs>
+          <w:tab w:val="num" w:pos="5760"/>
+        </w:tabs>
+        <w:ind w:left="5760" w:hanging="360"/>
+      </w:pPr>
+      <w:rPr>
+        <w:rFonts w:ascii="Wingdings" w:hAnsi="Wingdings" w:hint="default"/>
+        <w:sz w:val="20"/>
+      </w:rPr>
+    </w:lvl>
+    <w:lvl w:ilvl="8" w:tentative="1">
+      <w:start w:val="1"/>
+      <w:numFmt w:val="bullet"/>
+      <w:lvlText w:val=""/>
+      <w:lvlJc w:val="left"/>
+      <w:pPr>
+        <w:tabs>
+          <w:tab w:val="num" w:pos="6480"/>
+        </w:tabs>
+        <w:ind w:left="6480" w:hanging="360"/>
+      </w:pPr>
+      <w:rPr>
+        <w:rFonts w:ascii="Wingdings" w:hAnsi="Wingdings" w:hint="default"/>
+        <w:sz w:val="20"/>
+      </w:rPr>
+    </w:lvl>
+  </w:abstractNum>
+  <w:abstractNum w:abstractNumId="6" w15:restartNumberingAfterBreak="0">
+    <w:nsid w:val="596B1DFE"/>
+    <w:multiLevelType w:val="multilevel"/>
+    <w:tmpl w:val="A5FA00B4"/>
+    <w:lvl w:ilvl="0">
+      <w:start w:val="1"/>
+      <w:numFmt w:val="bullet"/>
+      <w:lvlText w:val=""/>
+      <w:lvlJc w:val="left"/>
+      <w:pPr>
+        <w:tabs>
+          <w:tab w:val="num" w:pos="720"/>
+        </w:tabs>
+        <w:ind w:left="720" w:hanging="360"/>
+      </w:pPr>
+      <w:rPr>
+        <w:rFonts w:ascii="Symbol" w:hAnsi="Symbol" w:hint="default"/>
+        <w:sz w:val="20"/>
+      </w:rPr>
+    </w:lvl>
+    <w:lvl w:ilvl="1" w:tentative="1">
+      <w:start w:val="1"/>
+      <w:numFmt w:val="bullet"/>
+      <w:lvlText w:val="o"/>
+      <w:lvlJc w:val="left"/>
+      <w:pPr>
+        <w:tabs>
+          <w:tab w:val="num" w:pos="1440"/>
+        </w:tabs>
+        <w:ind w:left="1440" w:hanging="360"/>
+      </w:pPr>
+      <w:rPr>
+        <w:rFonts w:ascii="Courier New" w:hAnsi="Courier New" w:hint="default"/>
+        <w:sz w:val="20"/>
+      </w:rPr>
+    </w:lvl>
+    <w:lvl w:ilvl="2" w:tentative="1">
+      <w:start w:val="1"/>
+      <w:numFmt w:val="bullet"/>
+      <w:lvlText w:val=""/>
+      <w:lvlJc w:val="left"/>
+      <w:pPr>
+        <w:tabs>
+          <w:tab w:val="num" w:pos="2160"/>
+        </w:tabs>
+        <w:ind w:left="2160" w:hanging="360"/>
+      </w:pPr>
+      <w:rPr>
+        <w:rFonts w:ascii="Wingdings" w:hAnsi="Wingdings" w:hint="default"/>
+        <w:sz w:val="20"/>
+      </w:rPr>
+    </w:lvl>
+    <w:lvl w:ilvl="3" w:tentative="1">
+      <w:start w:val="1"/>
+      <w:numFmt w:val="bullet"/>
+      <w:lvlText w:val=""/>
+      <w:lvlJc w:val="left"/>
+      <w:pPr>
+        <w:tabs>
+          <w:tab w:val="num" w:pos="2880"/>
+        </w:tabs>
+        <w:ind w:left="2880" w:hanging="360"/>
+      </w:pPr>
+      <w:rPr>
+        <w:rFonts w:ascii="Wingdings" w:hAnsi="Wingdings" w:hint="default"/>
+        <w:sz w:val="20"/>
+      </w:rPr>
+    </w:lvl>
+    <w:lvl w:ilvl="4" w:tentative="1">
+      <w:start w:val="1"/>
+      <w:numFmt w:val="bullet"/>
+      <w:lvlText w:val=""/>
+      <w:lvlJc w:val="left"/>
+      <w:pPr>
+        <w:tabs>
+          <w:tab w:val="num" w:pos="3600"/>
+        </w:tabs>
+        <w:ind w:left="3600" w:hanging="360"/>
+      </w:pPr>
+      <w:rPr>
+        <w:rFonts w:ascii="Wingdings" w:hAnsi="Wingdings" w:hint="default"/>
+        <w:sz w:val="20"/>
+      </w:rPr>
+    </w:lvl>
+    <w:lvl w:ilvl="5" w:tentative="1">
+      <w:start w:val="1"/>
+      <w:numFmt w:val="bullet"/>
+      <w:lvlText w:val=""/>
+      <w:lvlJc w:val="left"/>
+      <w:pPr>
+        <w:tabs>
+          <w:tab w:val="num" w:pos="4320"/>
+        </w:tabs>
+        <w:ind w:left="4320" w:hanging="360"/>
+      </w:pPr>
+      <w:rPr>
+        <w:rFonts w:ascii="Wingdings" w:hAnsi="Wingdings" w:hint="default"/>
+        <w:sz w:val="20"/>
+      </w:rPr>
+    </w:lvl>
+    <w:lvl w:ilvl="6" w:tentative="1">
+      <w:start w:val="1"/>
+      <w:numFmt w:val="bullet"/>
+      <w:lvlText w:val=""/>
+      <w:lvlJc w:val="left"/>
+      <w:pPr>
+        <w:tabs>
+          <w:tab w:val="num" w:pos="5040"/>
+        </w:tabs>
+        <w:ind w:left="5040" w:hanging="360"/>
+      </w:pPr>
+      <w:rPr>
+        <w:rFonts w:ascii="Wingdings" w:hAnsi="Wingdings" w:hint="default"/>
+        <w:sz w:val="20"/>
+      </w:rPr>
+    </w:lvl>
+    <w:lvl w:ilvl="7" w:tentative="1">
+      <w:start w:val="1"/>
+      <w:numFmt w:val="bullet"/>
+      <w:lvlText w:val=""/>
+      <w:lvlJc w:val="left"/>
+      <w:pPr>
+        <w:tabs>
+          <w:tab w:val="num" w:pos="5760"/>
+        </w:tabs>
+        <w:ind w:left="5760" w:hanging="360"/>
+      </w:pPr>
+      <w:rPr>
+        <w:rFonts w:ascii="Wingdings" w:hAnsi="Wingdings" w:hint="default"/>
+        <w:sz w:val="20"/>
+      </w:rPr>
+    </w:lvl>
+    <w:lvl w:ilvl="8" w:tentative="1">
+      <w:start w:val="1"/>
+      <w:numFmt w:val="bullet"/>
+      <w:lvlText w:val=""/>
+      <w:lvlJc w:val="left"/>
+      <w:pPr>
+        <w:tabs>
+          <w:tab w:val="num" w:pos="6480"/>
+        </w:tabs>
+        <w:ind w:left="6480" w:hanging="360"/>
+      </w:pPr>
+      <w:rPr>
+        <w:rFonts w:ascii="Wingdings" w:hAnsi="Wingdings" w:hint="default"/>
+        <w:sz w:val="20"/>
+      </w:rPr>
+    </w:lvl>
+  </w:abstractNum>
+  <w:abstractNum w:abstractNumId="7" w15:restartNumberingAfterBreak="0">
     <w:nsid w:val="6A7B460C"/>
     <w:multiLevelType w:val="multilevel"/>
     <w:tmpl w:val="E27AE180"/>
@@ -4070,7 +5503,7 @@
       </w:rPr>
     </w:lvl>
   </w:abstractNum>
-  <w:abstractNum w:abstractNumId="5" w15:restartNumberingAfterBreak="0">
+  <w:abstractNum w:abstractNumId="8" w15:restartNumberingAfterBreak="0">
     <w:nsid w:val="7E142B6E"/>
     <w:multiLevelType w:val="multilevel"/>
     <w:tmpl w:val="C8FAB37E"/>
@@ -4220,22 +5653,31 @@
     </w:lvl>
   </w:abstractNum>
   <w:num w:numId="1" w16cid:durableId="477040820">
+    <w:abstractNumId w:val="1"/>
+  </w:num>
+  <w:num w:numId="2" w16cid:durableId="1474448373">
+    <w:abstractNumId w:val="7"/>
+  </w:num>
+  <w:num w:numId="3" w16cid:durableId="916401406">
+    <w:abstractNumId w:val="3"/>
+  </w:num>
+  <w:num w:numId="4" w16cid:durableId="1627390881">
+    <w:abstractNumId w:val="2"/>
+  </w:num>
+  <w:num w:numId="5" w16cid:durableId="566914713">
+    <w:abstractNumId w:val="4"/>
+  </w:num>
+  <w:num w:numId="6" w16cid:durableId="1284193791">
+    <w:abstractNumId w:val="8"/>
+  </w:num>
+  <w:num w:numId="7" w16cid:durableId="657420732">
+    <w:abstractNumId w:val="5"/>
+  </w:num>
+  <w:num w:numId="8" w16cid:durableId="1311246361">
     <w:abstractNumId w:val="0"/>
   </w:num>
-  <w:num w:numId="2" w16cid:durableId="1474448373">
-    <w:abstractNumId w:val="4"/>
-  </w:num>
-  <w:num w:numId="3" w16cid:durableId="916401406">
-    <w:abstractNumId w:val="2"/>
-  </w:num>
-  <w:num w:numId="4" w16cid:durableId="1627390881">
-    <w:abstractNumId w:val="1"/>
-  </w:num>
-  <w:num w:numId="5" w16cid:durableId="566914713">
-    <w:abstractNumId w:val="3"/>
-  </w:num>
-  <w:num w:numId="6" w16cid:durableId="1284193791">
-    <w:abstractNumId w:val="5"/>
+  <w:num w:numId="9" w16cid:durableId="850484044">
+    <w:abstractNumId w:val="6"/>
   </w:num>
 </w:numbering>
 </file>

</xml_diff>

<commit_message>
feat: implementar flujo completo de alta de cursos en Session - Creación de clase de dominio 'Curso' con propiedades tipadas. - Desarrollo de formulario 'AgregarCurso.aspx' utilizando controles de servidor y Bootstrap. - Implementación de lógica de captura, parseo de datos (int, DateTime) y persistencia en Session. - Configuración de navegación bidireccional entre el formulario y la grilla de datos. - Uso de IsPostBack para optimizar la carga inicial de datos en la memoria del servidor.
</commit_message>
<xml_diff>
--- a/Unidad 4 - Eventos/DOCUMENTACIÓN TÉCNICA DE EVENTOS.docx
+++ b/Unidad 4 - Eventos/DOCUMENTACIÓN TÉCNICA DE EVENTOS.docx
@@ -4193,7 +4193,7 @@
           <w:szCs w:val="32"/>
         </w:rPr>
         <w:pict w14:anchorId="5ED3DBC3">
-          <v:rect id="_x0000_i1033" style="width:0;height:1.5pt" o:hralign="center" o:hrstd="t" o:hr="t" fillcolor="#a0a0a0" stroked="f"/>
+          <v:rect id="_x0000_i1027" style="width:0;height:1.5pt" o:hralign="center" o:hrstd="t" o:hr="t" fillcolor="#a0a0a0" stroked="f"/>
         </w:pict>
       </w:r>
     </w:p>
@@ -4299,6 +4299,1807 @@
           <w:sz w:val="32"/>
           <w:szCs w:val="32"/>
           <w:u w:val="single"/>
+        </w:rPr>
+      </w:pPr>
+      <w:r>
+        <w:rPr>
+          <w:b/>
+          <w:bCs/>
+          <w:sz w:val="32"/>
+          <w:szCs w:val="32"/>
+          <w:u w:val="single"/>
+        </w:rPr>
+        <w:t xml:space="preserve">¿Por qué es mejor </w:t>
+      </w:r>
+      <w:proofErr w:type="spellStart"/>
+      <w:r>
+        <w:rPr>
+          <w:b/>
+          <w:bCs/>
+          <w:sz w:val="32"/>
+          <w:szCs w:val="32"/>
+          <w:u w:val="single"/>
+        </w:rPr>
+        <w:t>AutoGenerateColumns</w:t>
+      </w:r>
+      <w:proofErr w:type="spellEnd"/>
+      <w:r>
+        <w:rPr>
+          <w:b/>
+          <w:bCs/>
+          <w:sz w:val="32"/>
+          <w:szCs w:val="32"/>
+          <w:u w:val="single"/>
+        </w:rPr>
+        <w:t>="false"?</w:t>
+      </w:r>
+    </w:p>
+    <w:p>
+      <w:pPr>
+        <w:numPr>
+          <w:ilvl w:val="0"/>
+          <w:numId w:val="10"/>
+        </w:numPr>
+        <w:tabs>
+          <w:tab w:val="left" w:pos="2323"/>
+        </w:tabs>
+        <w:rPr>
+          <w:sz w:val="32"/>
+          <w:szCs w:val="32"/>
+        </w:rPr>
+      </w:pPr>
+      <w:r>
+        <w:rPr>
+          <w:b/>
+          <w:bCs/>
+          <w:sz w:val="32"/>
+          <w:szCs w:val="32"/>
+        </w:rPr>
+        <w:t>Seguridad:</w:t>
+      </w:r>
+      <w:r>
+        <w:rPr>
+          <w:sz w:val="32"/>
+          <w:szCs w:val="32"/>
+        </w:rPr>
+        <w:t xml:space="preserve"> </w:t>
+      </w:r>
+      <w:proofErr w:type="spellStart"/>
+      <w:r>
+        <w:rPr>
+          <w:sz w:val="32"/>
+          <w:szCs w:val="32"/>
+        </w:rPr>
+        <w:t>Evitás</w:t>
+      </w:r>
+      <w:proofErr w:type="spellEnd"/>
+      <w:r>
+        <w:rPr>
+          <w:sz w:val="32"/>
+          <w:szCs w:val="32"/>
+        </w:rPr>
+        <w:t xml:space="preserve"> mostrar datos sensibles de la base de datos que no deberían llegar al cliente.</w:t>
+      </w:r>
+    </w:p>
+    <w:p>
+      <w:pPr>
+        <w:numPr>
+          <w:ilvl w:val="0"/>
+          <w:numId w:val="10"/>
+        </w:numPr>
+        <w:tabs>
+          <w:tab w:val="left" w:pos="2323"/>
+        </w:tabs>
+        <w:rPr>
+          <w:sz w:val="32"/>
+          <w:szCs w:val="32"/>
+        </w:rPr>
+      </w:pPr>
+      <w:r>
+        <w:rPr>
+          <w:b/>
+          <w:bCs/>
+          <w:sz w:val="32"/>
+          <w:szCs w:val="32"/>
+        </w:rPr>
+        <w:t>Estética:</w:t>
+      </w:r>
+      <w:r>
+        <w:rPr>
+          <w:sz w:val="32"/>
+          <w:szCs w:val="32"/>
+        </w:rPr>
+        <w:t xml:space="preserve"> </w:t>
+      </w:r>
+      <w:proofErr w:type="spellStart"/>
+      <w:r>
+        <w:rPr>
+          <w:sz w:val="32"/>
+          <w:szCs w:val="32"/>
+        </w:rPr>
+        <w:t>Podés</w:t>
+      </w:r>
+      <w:proofErr w:type="spellEnd"/>
+      <w:r>
+        <w:rPr>
+          <w:sz w:val="32"/>
+          <w:szCs w:val="32"/>
+        </w:rPr>
+        <w:t xml:space="preserve"> poner nombres con espacios, tildes o mayúsculas en los encabezados (usando </w:t>
+      </w:r>
+      <w:proofErr w:type="spellStart"/>
+      <w:r>
+        <w:rPr>
+          <w:sz w:val="32"/>
+          <w:szCs w:val="32"/>
+        </w:rPr>
+        <w:t>HeaderText</w:t>
+      </w:r>
+      <w:proofErr w:type="spellEnd"/>
+      <w:r>
+        <w:rPr>
+          <w:sz w:val="32"/>
+          <w:szCs w:val="32"/>
+        </w:rPr>
+        <w:t>) sin tener que cambiar los nombres de las variables en C#.</w:t>
+      </w:r>
+    </w:p>
+    <w:p>
+      <w:pPr>
+        <w:numPr>
+          <w:ilvl w:val="0"/>
+          <w:numId w:val="10"/>
+        </w:numPr>
+        <w:tabs>
+          <w:tab w:val="left" w:pos="2323"/>
+        </w:tabs>
+        <w:rPr>
+          <w:sz w:val="32"/>
+          <w:szCs w:val="32"/>
+        </w:rPr>
+      </w:pPr>
+      <w:r>
+        <w:rPr>
+          <w:b/>
+          <w:bCs/>
+          <w:sz w:val="32"/>
+          <w:szCs w:val="32"/>
+        </w:rPr>
+        <w:t>Orden:</w:t>
+      </w:r>
+      <w:r>
+        <w:rPr>
+          <w:sz w:val="32"/>
+          <w:szCs w:val="32"/>
+        </w:rPr>
+        <w:t xml:space="preserve"> Vos decidís en qué orden aparece cada columna, independientemente de cómo estén ordenadas en tu clase o tabla SQL.</w:t>
+      </w:r>
+    </w:p>
+    <w:p>
+      <w:pPr>
+        <w:tabs>
+          <w:tab w:val="left" w:pos="2323"/>
+        </w:tabs>
+        <w:rPr>
+          <w:sz w:val="32"/>
+          <w:szCs w:val="32"/>
+        </w:rPr>
+      </w:pPr>
+    </w:p>
+    <w:p>
+      <w:pPr>
+        <w:tabs>
+          <w:tab w:val="left" w:pos="2323"/>
+        </w:tabs>
+        <w:rPr>
+          <w:sz w:val="32"/>
+          <w:szCs w:val="32"/>
+        </w:rPr>
+      </w:pPr>
+      <w:r>
+        <w:rPr>
+          <w:b/>
+          <w:bCs/>
+          <w:sz w:val="32"/>
+          <w:szCs w:val="32"/>
+        </w:rPr>
+        <w:t>TEMA: Transformación de Controles de Servidor y Bootstrap</w:t>
+      </w:r>
+    </w:p>
+    <w:p>
+      <w:pPr>
+        <w:tabs>
+          <w:tab w:val="left" w:pos="2323"/>
+        </w:tabs>
+        <w:rPr>
+          <w:sz w:val="32"/>
+          <w:szCs w:val="32"/>
+        </w:rPr>
+      </w:pPr>
+      <w:r>
+        <w:rPr>
+          <w:b/>
+          <w:bCs/>
+          <w:sz w:val="32"/>
+          <w:szCs w:val="32"/>
+        </w:rPr>
+        <w:t>1. Renderizado de Controles ASP.NET:</w:t>
+      </w:r>
+      <w:r>
+        <w:rPr>
+          <w:sz w:val="32"/>
+          <w:szCs w:val="32"/>
+        </w:rPr>
+        <w:t xml:space="preserve"> Los controles de servidor (&lt;</w:t>
+      </w:r>
+      <w:proofErr w:type="spellStart"/>
+      <w:proofErr w:type="gramStart"/>
+      <w:r>
+        <w:rPr>
+          <w:sz w:val="32"/>
+          <w:szCs w:val="32"/>
+        </w:rPr>
+        <w:t>asp</w:t>
+      </w:r>
+      <w:proofErr w:type="spellEnd"/>
+      <w:r>
+        <w:rPr>
+          <w:sz w:val="32"/>
+          <w:szCs w:val="32"/>
+        </w:rPr>
+        <w:t>:...</w:t>
+      </w:r>
+      <w:proofErr w:type="gramEnd"/>
+      <w:r>
+        <w:rPr>
+          <w:sz w:val="32"/>
+          <w:szCs w:val="32"/>
+        </w:rPr>
+        <w:t xml:space="preserve">&gt;) no son interpretados directamente por el navegador. Cuando la página se </w:t>
+      </w:r>
+      <w:r>
+        <w:rPr>
+          <w:sz w:val="32"/>
+          <w:szCs w:val="32"/>
+        </w:rPr>
+        <w:lastRenderedPageBreak/>
+        <w:t>compila y se envía al cliente, el servidor transforma estos controles en etiquetas HTML estándar.</w:t>
+      </w:r>
+    </w:p>
+    <w:p>
+      <w:pPr>
+        <w:numPr>
+          <w:ilvl w:val="0"/>
+          <w:numId w:val="11"/>
+        </w:numPr>
+        <w:tabs>
+          <w:tab w:val="left" w:pos="2323"/>
+        </w:tabs>
+        <w:rPr>
+          <w:sz w:val="32"/>
+          <w:szCs w:val="32"/>
+        </w:rPr>
+      </w:pPr>
+      <w:r>
+        <w:rPr>
+          <w:sz w:val="32"/>
+          <w:szCs w:val="32"/>
+        </w:rPr>
+        <w:t>&lt;</w:t>
+      </w:r>
+      <w:proofErr w:type="spellStart"/>
+      <w:proofErr w:type="gramStart"/>
+      <w:r>
+        <w:rPr>
+          <w:sz w:val="32"/>
+          <w:szCs w:val="32"/>
+        </w:rPr>
+        <w:t>asp:TextBox</w:t>
+      </w:r>
+      <w:proofErr w:type="spellEnd"/>
+      <w:proofErr w:type="gramEnd"/>
+      <w:r>
+        <w:rPr>
+          <w:sz w:val="32"/>
+          <w:szCs w:val="32"/>
+        </w:rPr>
+        <w:t xml:space="preserve">&gt; se transforma en &lt;input </w:t>
+      </w:r>
+      <w:proofErr w:type="spellStart"/>
+      <w:r>
+        <w:rPr>
+          <w:sz w:val="32"/>
+          <w:szCs w:val="32"/>
+        </w:rPr>
+        <w:t>type</w:t>
+      </w:r>
+      <w:proofErr w:type="spellEnd"/>
+      <w:r>
+        <w:rPr>
+          <w:sz w:val="32"/>
+          <w:szCs w:val="32"/>
+        </w:rPr>
+        <w:t>="</w:t>
+      </w:r>
+      <w:proofErr w:type="spellStart"/>
+      <w:r>
+        <w:rPr>
+          <w:sz w:val="32"/>
+          <w:szCs w:val="32"/>
+        </w:rPr>
+        <w:t>text</w:t>
+      </w:r>
+      <w:proofErr w:type="spellEnd"/>
+      <w:r>
+        <w:rPr>
+          <w:sz w:val="32"/>
+          <w:szCs w:val="32"/>
+        </w:rPr>
+        <w:t>"&gt;.</w:t>
+      </w:r>
+    </w:p>
+    <w:p>
+      <w:pPr>
+        <w:numPr>
+          <w:ilvl w:val="0"/>
+          <w:numId w:val="11"/>
+        </w:numPr>
+        <w:tabs>
+          <w:tab w:val="left" w:pos="2323"/>
+        </w:tabs>
+        <w:rPr>
+          <w:sz w:val="32"/>
+          <w:szCs w:val="32"/>
+        </w:rPr>
+      </w:pPr>
+      <w:r>
+        <w:rPr>
+          <w:sz w:val="32"/>
+          <w:szCs w:val="32"/>
+        </w:rPr>
+        <w:t>&lt;</w:t>
+      </w:r>
+      <w:proofErr w:type="spellStart"/>
+      <w:proofErr w:type="gramStart"/>
+      <w:r>
+        <w:rPr>
+          <w:sz w:val="32"/>
+          <w:szCs w:val="32"/>
+        </w:rPr>
+        <w:t>asp:DropDownList</w:t>
+      </w:r>
+      <w:proofErr w:type="spellEnd"/>
+      <w:proofErr w:type="gramEnd"/>
+      <w:r>
+        <w:rPr>
+          <w:sz w:val="32"/>
+          <w:szCs w:val="32"/>
+        </w:rPr>
+        <w:t>&gt; se transforma en &lt;</w:t>
+      </w:r>
+      <w:proofErr w:type="spellStart"/>
+      <w:r>
+        <w:rPr>
+          <w:sz w:val="32"/>
+          <w:szCs w:val="32"/>
+        </w:rPr>
+        <w:t>select</w:t>
+      </w:r>
+      <w:proofErr w:type="spellEnd"/>
+      <w:r>
+        <w:rPr>
+          <w:sz w:val="32"/>
+          <w:szCs w:val="32"/>
+        </w:rPr>
+        <w:t>&gt;.</w:t>
+      </w:r>
+    </w:p>
+    <w:p>
+      <w:pPr>
+        <w:numPr>
+          <w:ilvl w:val="0"/>
+          <w:numId w:val="11"/>
+        </w:numPr>
+        <w:tabs>
+          <w:tab w:val="left" w:pos="2323"/>
+        </w:tabs>
+        <w:rPr>
+          <w:sz w:val="32"/>
+          <w:szCs w:val="32"/>
+        </w:rPr>
+      </w:pPr>
+      <w:r>
+        <w:rPr>
+          <w:sz w:val="32"/>
+          <w:szCs w:val="32"/>
+        </w:rPr>
+        <w:t>&lt;</w:t>
+      </w:r>
+      <w:proofErr w:type="spellStart"/>
+      <w:proofErr w:type="gramStart"/>
+      <w:r>
+        <w:rPr>
+          <w:sz w:val="32"/>
+          <w:szCs w:val="32"/>
+        </w:rPr>
+        <w:t>asp:CheckBox</w:t>
+      </w:r>
+      <w:proofErr w:type="spellEnd"/>
+      <w:proofErr w:type="gramEnd"/>
+      <w:r>
+        <w:rPr>
+          <w:sz w:val="32"/>
+          <w:szCs w:val="32"/>
+        </w:rPr>
+        <w:t xml:space="preserve">&gt; se transforma en un &lt;input </w:t>
+      </w:r>
+      <w:proofErr w:type="spellStart"/>
+      <w:r>
+        <w:rPr>
+          <w:sz w:val="32"/>
+          <w:szCs w:val="32"/>
+        </w:rPr>
+        <w:t>type</w:t>
+      </w:r>
+      <w:proofErr w:type="spellEnd"/>
+      <w:r>
+        <w:rPr>
+          <w:sz w:val="32"/>
+          <w:szCs w:val="32"/>
+        </w:rPr>
+        <w:t>="</w:t>
+      </w:r>
+      <w:proofErr w:type="spellStart"/>
+      <w:r>
+        <w:rPr>
+          <w:sz w:val="32"/>
+          <w:szCs w:val="32"/>
+        </w:rPr>
+        <w:t>checkbox</w:t>
+      </w:r>
+      <w:proofErr w:type="spellEnd"/>
+      <w:r>
+        <w:rPr>
+          <w:sz w:val="32"/>
+          <w:szCs w:val="32"/>
+        </w:rPr>
+        <w:t>"&gt; envuelto en un &lt;</w:t>
+      </w:r>
+      <w:proofErr w:type="spellStart"/>
+      <w:r>
+        <w:rPr>
+          <w:sz w:val="32"/>
+          <w:szCs w:val="32"/>
+        </w:rPr>
+        <w:t>label</w:t>
+      </w:r>
+      <w:proofErr w:type="spellEnd"/>
+      <w:r>
+        <w:rPr>
+          <w:sz w:val="32"/>
+          <w:szCs w:val="32"/>
+        </w:rPr>
+        <w:t>&gt;.</w:t>
+      </w:r>
+    </w:p>
+    <w:p>
+      <w:pPr>
+        <w:tabs>
+          <w:tab w:val="left" w:pos="2323"/>
+        </w:tabs>
+        <w:rPr>
+          <w:sz w:val="32"/>
+          <w:szCs w:val="32"/>
+        </w:rPr>
+      </w:pPr>
+      <w:r>
+        <w:rPr>
+          <w:b/>
+          <w:bCs/>
+          <w:sz w:val="32"/>
+          <w:szCs w:val="32"/>
+        </w:rPr>
+        <w:t xml:space="preserve">2. La propiedad </w:t>
+      </w:r>
+      <w:proofErr w:type="spellStart"/>
+      <w:r>
+        <w:rPr>
+          <w:b/>
+          <w:bCs/>
+          <w:sz w:val="32"/>
+          <w:szCs w:val="32"/>
+        </w:rPr>
+        <w:t>TextMode</w:t>
+      </w:r>
+      <w:proofErr w:type="spellEnd"/>
+      <w:r>
+        <w:rPr>
+          <w:b/>
+          <w:bCs/>
+          <w:sz w:val="32"/>
+          <w:szCs w:val="32"/>
+        </w:rPr>
+        <w:t>:</w:t>
+      </w:r>
+      <w:r>
+        <w:rPr>
+          <w:sz w:val="32"/>
+          <w:szCs w:val="32"/>
+        </w:rPr>
+        <w:t xml:space="preserve"> Permite cambiar el tipo de input HTML que generará el </w:t>
+      </w:r>
+      <w:proofErr w:type="spellStart"/>
+      <w:r>
+        <w:rPr>
+          <w:sz w:val="32"/>
+          <w:szCs w:val="32"/>
+        </w:rPr>
+        <w:t>TextBox</w:t>
+      </w:r>
+      <w:proofErr w:type="spellEnd"/>
+      <w:r>
+        <w:rPr>
+          <w:sz w:val="32"/>
+          <w:szCs w:val="32"/>
+        </w:rPr>
+        <w:t>.</w:t>
+      </w:r>
+    </w:p>
+    <w:p>
+      <w:pPr>
+        <w:numPr>
+          <w:ilvl w:val="0"/>
+          <w:numId w:val="12"/>
+        </w:numPr>
+        <w:tabs>
+          <w:tab w:val="left" w:pos="2323"/>
+        </w:tabs>
+        <w:rPr>
+          <w:sz w:val="32"/>
+          <w:szCs w:val="32"/>
+        </w:rPr>
+      </w:pPr>
+      <w:proofErr w:type="spellStart"/>
+      <w:r>
+        <w:rPr>
+          <w:sz w:val="32"/>
+          <w:szCs w:val="32"/>
+        </w:rPr>
+        <w:t>TextMode</w:t>
+      </w:r>
+      <w:proofErr w:type="spellEnd"/>
+      <w:r>
+        <w:rPr>
+          <w:sz w:val="32"/>
+          <w:szCs w:val="32"/>
+        </w:rPr>
+        <w:t>="</w:t>
+      </w:r>
+      <w:proofErr w:type="spellStart"/>
+      <w:r>
+        <w:rPr>
+          <w:sz w:val="32"/>
+          <w:szCs w:val="32"/>
+        </w:rPr>
+        <w:t>MultiLine</w:t>
+      </w:r>
+      <w:proofErr w:type="spellEnd"/>
+      <w:r>
+        <w:rPr>
+          <w:sz w:val="32"/>
+          <w:szCs w:val="32"/>
+        </w:rPr>
+        <w:t>": Transforma el input en un &lt;</w:t>
+      </w:r>
+      <w:proofErr w:type="spellStart"/>
+      <w:r>
+        <w:rPr>
+          <w:sz w:val="32"/>
+          <w:szCs w:val="32"/>
+        </w:rPr>
+        <w:t>textarea</w:t>
+      </w:r>
+      <w:proofErr w:type="spellEnd"/>
+      <w:r>
+        <w:rPr>
+          <w:sz w:val="32"/>
+          <w:szCs w:val="32"/>
+        </w:rPr>
+        <w:t>&gt;, ideal para descripciones largas.</w:t>
+      </w:r>
+    </w:p>
+    <w:p>
+      <w:pPr>
+        <w:numPr>
+          <w:ilvl w:val="0"/>
+          <w:numId w:val="12"/>
+        </w:numPr>
+        <w:tabs>
+          <w:tab w:val="left" w:pos="2323"/>
+        </w:tabs>
+        <w:rPr>
+          <w:sz w:val="32"/>
+          <w:szCs w:val="32"/>
+        </w:rPr>
+      </w:pPr>
+      <w:proofErr w:type="spellStart"/>
+      <w:r>
+        <w:rPr>
+          <w:sz w:val="32"/>
+          <w:szCs w:val="32"/>
+        </w:rPr>
+        <w:t>TextMode</w:t>
+      </w:r>
+      <w:proofErr w:type="spellEnd"/>
+      <w:r>
+        <w:rPr>
+          <w:sz w:val="32"/>
+          <w:szCs w:val="32"/>
+        </w:rPr>
+        <w:t xml:space="preserve">="Date": Genera un &lt;input </w:t>
+      </w:r>
+      <w:proofErr w:type="spellStart"/>
+      <w:r>
+        <w:rPr>
+          <w:sz w:val="32"/>
+          <w:szCs w:val="32"/>
+        </w:rPr>
+        <w:t>type</w:t>
+      </w:r>
+      <w:proofErr w:type="spellEnd"/>
+      <w:r>
+        <w:rPr>
+          <w:sz w:val="32"/>
+          <w:szCs w:val="32"/>
+        </w:rPr>
+        <w:t>="date"&gt;, lo que activa el calendario nativo del navegador sin necesidad de usar librerías externas de JavaScript.</w:t>
+      </w:r>
+    </w:p>
+    <w:p>
+      <w:pPr>
+        <w:tabs>
+          <w:tab w:val="left" w:pos="2323"/>
+        </w:tabs>
+        <w:rPr>
+          <w:sz w:val="32"/>
+          <w:szCs w:val="32"/>
+        </w:rPr>
+      </w:pPr>
+      <w:r>
+        <w:rPr>
+          <w:b/>
+          <w:bCs/>
+          <w:sz w:val="32"/>
+          <w:szCs w:val="32"/>
+        </w:rPr>
+        <w:t>3. Integración con Bootstrap:</w:t>
+      </w:r>
+      <w:r>
+        <w:rPr>
+          <w:sz w:val="32"/>
+          <w:szCs w:val="32"/>
+        </w:rPr>
+        <w:t xml:space="preserve"> Para aplicar los estilos de Bootstrap, se debe utilizar la propiedad </w:t>
+      </w:r>
+      <w:proofErr w:type="spellStart"/>
+      <w:r>
+        <w:rPr>
+          <w:sz w:val="32"/>
+          <w:szCs w:val="32"/>
+        </w:rPr>
+        <w:t>CssClass</w:t>
+      </w:r>
+      <w:proofErr w:type="spellEnd"/>
+      <w:r>
+        <w:rPr>
+          <w:sz w:val="32"/>
+          <w:szCs w:val="32"/>
+        </w:rPr>
+        <w:t xml:space="preserve"> en lugar del clásico atributo </w:t>
+      </w:r>
+      <w:proofErr w:type="spellStart"/>
+      <w:r>
+        <w:rPr>
+          <w:sz w:val="32"/>
+          <w:szCs w:val="32"/>
+        </w:rPr>
+        <w:t>class</w:t>
+      </w:r>
+      <w:proofErr w:type="spellEnd"/>
+      <w:r>
+        <w:rPr>
+          <w:sz w:val="32"/>
+          <w:szCs w:val="32"/>
+        </w:rPr>
+        <w:t xml:space="preserve"> de HTML, ya que estamos trabajando con objetos de servidor. Ejemplos clave: </w:t>
+      </w:r>
+      <w:proofErr w:type="spellStart"/>
+      <w:r>
+        <w:rPr>
+          <w:sz w:val="32"/>
+          <w:szCs w:val="32"/>
+        </w:rPr>
+        <w:t>form</w:t>
+      </w:r>
+      <w:proofErr w:type="spellEnd"/>
+      <w:r>
+        <w:rPr>
+          <w:sz w:val="32"/>
+          <w:szCs w:val="32"/>
+        </w:rPr>
+        <w:t xml:space="preserve">-control (para textos) y </w:t>
+      </w:r>
+      <w:proofErr w:type="spellStart"/>
+      <w:r>
+        <w:rPr>
+          <w:sz w:val="32"/>
+          <w:szCs w:val="32"/>
+        </w:rPr>
+        <w:t>form-select</w:t>
+      </w:r>
+      <w:proofErr w:type="spellEnd"/>
+      <w:r>
+        <w:rPr>
+          <w:sz w:val="32"/>
+          <w:szCs w:val="32"/>
+        </w:rPr>
+        <w:t xml:space="preserve"> (para listas desplegables).</w:t>
+      </w:r>
+    </w:p>
+    <w:p>
+      <w:pPr>
+        <w:tabs>
+          <w:tab w:val="left" w:pos="2323"/>
+        </w:tabs>
+        <w:rPr>
+          <w:sz w:val="32"/>
+          <w:szCs w:val="32"/>
+        </w:rPr>
+      </w:pPr>
+    </w:p>
+    <w:p>
+      <w:pPr>
+        <w:tabs>
+          <w:tab w:val="left" w:pos="2323"/>
+        </w:tabs>
+        <w:rPr>
+          <w:sz w:val="32"/>
+          <w:szCs w:val="32"/>
+        </w:rPr>
+      </w:pPr>
+    </w:p>
+    <w:p>
+      <w:pPr>
+        <w:tabs>
+          <w:tab w:val="left" w:pos="2323"/>
+        </w:tabs>
+        <w:rPr>
+          <w:b/>
+          <w:bCs/>
+          <w:sz w:val="32"/>
+          <w:szCs w:val="32"/>
+          <w:u w:val="single"/>
+        </w:rPr>
+      </w:pPr>
+      <w:r>
+        <w:rPr>
+          <w:b/>
+          <w:bCs/>
+          <w:sz w:val="32"/>
+          <w:szCs w:val="32"/>
+          <w:u w:val="single"/>
+        </w:rPr>
+        <w:t>TEMA: Como C# maneja los punteros en las listas</w:t>
+      </w:r>
+    </w:p>
+    <w:p>
+      <w:pPr>
+        <w:tabs>
+          <w:tab w:val="left" w:pos="2323"/>
+        </w:tabs>
+        <w:rPr>
+          <w:sz w:val="32"/>
+          <w:szCs w:val="32"/>
+        </w:rPr>
+      </w:pPr>
+      <w:r>
+        <w:rPr>
+          <w:b/>
+          <w:bCs/>
+          <w:sz w:val="32"/>
+          <w:szCs w:val="32"/>
+        </w:rPr>
+        <w:t>1. Tipos de Valor vs. Tipos de Referencia</w:t>
+      </w:r>
+      <w:r>
+        <w:rPr>
+          <w:sz w:val="32"/>
+          <w:szCs w:val="32"/>
+        </w:rPr>
+        <w:t xml:space="preserve"> En C#, los datos se guardan de dos formas distintas dependiendo de su naturaleza:</w:t>
+      </w:r>
+    </w:p>
+    <w:p>
+      <w:pPr>
+        <w:numPr>
+          <w:ilvl w:val="0"/>
+          <w:numId w:val="13"/>
+        </w:numPr>
+        <w:tabs>
+          <w:tab w:val="left" w:pos="2323"/>
+        </w:tabs>
+        <w:rPr>
+          <w:sz w:val="32"/>
+          <w:szCs w:val="32"/>
+        </w:rPr>
+      </w:pPr>
+      <w:r>
+        <w:rPr>
+          <w:b/>
+          <w:bCs/>
+          <w:sz w:val="32"/>
+          <w:szCs w:val="32"/>
+        </w:rPr>
+        <w:t>Tipos de Valor (</w:t>
+      </w:r>
+      <w:proofErr w:type="spellStart"/>
+      <w:r>
+        <w:rPr>
+          <w:b/>
+          <w:bCs/>
+          <w:sz w:val="32"/>
+          <w:szCs w:val="32"/>
+        </w:rPr>
+        <w:t>Value</w:t>
+      </w:r>
+      <w:proofErr w:type="spellEnd"/>
+      <w:r>
+        <w:rPr>
+          <w:b/>
+          <w:bCs/>
+          <w:sz w:val="32"/>
+          <w:szCs w:val="32"/>
+        </w:rPr>
+        <w:t xml:space="preserve"> </w:t>
+      </w:r>
+      <w:proofErr w:type="spellStart"/>
+      <w:r>
+        <w:rPr>
+          <w:b/>
+          <w:bCs/>
+          <w:sz w:val="32"/>
+          <w:szCs w:val="32"/>
+        </w:rPr>
+        <w:t>Types</w:t>
+      </w:r>
+      <w:proofErr w:type="spellEnd"/>
+      <w:r>
+        <w:rPr>
+          <w:b/>
+          <w:bCs/>
+          <w:sz w:val="32"/>
+          <w:szCs w:val="32"/>
+        </w:rPr>
+        <w:t>):</w:t>
+      </w:r>
+      <w:r>
+        <w:rPr>
+          <w:sz w:val="32"/>
+          <w:szCs w:val="32"/>
+        </w:rPr>
+        <w:t xml:space="preserve"> Son tipos simples como </w:t>
+      </w:r>
+      <w:proofErr w:type="spellStart"/>
+      <w:r>
+        <w:rPr>
+          <w:sz w:val="32"/>
+          <w:szCs w:val="32"/>
+        </w:rPr>
+        <w:t>int</w:t>
+      </w:r>
+      <w:proofErr w:type="spellEnd"/>
+      <w:r>
+        <w:rPr>
+          <w:sz w:val="32"/>
+          <w:szCs w:val="32"/>
+        </w:rPr>
+        <w:t xml:space="preserve">, </w:t>
+      </w:r>
+      <w:proofErr w:type="spellStart"/>
+      <w:r>
+        <w:rPr>
+          <w:sz w:val="32"/>
+          <w:szCs w:val="32"/>
+        </w:rPr>
+        <w:t>bool</w:t>
+      </w:r>
+      <w:proofErr w:type="spellEnd"/>
+      <w:r>
+        <w:rPr>
+          <w:sz w:val="32"/>
+          <w:szCs w:val="32"/>
+        </w:rPr>
+        <w:t xml:space="preserve"> o </w:t>
+      </w:r>
+      <w:proofErr w:type="spellStart"/>
+      <w:r>
+        <w:rPr>
+          <w:sz w:val="32"/>
+          <w:szCs w:val="32"/>
+        </w:rPr>
+        <w:t>char</w:t>
+      </w:r>
+      <w:proofErr w:type="spellEnd"/>
+      <w:r>
+        <w:rPr>
+          <w:sz w:val="32"/>
+          <w:szCs w:val="32"/>
+        </w:rPr>
+        <w:t>. La variable guarda el valor real (ej. el número 5). Si copias la variable, creas un dato nuevo e independiente.</w:t>
+      </w:r>
+    </w:p>
+    <w:p>
+      <w:pPr>
+        <w:numPr>
+          <w:ilvl w:val="0"/>
+          <w:numId w:val="13"/>
+        </w:numPr>
+        <w:tabs>
+          <w:tab w:val="left" w:pos="2323"/>
+        </w:tabs>
+        <w:rPr>
+          <w:sz w:val="32"/>
+          <w:szCs w:val="32"/>
+        </w:rPr>
+      </w:pPr>
+      <w:r>
+        <w:rPr>
+          <w:b/>
+          <w:bCs/>
+          <w:sz w:val="32"/>
+          <w:szCs w:val="32"/>
+        </w:rPr>
+        <w:t xml:space="preserve">Tipos de Referencia (Reference </w:t>
+      </w:r>
+      <w:proofErr w:type="spellStart"/>
+      <w:r>
+        <w:rPr>
+          <w:b/>
+          <w:bCs/>
+          <w:sz w:val="32"/>
+          <w:szCs w:val="32"/>
+        </w:rPr>
+        <w:t>Types</w:t>
+      </w:r>
+      <w:proofErr w:type="spellEnd"/>
+      <w:r>
+        <w:rPr>
+          <w:b/>
+          <w:bCs/>
+          <w:sz w:val="32"/>
+          <w:szCs w:val="32"/>
+        </w:rPr>
+        <w:t>):</w:t>
+      </w:r>
+      <w:r>
+        <w:rPr>
+          <w:sz w:val="32"/>
+          <w:szCs w:val="32"/>
+        </w:rPr>
+        <w:t xml:space="preserve"> Son tipos complejos como las </w:t>
+      </w:r>
+      <w:r>
+        <w:rPr>
+          <w:b/>
+          <w:bCs/>
+          <w:sz w:val="32"/>
+          <w:szCs w:val="32"/>
+        </w:rPr>
+        <w:t>Clases</w:t>
+      </w:r>
+      <w:r>
+        <w:rPr>
+          <w:sz w:val="32"/>
+          <w:szCs w:val="32"/>
+        </w:rPr>
+        <w:t xml:space="preserve"> (Curso, Auto) y las </w:t>
+      </w:r>
+      <w:r>
+        <w:rPr>
+          <w:b/>
+          <w:bCs/>
+          <w:sz w:val="32"/>
+          <w:szCs w:val="32"/>
+        </w:rPr>
+        <w:t>Colecciones</w:t>
+      </w:r>
+      <w:r>
+        <w:rPr>
+          <w:sz w:val="32"/>
+          <w:szCs w:val="32"/>
+        </w:rPr>
+        <w:t xml:space="preserve"> (</w:t>
+      </w:r>
+      <w:proofErr w:type="spellStart"/>
+      <w:r>
+        <w:rPr>
+          <w:sz w:val="32"/>
+          <w:szCs w:val="32"/>
+        </w:rPr>
+        <w:t>List</w:t>
+      </w:r>
+      <w:proofErr w:type="spellEnd"/>
+      <w:r>
+        <w:rPr>
+          <w:sz w:val="32"/>
+          <w:szCs w:val="32"/>
+        </w:rPr>
+        <w:t xml:space="preserve">, Array). La variable no guarda los datos, sino una </w:t>
+      </w:r>
+      <w:r>
+        <w:rPr>
+          <w:b/>
+          <w:bCs/>
+          <w:sz w:val="32"/>
+          <w:szCs w:val="32"/>
+        </w:rPr>
+        <w:t>dirección de memoria</w:t>
+      </w:r>
+      <w:r>
+        <w:rPr>
+          <w:sz w:val="32"/>
+          <w:szCs w:val="32"/>
+        </w:rPr>
+        <w:t xml:space="preserve"> (un puntero) que indica dónde están los datos en el servidor.</w:t>
+      </w:r>
+    </w:p>
+    <w:p>
+      <w:pPr>
+        <w:tabs>
+          <w:tab w:val="left" w:pos="2323"/>
+        </w:tabs>
+        <w:rPr>
+          <w:sz w:val="32"/>
+          <w:szCs w:val="32"/>
+        </w:rPr>
+      </w:pPr>
+      <w:r>
+        <w:rPr>
+          <w:b/>
+          <w:bCs/>
+          <w:sz w:val="32"/>
+          <w:szCs w:val="32"/>
+        </w:rPr>
+        <w:lastRenderedPageBreak/>
+        <w:t>2. El Concepto del Puntero (Dirección de Memoria)</w:t>
+      </w:r>
+      <w:r>
+        <w:rPr>
+          <w:sz w:val="32"/>
+          <w:szCs w:val="32"/>
+        </w:rPr>
+        <w:t xml:space="preserve"> Cuando declaramos </w:t>
+      </w:r>
+      <w:proofErr w:type="spellStart"/>
+      <w:r>
+        <w:rPr>
+          <w:sz w:val="32"/>
+          <w:szCs w:val="32"/>
+        </w:rPr>
+        <w:t>List</w:t>
+      </w:r>
+      <w:proofErr w:type="spellEnd"/>
+      <w:r>
+        <w:rPr>
+          <w:sz w:val="32"/>
+          <w:szCs w:val="32"/>
+        </w:rPr>
+        <w:t xml:space="preserve">&lt;Curso&gt; </w:t>
+      </w:r>
+      <w:proofErr w:type="spellStart"/>
+      <w:r>
+        <w:rPr>
+          <w:sz w:val="32"/>
+          <w:szCs w:val="32"/>
+        </w:rPr>
+        <w:t>listaTemporal</w:t>
+      </w:r>
+      <w:proofErr w:type="spellEnd"/>
+      <w:r>
+        <w:rPr>
+          <w:sz w:val="32"/>
+          <w:szCs w:val="32"/>
+        </w:rPr>
+        <w:t>, estamos creando un puntero. Es como tener un papel con la dirección de una casa:</w:t>
+      </w:r>
+    </w:p>
+    <w:p>
+      <w:pPr>
+        <w:numPr>
+          <w:ilvl w:val="0"/>
+          <w:numId w:val="14"/>
+        </w:numPr>
+        <w:tabs>
+          <w:tab w:val="left" w:pos="2323"/>
+        </w:tabs>
+        <w:rPr>
+          <w:sz w:val="32"/>
+          <w:szCs w:val="32"/>
+        </w:rPr>
+      </w:pPr>
+      <w:r>
+        <w:rPr>
+          <w:sz w:val="32"/>
+          <w:szCs w:val="32"/>
+        </w:rPr>
+        <w:t xml:space="preserve">El papel es la variable </w:t>
+      </w:r>
+      <w:proofErr w:type="spellStart"/>
+      <w:r>
+        <w:rPr>
+          <w:sz w:val="32"/>
+          <w:szCs w:val="32"/>
+        </w:rPr>
+        <w:t>listaTemporal</w:t>
+      </w:r>
+      <w:proofErr w:type="spellEnd"/>
+      <w:r>
+        <w:rPr>
+          <w:sz w:val="32"/>
+          <w:szCs w:val="32"/>
+        </w:rPr>
+        <w:t>.</w:t>
+      </w:r>
+    </w:p>
+    <w:p>
+      <w:pPr>
+        <w:numPr>
+          <w:ilvl w:val="0"/>
+          <w:numId w:val="14"/>
+        </w:numPr>
+        <w:tabs>
+          <w:tab w:val="left" w:pos="2323"/>
+        </w:tabs>
+        <w:rPr>
+          <w:sz w:val="32"/>
+          <w:szCs w:val="32"/>
+        </w:rPr>
+      </w:pPr>
+      <w:r>
+        <w:rPr>
+          <w:sz w:val="32"/>
+          <w:szCs w:val="32"/>
+        </w:rPr>
+        <w:t xml:space="preserve">La casa es el objeto </w:t>
+      </w:r>
+      <w:proofErr w:type="spellStart"/>
+      <w:r>
+        <w:rPr>
+          <w:sz w:val="32"/>
+          <w:szCs w:val="32"/>
+        </w:rPr>
+        <w:t>List</w:t>
+      </w:r>
+      <w:proofErr w:type="spellEnd"/>
+      <w:r>
+        <w:rPr>
+          <w:sz w:val="32"/>
+          <w:szCs w:val="32"/>
+        </w:rPr>
+        <w:t xml:space="preserve"> que vive en la memoria RAM del servidor.</w:t>
+      </w:r>
+    </w:p>
+    <w:p>
+      <w:pPr>
+        <w:numPr>
+          <w:ilvl w:val="0"/>
+          <w:numId w:val="14"/>
+        </w:numPr>
+        <w:tabs>
+          <w:tab w:val="left" w:pos="2323"/>
+        </w:tabs>
+        <w:rPr>
+          <w:sz w:val="32"/>
+          <w:szCs w:val="32"/>
+        </w:rPr>
+      </w:pPr>
+      <w:r>
+        <w:rPr>
+          <w:sz w:val="32"/>
+          <w:szCs w:val="32"/>
+        </w:rPr>
+        <w:t>Si le das el papel a otra persona (otra variable), no construiste una casa nueva; ahora hay dos personas que saben dónde queda la misma casa.</w:t>
+      </w:r>
+    </w:p>
+    <w:p>
+      <w:pPr>
+        <w:tabs>
+          <w:tab w:val="left" w:pos="2323"/>
+        </w:tabs>
+        <w:rPr>
+          <w:sz w:val="32"/>
+          <w:szCs w:val="32"/>
+        </w:rPr>
+      </w:pPr>
+      <w:r>
+        <w:rPr>
+          <w:b/>
+          <w:bCs/>
+          <w:sz w:val="32"/>
+          <w:szCs w:val="32"/>
+        </w:rPr>
+        <w:t xml:space="preserve">3. Interacción con el Objeto </w:t>
+      </w:r>
+      <w:proofErr w:type="spellStart"/>
+      <w:r>
+        <w:rPr>
+          <w:b/>
+          <w:bCs/>
+          <w:sz w:val="32"/>
+          <w:szCs w:val="32"/>
+        </w:rPr>
+        <w:t>Session</w:t>
+      </w:r>
+      <w:proofErr w:type="spellEnd"/>
+      <w:r>
+        <w:rPr>
+          <w:sz w:val="32"/>
+          <w:szCs w:val="32"/>
+        </w:rPr>
+        <w:t xml:space="preserve"> Al trabajar con la </w:t>
+      </w:r>
+      <w:proofErr w:type="spellStart"/>
+      <w:r>
+        <w:rPr>
+          <w:b/>
+          <w:bCs/>
+          <w:sz w:val="32"/>
+          <w:szCs w:val="32"/>
+        </w:rPr>
+        <w:t>Session</w:t>
+      </w:r>
+      <w:proofErr w:type="spellEnd"/>
+      <w:r>
+        <w:rPr>
+          <w:sz w:val="32"/>
+          <w:szCs w:val="32"/>
+        </w:rPr>
+        <w:t>, este concepto se vuelve fundamental para el rendimiento:</w:t>
+      </w:r>
+    </w:p>
+    <w:p>
+      <w:pPr>
+        <w:numPr>
+          <w:ilvl w:val="0"/>
+          <w:numId w:val="15"/>
+        </w:numPr>
+        <w:tabs>
+          <w:tab w:val="left" w:pos="2323"/>
+        </w:tabs>
+        <w:rPr>
+          <w:sz w:val="32"/>
+          <w:szCs w:val="32"/>
+        </w:rPr>
+      </w:pPr>
+      <w:r>
+        <w:rPr>
+          <w:b/>
+          <w:bCs/>
+          <w:sz w:val="32"/>
+          <w:szCs w:val="32"/>
+        </w:rPr>
+        <w:t>Recuperación:</w:t>
+      </w:r>
+      <w:r>
+        <w:rPr>
+          <w:sz w:val="32"/>
+          <w:szCs w:val="32"/>
+        </w:rPr>
+        <w:t xml:space="preserve"> Al ejecutar (</w:t>
+      </w:r>
+      <w:proofErr w:type="spellStart"/>
+      <w:r>
+        <w:rPr>
+          <w:sz w:val="32"/>
+          <w:szCs w:val="32"/>
+        </w:rPr>
+        <w:t>List</w:t>
+      </w:r>
+      <w:proofErr w:type="spellEnd"/>
+      <w:r>
+        <w:rPr>
+          <w:sz w:val="32"/>
+          <w:szCs w:val="32"/>
+        </w:rPr>
+        <w:t>&lt;Curso</w:t>
+      </w:r>
+      <w:proofErr w:type="gramStart"/>
+      <w:r>
+        <w:rPr>
+          <w:sz w:val="32"/>
+          <w:szCs w:val="32"/>
+        </w:rPr>
+        <w:t>&gt;)</w:t>
+      </w:r>
+      <w:proofErr w:type="spellStart"/>
+      <w:r>
+        <w:rPr>
+          <w:sz w:val="32"/>
+          <w:szCs w:val="32"/>
+        </w:rPr>
+        <w:t>Session</w:t>
+      </w:r>
+      <w:proofErr w:type="spellEnd"/>
+      <w:proofErr w:type="gramEnd"/>
+      <w:r>
+        <w:rPr>
+          <w:sz w:val="32"/>
+          <w:szCs w:val="32"/>
+        </w:rPr>
+        <w:t>["</w:t>
+      </w:r>
+      <w:proofErr w:type="spellStart"/>
+      <w:r>
+        <w:rPr>
+          <w:sz w:val="32"/>
+          <w:szCs w:val="32"/>
+        </w:rPr>
+        <w:t>listaCursos</w:t>
+      </w:r>
+      <w:proofErr w:type="spellEnd"/>
+      <w:r>
+        <w:rPr>
+          <w:sz w:val="32"/>
+          <w:szCs w:val="32"/>
+        </w:rPr>
+        <w:t>"], el servidor te entrega la dirección de memoria de la lista original.</w:t>
+      </w:r>
+    </w:p>
+    <w:p>
+      <w:pPr>
+        <w:numPr>
+          <w:ilvl w:val="0"/>
+          <w:numId w:val="15"/>
+        </w:numPr>
+        <w:tabs>
+          <w:tab w:val="left" w:pos="2323"/>
+        </w:tabs>
+        <w:rPr>
+          <w:sz w:val="32"/>
+          <w:szCs w:val="32"/>
+        </w:rPr>
+      </w:pPr>
+      <w:r>
+        <w:rPr>
+          <w:b/>
+          <w:bCs/>
+          <w:sz w:val="32"/>
+          <w:szCs w:val="32"/>
+        </w:rPr>
+        <w:t>Mismo objeto, dos etiquetas:</w:t>
+      </w:r>
+      <w:r>
+        <w:rPr>
+          <w:sz w:val="32"/>
+          <w:szCs w:val="32"/>
+        </w:rPr>
+        <w:t xml:space="preserve"> En ese momento, tanto la clave en la </w:t>
+      </w:r>
+      <w:proofErr w:type="spellStart"/>
+      <w:r>
+        <w:rPr>
+          <w:sz w:val="32"/>
+          <w:szCs w:val="32"/>
+        </w:rPr>
+        <w:t>Session</w:t>
+      </w:r>
+      <w:proofErr w:type="spellEnd"/>
+      <w:r>
+        <w:rPr>
+          <w:sz w:val="32"/>
+          <w:szCs w:val="32"/>
+        </w:rPr>
+        <w:t xml:space="preserve"> como tu variable </w:t>
+      </w:r>
+      <w:proofErr w:type="spellStart"/>
+      <w:r>
+        <w:rPr>
+          <w:sz w:val="32"/>
+          <w:szCs w:val="32"/>
+        </w:rPr>
+        <w:t>listaTemporal</w:t>
+      </w:r>
+      <w:proofErr w:type="spellEnd"/>
+      <w:r>
+        <w:rPr>
+          <w:sz w:val="32"/>
+          <w:szCs w:val="32"/>
+        </w:rPr>
+        <w:t xml:space="preserve"> apuntan exactamente al mismo objeto en la memoria.</w:t>
+      </w:r>
+    </w:p>
+    <w:p>
+      <w:pPr>
+        <w:numPr>
+          <w:ilvl w:val="0"/>
+          <w:numId w:val="15"/>
+        </w:numPr>
+        <w:tabs>
+          <w:tab w:val="left" w:pos="2323"/>
+        </w:tabs>
+        <w:rPr>
+          <w:sz w:val="32"/>
+          <w:szCs w:val="32"/>
+        </w:rPr>
+      </w:pPr>
+      <w:r>
+        <w:rPr>
+          <w:b/>
+          <w:bCs/>
+          <w:sz w:val="32"/>
+          <w:szCs w:val="32"/>
+        </w:rPr>
+        <w:t>Modificación en tiempo real:</w:t>
+      </w:r>
+      <w:r>
+        <w:rPr>
+          <w:sz w:val="32"/>
+          <w:szCs w:val="32"/>
+        </w:rPr>
+        <w:t xml:space="preserve"> Cuando ejecutas </w:t>
+      </w:r>
+      <w:proofErr w:type="spellStart"/>
+      <w:r>
+        <w:rPr>
+          <w:sz w:val="32"/>
+          <w:szCs w:val="32"/>
+        </w:rPr>
+        <w:t>listaTemporal.Add</w:t>
+      </w:r>
+      <w:proofErr w:type="spellEnd"/>
+      <w:r>
+        <w:rPr>
+          <w:sz w:val="32"/>
+          <w:szCs w:val="32"/>
+        </w:rPr>
+        <w:t>(</w:t>
+      </w:r>
+      <w:proofErr w:type="spellStart"/>
+      <w:r>
+        <w:rPr>
+          <w:sz w:val="32"/>
+          <w:szCs w:val="32"/>
+        </w:rPr>
+        <w:t>nuevoCurso</w:t>
+      </w:r>
+      <w:proofErr w:type="spellEnd"/>
+      <w:r>
+        <w:rPr>
+          <w:sz w:val="32"/>
+          <w:szCs w:val="32"/>
+        </w:rPr>
+        <w:t>), estás enviando al nuevo curso directamente a esa dirección de memoria compartida.</w:t>
+      </w:r>
+    </w:p>
+    <w:p>
+      <w:pPr>
+        <w:tabs>
+          <w:tab w:val="left" w:pos="2323"/>
+        </w:tabs>
+        <w:rPr>
+          <w:sz w:val="32"/>
+          <w:szCs w:val="32"/>
+        </w:rPr>
+      </w:pPr>
+      <w:r>
+        <w:rPr>
+          <w:b/>
+          <w:bCs/>
+          <w:sz w:val="32"/>
+          <w:szCs w:val="32"/>
+        </w:rPr>
+        <w:t xml:space="preserve">4. ¿Por qué no es necesario </w:t>
+      </w:r>
+      <w:proofErr w:type="spellStart"/>
+      <w:r>
+        <w:rPr>
+          <w:b/>
+          <w:bCs/>
+          <w:sz w:val="32"/>
+          <w:szCs w:val="32"/>
+        </w:rPr>
+        <w:t>re-asignar</w:t>
+      </w:r>
+      <w:proofErr w:type="spellEnd"/>
+      <w:r>
+        <w:rPr>
+          <w:b/>
+          <w:bCs/>
+          <w:sz w:val="32"/>
+          <w:szCs w:val="32"/>
+        </w:rPr>
+        <w:t>?</w:t>
+      </w:r>
+      <w:r>
+        <w:rPr>
+          <w:sz w:val="32"/>
+          <w:szCs w:val="32"/>
+        </w:rPr>
+        <w:t xml:space="preserve"> A diferencia de los tipos de valor, no hace falta escribir </w:t>
+      </w:r>
+      <w:proofErr w:type="spellStart"/>
+      <w:r>
+        <w:rPr>
+          <w:sz w:val="32"/>
+          <w:szCs w:val="32"/>
+        </w:rPr>
+        <w:t>Session</w:t>
+      </w:r>
+      <w:proofErr w:type="spellEnd"/>
+      <w:r>
+        <w:rPr>
+          <w:sz w:val="32"/>
+          <w:szCs w:val="32"/>
+        </w:rPr>
+        <w:t>["</w:t>
+      </w:r>
+      <w:proofErr w:type="spellStart"/>
+      <w:r>
+        <w:rPr>
+          <w:sz w:val="32"/>
+          <w:szCs w:val="32"/>
+        </w:rPr>
+        <w:t>listaCursos</w:t>
+      </w:r>
+      <w:proofErr w:type="spellEnd"/>
+      <w:r>
+        <w:rPr>
+          <w:sz w:val="32"/>
+          <w:szCs w:val="32"/>
+        </w:rPr>
+        <w:t xml:space="preserve">"] = </w:t>
+      </w:r>
+      <w:proofErr w:type="spellStart"/>
+      <w:r>
+        <w:rPr>
+          <w:sz w:val="32"/>
+          <w:szCs w:val="32"/>
+        </w:rPr>
+        <w:t>listaTemporal</w:t>
+      </w:r>
+      <w:proofErr w:type="spellEnd"/>
+      <w:r>
+        <w:rPr>
+          <w:sz w:val="32"/>
+          <w:szCs w:val="32"/>
+        </w:rPr>
+        <w:t xml:space="preserve"> después de agregar un elemento. Como la </w:t>
+      </w:r>
+      <w:proofErr w:type="spellStart"/>
+      <w:r>
+        <w:rPr>
+          <w:sz w:val="32"/>
+          <w:szCs w:val="32"/>
+        </w:rPr>
+        <w:t>Session</w:t>
+      </w:r>
+      <w:proofErr w:type="spellEnd"/>
+      <w:r>
+        <w:rPr>
+          <w:sz w:val="32"/>
+          <w:szCs w:val="32"/>
+        </w:rPr>
+        <w:t xml:space="preserve"> nunca dejó de apuntar a esa dirección de memoria, y vos acabas de modificar el contenido de esa dirección, la </w:t>
+      </w:r>
+      <w:proofErr w:type="spellStart"/>
+      <w:r>
+        <w:rPr>
+          <w:sz w:val="32"/>
+          <w:szCs w:val="32"/>
+        </w:rPr>
+        <w:t>Session</w:t>
+      </w:r>
+      <w:proofErr w:type="spellEnd"/>
+      <w:r>
+        <w:rPr>
+          <w:sz w:val="32"/>
+          <w:szCs w:val="32"/>
+        </w:rPr>
+        <w:t xml:space="preserve"> ya "ve" el cambio automáticamente.</w:t>
+      </w:r>
+    </w:p>
+    <w:p>
+      <w:pPr>
+        <w:tabs>
+          <w:tab w:val="left" w:pos="2323"/>
+        </w:tabs>
+        <w:rPr>
+          <w:sz w:val="32"/>
+          <w:szCs w:val="32"/>
+        </w:rPr>
+      </w:pPr>
+      <w:r>
+        <w:rPr>
+          <w:sz w:val="32"/>
+          <w:szCs w:val="32"/>
+        </w:rPr>
+        <w:pict w14:anchorId="3DE6DA94">
+          <v:rect id="_x0000_i1034" style="width:0;height:1.5pt" o:hralign="center" o:hrstd="t" o:hr="t" fillcolor="#a0a0a0" stroked="f"/>
+        </w:pict>
+      </w:r>
+    </w:p>
+    <w:p>
+      <w:pPr>
+        <w:tabs>
+          <w:tab w:val="left" w:pos="2323"/>
+        </w:tabs>
+        <w:rPr>
+          <w:b/>
+          <w:bCs/>
+          <w:sz w:val="32"/>
+          <w:szCs w:val="32"/>
+        </w:rPr>
+      </w:pPr>
+      <w:r>
+        <w:rPr>
+          <w:rFonts w:ascii="Segoe UI Emoji" w:hAnsi="Segoe UI Emoji" w:cs="Segoe UI Emoji"/>
+          <w:b/>
+          <w:bCs/>
+          <w:sz w:val="32"/>
+          <w:szCs w:val="32"/>
+        </w:rPr>
+        <w:t>💡</w:t>
+      </w:r>
+      <w:r>
+        <w:rPr>
+          <w:b/>
+          <w:bCs/>
+          <w:sz w:val="32"/>
+          <w:szCs w:val="32"/>
+        </w:rPr>
+        <w:t xml:space="preserve"> Resumen para el examen:</w:t>
+      </w:r>
+    </w:p>
+    <w:p>
+      <w:pPr>
+        <w:numPr>
+          <w:ilvl w:val="0"/>
+          <w:numId w:val="16"/>
+        </w:numPr>
+        <w:tabs>
+          <w:tab w:val="left" w:pos="2323"/>
+        </w:tabs>
+        <w:rPr>
+          <w:sz w:val="32"/>
+          <w:szCs w:val="32"/>
+        </w:rPr>
+      </w:pPr>
+      <w:r>
+        <w:rPr>
+          <w:b/>
+          <w:bCs/>
+          <w:sz w:val="32"/>
+          <w:szCs w:val="32"/>
+        </w:rPr>
+        <w:t>Asignación por Referencia:</w:t>
+      </w:r>
+      <w:r>
+        <w:rPr>
+          <w:sz w:val="32"/>
+          <w:szCs w:val="32"/>
+        </w:rPr>
+        <w:t xml:space="preserve"> Las clases y listas se pasan por referencia. Múltiples variables pueden apuntar al mismo objeto.</w:t>
+      </w:r>
+    </w:p>
+    <w:p>
+      <w:pPr>
+        <w:numPr>
+          <w:ilvl w:val="0"/>
+          <w:numId w:val="16"/>
+        </w:numPr>
+        <w:tabs>
+          <w:tab w:val="left" w:pos="2323"/>
+        </w:tabs>
+        <w:rPr>
+          <w:sz w:val="32"/>
+          <w:szCs w:val="32"/>
+        </w:rPr>
+      </w:pPr>
+      <w:r>
+        <w:rPr>
+          <w:b/>
+          <w:bCs/>
+          <w:sz w:val="32"/>
+          <w:szCs w:val="32"/>
+        </w:rPr>
+        <w:t>Eficiencia:</w:t>
+      </w:r>
+      <w:r>
+        <w:rPr>
+          <w:sz w:val="32"/>
+          <w:szCs w:val="32"/>
+        </w:rPr>
+        <w:t xml:space="preserve"> Esto evita duplicar listas pesadas en la memoria cada vez que queremos agregar un dato.</w:t>
+      </w:r>
+    </w:p>
+    <w:p>
+      <w:pPr>
+        <w:numPr>
+          <w:ilvl w:val="0"/>
+          <w:numId w:val="16"/>
+        </w:numPr>
+        <w:tabs>
+          <w:tab w:val="left" w:pos="2323"/>
+        </w:tabs>
+        <w:rPr>
+          <w:sz w:val="32"/>
+          <w:szCs w:val="32"/>
+        </w:rPr>
+      </w:pPr>
+      <w:r>
+        <w:rPr>
+          <w:b/>
+          <w:bCs/>
+          <w:sz w:val="32"/>
+          <w:szCs w:val="32"/>
+        </w:rPr>
+        <w:lastRenderedPageBreak/>
+        <w:t>Regla de oro:</w:t>
+      </w:r>
+      <w:r>
+        <w:rPr>
+          <w:sz w:val="32"/>
+          <w:szCs w:val="32"/>
+        </w:rPr>
+        <w:t xml:space="preserve"> Si el objeto ya existe en la </w:t>
+      </w:r>
+      <w:proofErr w:type="spellStart"/>
+      <w:r>
+        <w:rPr>
+          <w:sz w:val="32"/>
+          <w:szCs w:val="32"/>
+        </w:rPr>
+        <w:t>Session</w:t>
+      </w:r>
+      <w:proofErr w:type="spellEnd"/>
+      <w:r>
+        <w:rPr>
+          <w:sz w:val="32"/>
+          <w:szCs w:val="32"/>
+        </w:rPr>
+        <w:t>, basta con obtener su referencia, modificarlo y el cambio persistirá sin pasos extra.</w:t>
+      </w:r>
+    </w:p>
+    <w:p>
+      <w:pPr>
+        <w:tabs>
+          <w:tab w:val="left" w:pos="2323"/>
+        </w:tabs>
+        <w:rPr>
+          <w:sz w:val="32"/>
+          <w:szCs w:val="32"/>
+        </w:rPr>
+      </w:pPr>
+    </w:p>
+    <w:p>
+      <w:pPr>
+        <w:tabs>
+          <w:tab w:val="left" w:pos="2323"/>
+        </w:tabs>
+        <w:rPr>
+          <w:sz w:val="32"/>
+          <w:szCs w:val="32"/>
+        </w:rPr>
+      </w:pPr>
+    </w:p>
+    <w:p>
+      <w:pPr>
+        <w:tabs>
+          <w:tab w:val="left" w:pos="2323"/>
+        </w:tabs>
+        <w:rPr>
+          <w:sz w:val="32"/>
+          <w:szCs w:val="32"/>
         </w:rPr>
       </w:pPr>
     </w:p>
@@ -4461,6 +6262,119 @@
     </w:lvl>
   </w:abstractNum>
   <w:abstractNum w:abstractNumId="1" w15:restartNumberingAfterBreak="0">
+    <w:nsid w:val="08932E4B"/>
+    <w:multiLevelType w:val="multilevel"/>
+    <w:tmpl w:val="4802E4AE"/>
+    <w:lvl w:ilvl="0">
+      <w:start w:val="1"/>
+      <w:numFmt w:val="decimal"/>
+      <w:lvlText w:val="%1."/>
+      <w:lvlJc w:val="left"/>
+      <w:pPr>
+        <w:tabs>
+          <w:tab w:val="num" w:pos="720"/>
+        </w:tabs>
+        <w:ind w:left="720" w:hanging="360"/>
+      </w:pPr>
+    </w:lvl>
+    <w:lvl w:ilvl="1" w:tentative="1">
+      <w:start w:val="1"/>
+      <w:numFmt w:val="decimal"/>
+      <w:lvlText w:val="%2."/>
+      <w:lvlJc w:val="left"/>
+      <w:pPr>
+        <w:tabs>
+          <w:tab w:val="num" w:pos="1440"/>
+        </w:tabs>
+        <w:ind w:left="1440" w:hanging="360"/>
+      </w:pPr>
+    </w:lvl>
+    <w:lvl w:ilvl="2" w:tentative="1">
+      <w:start w:val="1"/>
+      <w:numFmt w:val="decimal"/>
+      <w:lvlText w:val="%3."/>
+      <w:lvlJc w:val="left"/>
+      <w:pPr>
+        <w:tabs>
+          <w:tab w:val="num" w:pos="2160"/>
+        </w:tabs>
+        <w:ind w:left="2160" w:hanging="360"/>
+      </w:pPr>
+    </w:lvl>
+    <w:lvl w:ilvl="3" w:tentative="1">
+      <w:start w:val="1"/>
+      <w:numFmt w:val="decimal"/>
+      <w:lvlText w:val="%4."/>
+      <w:lvlJc w:val="left"/>
+      <w:pPr>
+        <w:tabs>
+          <w:tab w:val="num" w:pos="2880"/>
+        </w:tabs>
+        <w:ind w:left="2880" w:hanging="360"/>
+      </w:pPr>
+    </w:lvl>
+    <w:lvl w:ilvl="4" w:tentative="1">
+      <w:start w:val="1"/>
+      <w:numFmt w:val="decimal"/>
+      <w:lvlText w:val="%5."/>
+      <w:lvlJc w:val="left"/>
+      <w:pPr>
+        <w:tabs>
+          <w:tab w:val="num" w:pos="3600"/>
+        </w:tabs>
+        <w:ind w:left="3600" w:hanging="360"/>
+      </w:pPr>
+    </w:lvl>
+    <w:lvl w:ilvl="5" w:tentative="1">
+      <w:start w:val="1"/>
+      <w:numFmt w:val="decimal"/>
+      <w:lvlText w:val="%6."/>
+      <w:lvlJc w:val="left"/>
+      <w:pPr>
+        <w:tabs>
+          <w:tab w:val="num" w:pos="4320"/>
+        </w:tabs>
+        <w:ind w:left="4320" w:hanging="360"/>
+      </w:pPr>
+    </w:lvl>
+    <w:lvl w:ilvl="6" w:tentative="1">
+      <w:start w:val="1"/>
+      <w:numFmt w:val="decimal"/>
+      <w:lvlText w:val="%7."/>
+      <w:lvlJc w:val="left"/>
+      <w:pPr>
+        <w:tabs>
+          <w:tab w:val="num" w:pos="5040"/>
+        </w:tabs>
+        <w:ind w:left="5040" w:hanging="360"/>
+      </w:pPr>
+    </w:lvl>
+    <w:lvl w:ilvl="7" w:tentative="1">
+      <w:start w:val="1"/>
+      <w:numFmt w:val="decimal"/>
+      <w:lvlText w:val="%8."/>
+      <w:lvlJc w:val="left"/>
+      <w:pPr>
+        <w:tabs>
+          <w:tab w:val="num" w:pos="5760"/>
+        </w:tabs>
+        <w:ind w:left="5760" w:hanging="360"/>
+      </w:pPr>
+    </w:lvl>
+    <w:lvl w:ilvl="8" w:tentative="1">
+      <w:start w:val="1"/>
+      <w:numFmt w:val="decimal"/>
+      <w:lvlText w:val="%9."/>
+      <w:lvlJc w:val="left"/>
+      <w:pPr>
+        <w:tabs>
+          <w:tab w:val="num" w:pos="6480"/>
+        </w:tabs>
+        <w:ind w:left="6480" w:hanging="360"/>
+      </w:pPr>
+    </w:lvl>
+  </w:abstractNum>
+  <w:abstractNum w:abstractNumId="2" w15:restartNumberingAfterBreak="0">
     <w:nsid w:val="0FD7502C"/>
     <w:multiLevelType w:val="multilevel"/>
     <w:tmpl w:val="D06C6780"/>
@@ -4609,7 +6523,7 @@
       </w:rPr>
     </w:lvl>
   </w:abstractNum>
-  <w:abstractNum w:abstractNumId="2" w15:restartNumberingAfterBreak="0">
+  <w:abstractNum w:abstractNumId="3" w15:restartNumberingAfterBreak="0">
     <w:nsid w:val="1CD97958"/>
     <w:multiLevelType w:val="multilevel"/>
     <w:tmpl w:val="F42021D8"/>
@@ -4758,7 +6672,7 @@
       </w:rPr>
     </w:lvl>
   </w:abstractNum>
-  <w:abstractNum w:abstractNumId="3" w15:restartNumberingAfterBreak="0">
+  <w:abstractNum w:abstractNumId="4" w15:restartNumberingAfterBreak="0">
     <w:nsid w:val="2A9679DF"/>
     <w:multiLevelType w:val="multilevel"/>
     <w:tmpl w:val="6FF2F92A"/>
@@ -4907,7 +6821,156 @@
       </w:rPr>
     </w:lvl>
   </w:abstractNum>
-  <w:abstractNum w:abstractNumId="4" w15:restartNumberingAfterBreak="0">
+  <w:abstractNum w:abstractNumId="5" w15:restartNumberingAfterBreak="0">
+    <w:nsid w:val="310B33C8"/>
+    <w:multiLevelType w:val="multilevel"/>
+    <w:tmpl w:val="92124254"/>
+    <w:lvl w:ilvl="0">
+      <w:start w:val="1"/>
+      <w:numFmt w:val="bullet"/>
+      <w:lvlText w:val=""/>
+      <w:lvlJc w:val="left"/>
+      <w:pPr>
+        <w:tabs>
+          <w:tab w:val="num" w:pos="720"/>
+        </w:tabs>
+        <w:ind w:left="720" w:hanging="360"/>
+      </w:pPr>
+      <w:rPr>
+        <w:rFonts w:ascii="Symbol" w:hAnsi="Symbol" w:hint="default"/>
+        <w:sz w:val="20"/>
+      </w:rPr>
+    </w:lvl>
+    <w:lvl w:ilvl="1" w:tentative="1">
+      <w:start w:val="1"/>
+      <w:numFmt w:val="bullet"/>
+      <w:lvlText w:val="o"/>
+      <w:lvlJc w:val="left"/>
+      <w:pPr>
+        <w:tabs>
+          <w:tab w:val="num" w:pos="1440"/>
+        </w:tabs>
+        <w:ind w:left="1440" w:hanging="360"/>
+      </w:pPr>
+      <w:rPr>
+        <w:rFonts w:ascii="Courier New" w:hAnsi="Courier New" w:hint="default"/>
+        <w:sz w:val="20"/>
+      </w:rPr>
+    </w:lvl>
+    <w:lvl w:ilvl="2" w:tentative="1">
+      <w:start w:val="1"/>
+      <w:numFmt w:val="bullet"/>
+      <w:lvlText w:val=""/>
+      <w:lvlJc w:val="left"/>
+      <w:pPr>
+        <w:tabs>
+          <w:tab w:val="num" w:pos="2160"/>
+        </w:tabs>
+        <w:ind w:left="2160" w:hanging="360"/>
+      </w:pPr>
+      <w:rPr>
+        <w:rFonts w:ascii="Wingdings" w:hAnsi="Wingdings" w:hint="default"/>
+        <w:sz w:val="20"/>
+      </w:rPr>
+    </w:lvl>
+    <w:lvl w:ilvl="3" w:tentative="1">
+      <w:start w:val="1"/>
+      <w:numFmt w:val="bullet"/>
+      <w:lvlText w:val=""/>
+      <w:lvlJc w:val="left"/>
+      <w:pPr>
+        <w:tabs>
+          <w:tab w:val="num" w:pos="2880"/>
+        </w:tabs>
+        <w:ind w:left="2880" w:hanging="360"/>
+      </w:pPr>
+      <w:rPr>
+        <w:rFonts w:ascii="Wingdings" w:hAnsi="Wingdings" w:hint="default"/>
+        <w:sz w:val="20"/>
+      </w:rPr>
+    </w:lvl>
+    <w:lvl w:ilvl="4" w:tentative="1">
+      <w:start w:val="1"/>
+      <w:numFmt w:val="bullet"/>
+      <w:lvlText w:val=""/>
+      <w:lvlJc w:val="left"/>
+      <w:pPr>
+        <w:tabs>
+          <w:tab w:val="num" w:pos="3600"/>
+        </w:tabs>
+        <w:ind w:left="3600" w:hanging="360"/>
+      </w:pPr>
+      <w:rPr>
+        <w:rFonts w:ascii="Wingdings" w:hAnsi="Wingdings" w:hint="default"/>
+        <w:sz w:val="20"/>
+      </w:rPr>
+    </w:lvl>
+    <w:lvl w:ilvl="5" w:tentative="1">
+      <w:start w:val="1"/>
+      <w:numFmt w:val="bullet"/>
+      <w:lvlText w:val=""/>
+      <w:lvlJc w:val="left"/>
+      <w:pPr>
+        <w:tabs>
+          <w:tab w:val="num" w:pos="4320"/>
+        </w:tabs>
+        <w:ind w:left="4320" w:hanging="360"/>
+      </w:pPr>
+      <w:rPr>
+        <w:rFonts w:ascii="Wingdings" w:hAnsi="Wingdings" w:hint="default"/>
+        <w:sz w:val="20"/>
+      </w:rPr>
+    </w:lvl>
+    <w:lvl w:ilvl="6" w:tentative="1">
+      <w:start w:val="1"/>
+      <w:numFmt w:val="bullet"/>
+      <w:lvlText w:val=""/>
+      <w:lvlJc w:val="left"/>
+      <w:pPr>
+        <w:tabs>
+          <w:tab w:val="num" w:pos="5040"/>
+        </w:tabs>
+        <w:ind w:left="5040" w:hanging="360"/>
+      </w:pPr>
+      <w:rPr>
+        <w:rFonts w:ascii="Wingdings" w:hAnsi="Wingdings" w:hint="default"/>
+        <w:sz w:val="20"/>
+      </w:rPr>
+    </w:lvl>
+    <w:lvl w:ilvl="7" w:tentative="1">
+      <w:start w:val="1"/>
+      <w:numFmt w:val="bullet"/>
+      <w:lvlText w:val=""/>
+      <w:lvlJc w:val="left"/>
+      <w:pPr>
+        <w:tabs>
+          <w:tab w:val="num" w:pos="5760"/>
+        </w:tabs>
+        <w:ind w:left="5760" w:hanging="360"/>
+      </w:pPr>
+      <w:rPr>
+        <w:rFonts w:ascii="Wingdings" w:hAnsi="Wingdings" w:hint="default"/>
+        <w:sz w:val="20"/>
+      </w:rPr>
+    </w:lvl>
+    <w:lvl w:ilvl="8" w:tentative="1">
+      <w:start w:val="1"/>
+      <w:numFmt w:val="bullet"/>
+      <w:lvlText w:val=""/>
+      <w:lvlJc w:val="left"/>
+      <w:pPr>
+        <w:tabs>
+          <w:tab w:val="num" w:pos="6480"/>
+        </w:tabs>
+        <w:ind w:left="6480" w:hanging="360"/>
+      </w:pPr>
+      <w:rPr>
+        <w:rFonts w:ascii="Wingdings" w:hAnsi="Wingdings" w:hint="default"/>
+        <w:sz w:val="20"/>
+      </w:rPr>
+    </w:lvl>
+  </w:abstractNum>
+  <w:abstractNum w:abstractNumId="6" w15:restartNumberingAfterBreak="0">
     <w:nsid w:val="3C5140D7"/>
     <w:multiLevelType w:val="multilevel"/>
     <w:tmpl w:val="524A6932"/>
@@ -5056,7 +7119,156 @@
       </w:rPr>
     </w:lvl>
   </w:abstractNum>
-  <w:abstractNum w:abstractNumId="5" w15:restartNumberingAfterBreak="0">
+  <w:abstractNum w:abstractNumId="7" w15:restartNumberingAfterBreak="0">
+    <w:nsid w:val="4A235944"/>
+    <w:multiLevelType w:val="multilevel"/>
+    <w:tmpl w:val="86D88C52"/>
+    <w:lvl w:ilvl="0">
+      <w:start w:val="1"/>
+      <w:numFmt w:val="bullet"/>
+      <w:lvlText w:val=""/>
+      <w:lvlJc w:val="left"/>
+      <w:pPr>
+        <w:tabs>
+          <w:tab w:val="num" w:pos="720"/>
+        </w:tabs>
+        <w:ind w:left="720" w:hanging="360"/>
+      </w:pPr>
+      <w:rPr>
+        <w:rFonts w:ascii="Symbol" w:hAnsi="Symbol" w:hint="default"/>
+        <w:sz w:val="20"/>
+      </w:rPr>
+    </w:lvl>
+    <w:lvl w:ilvl="1" w:tentative="1">
+      <w:start w:val="1"/>
+      <w:numFmt w:val="bullet"/>
+      <w:lvlText w:val="o"/>
+      <w:lvlJc w:val="left"/>
+      <w:pPr>
+        <w:tabs>
+          <w:tab w:val="num" w:pos="1440"/>
+        </w:tabs>
+        <w:ind w:left="1440" w:hanging="360"/>
+      </w:pPr>
+      <w:rPr>
+        <w:rFonts w:ascii="Courier New" w:hAnsi="Courier New" w:hint="default"/>
+        <w:sz w:val="20"/>
+      </w:rPr>
+    </w:lvl>
+    <w:lvl w:ilvl="2" w:tentative="1">
+      <w:start w:val="1"/>
+      <w:numFmt w:val="bullet"/>
+      <w:lvlText w:val=""/>
+      <w:lvlJc w:val="left"/>
+      <w:pPr>
+        <w:tabs>
+          <w:tab w:val="num" w:pos="2160"/>
+        </w:tabs>
+        <w:ind w:left="2160" w:hanging="360"/>
+      </w:pPr>
+      <w:rPr>
+        <w:rFonts w:ascii="Wingdings" w:hAnsi="Wingdings" w:hint="default"/>
+        <w:sz w:val="20"/>
+      </w:rPr>
+    </w:lvl>
+    <w:lvl w:ilvl="3" w:tentative="1">
+      <w:start w:val="1"/>
+      <w:numFmt w:val="bullet"/>
+      <w:lvlText w:val=""/>
+      <w:lvlJc w:val="left"/>
+      <w:pPr>
+        <w:tabs>
+          <w:tab w:val="num" w:pos="2880"/>
+        </w:tabs>
+        <w:ind w:left="2880" w:hanging="360"/>
+      </w:pPr>
+      <w:rPr>
+        <w:rFonts w:ascii="Wingdings" w:hAnsi="Wingdings" w:hint="default"/>
+        <w:sz w:val="20"/>
+      </w:rPr>
+    </w:lvl>
+    <w:lvl w:ilvl="4" w:tentative="1">
+      <w:start w:val="1"/>
+      <w:numFmt w:val="bullet"/>
+      <w:lvlText w:val=""/>
+      <w:lvlJc w:val="left"/>
+      <w:pPr>
+        <w:tabs>
+          <w:tab w:val="num" w:pos="3600"/>
+        </w:tabs>
+        <w:ind w:left="3600" w:hanging="360"/>
+      </w:pPr>
+      <w:rPr>
+        <w:rFonts w:ascii="Wingdings" w:hAnsi="Wingdings" w:hint="default"/>
+        <w:sz w:val="20"/>
+      </w:rPr>
+    </w:lvl>
+    <w:lvl w:ilvl="5" w:tentative="1">
+      <w:start w:val="1"/>
+      <w:numFmt w:val="bullet"/>
+      <w:lvlText w:val=""/>
+      <w:lvlJc w:val="left"/>
+      <w:pPr>
+        <w:tabs>
+          <w:tab w:val="num" w:pos="4320"/>
+        </w:tabs>
+        <w:ind w:left="4320" w:hanging="360"/>
+      </w:pPr>
+      <w:rPr>
+        <w:rFonts w:ascii="Wingdings" w:hAnsi="Wingdings" w:hint="default"/>
+        <w:sz w:val="20"/>
+      </w:rPr>
+    </w:lvl>
+    <w:lvl w:ilvl="6" w:tentative="1">
+      <w:start w:val="1"/>
+      <w:numFmt w:val="bullet"/>
+      <w:lvlText w:val=""/>
+      <w:lvlJc w:val="left"/>
+      <w:pPr>
+        <w:tabs>
+          <w:tab w:val="num" w:pos="5040"/>
+        </w:tabs>
+        <w:ind w:left="5040" w:hanging="360"/>
+      </w:pPr>
+      <w:rPr>
+        <w:rFonts w:ascii="Wingdings" w:hAnsi="Wingdings" w:hint="default"/>
+        <w:sz w:val="20"/>
+      </w:rPr>
+    </w:lvl>
+    <w:lvl w:ilvl="7" w:tentative="1">
+      <w:start w:val="1"/>
+      <w:numFmt w:val="bullet"/>
+      <w:lvlText w:val=""/>
+      <w:lvlJc w:val="left"/>
+      <w:pPr>
+        <w:tabs>
+          <w:tab w:val="num" w:pos="5760"/>
+        </w:tabs>
+        <w:ind w:left="5760" w:hanging="360"/>
+      </w:pPr>
+      <w:rPr>
+        <w:rFonts w:ascii="Wingdings" w:hAnsi="Wingdings" w:hint="default"/>
+        <w:sz w:val="20"/>
+      </w:rPr>
+    </w:lvl>
+    <w:lvl w:ilvl="8" w:tentative="1">
+      <w:start w:val="1"/>
+      <w:numFmt w:val="bullet"/>
+      <w:lvlText w:val=""/>
+      <w:lvlJc w:val="left"/>
+      <w:pPr>
+        <w:tabs>
+          <w:tab w:val="num" w:pos="6480"/>
+        </w:tabs>
+        <w:ind w:left="6480" w:hanging="360"/>
+      </w:pPr>
+      <w:rPr>
+        <w:rFonts w:ascii="Wingdings" w:hAnsi="Wingdings" w:hint="default"/>
+        <w:sz w:val="20"/>
+      </w:rPr>
+    </w:lvl>
+  </w:abstractNum>
+  <w:abstractNum w:abstractNumId="8" w15:restartNumberingAfterBreak="0">
     <w:nsid w:val="54A92773"/>
     <w:multiLevelType w:val="multilevel"/>
     <w:tmpl w:val="1E52947E"/>
@@ -5205,7 +7417,7 @@
       </w:rPr>
     </w:lvl>
   </w:abstractNum>
-  <w:abstractNum w:abstractNumId="6" w15:restartNumberingAfterBreak="0">
+  <w:abstractNum w:abstractNumId="9" w15:restartNumberingAfterBreak="0">
     <w:nsid w:val="596B1DFE"/>
     <w:multiLevelType w:val="multilevel"/>
     <w:tmpl w:val="A5FA00B4"/>
@@ -5354,7 +7566,7 @@
       </w:rPr>
     </w:lvl>
   </w:abstractNum>
-  <w:abstractNum w:abstractNumId="7" w15:restartNumberingAfterBreak="0">
+  <w:abstractNum w:abstractNumId="10" w15:restartNumberingAfterBreak="0">
     <w:nsid w:val="6A7B460C"/>
     <w:multiLevelType w:val="multilevel"/>
     <w:tmpl w:val="E27AE180"/>
@@ -5503,7 +7715,603 @@
       </w:rPr>
     </w:lvl>
   </w:abstractNum>
-  <w:abstractNum w:abstractNumId="8" w15:restartNumberingAfterBreak="0">
+  <w:abstractNum w:abstractNumId="11" w15:restartNumberingAfterBreak="0">
+    <w:nsid w:val="6DDE2F84"/>
+    <w:multiLevelType w:val="multilevel"/>
+    <w:tmpl w:val="40544238"/>
+    <w:lvl w:ilvl="0">
+      <w:start w:val="1"/>
+      <w:numFmt w:val="bullet"/>
+      <w:lvlText w:val=""/>
+      <w:lvlJc w:val="left"/>
+      <w:pPr>
+        <w:tabs>
+          <w:tab w:val="num" w:pos="720"/>
+        </w:tabs>
+        <w:ind w:left="720" w:hanging="360"/>
+      </w:pPr>
+      <w:rPr>
+        <w:rFonts w:ascii="Symbol" w:hAnsi="Symbol" w:hint="default"/>
+        <w:sz w:val="20"/>
+      </w:rPr>
+    </w:lvl>
+    <w:lvl w:ilvl="1" w:tentative="1">
+      <w:start w:val="1"/>
+      <w:numFmt w:val="bullet"/>
+      <w:lvlText w:val="o"/>
+      <w:lvlJc w:val="left"/>
+      <w:pPr>
+        <w:tabs>
+          <w:tab w:val="num" w:pos="1440"/>
+        </w:tabs>
+        <w:ind w:left="1440" w:hanging="360"/>
+      </w:pPr>
+      <w:rPr>
+        <w:rFonts w:ascii="Courier New" w:hAnsi="Courier New" w:hint="default"/>
+        <w:sz w:val="20"/>
+      </w:rPr>
+    </w:lvl>
+    <w:lvl w:ilvl="2" w:tentative="1">
+      <w:start w:val="1"/>
+      <w:numFmt w:val="bullet"/>
+      <w:lvlText w:val=""/>
+      <w:lvlJc w:val="left"/>
+      <w:pPr>
+        <w:tabs>
+          <w:tab w:val="num" w:pos="2160"/>
+        </w:tabs>
+        <w:ind w:left="2160" w:hanging="360"/>
+      </w:pPr>
+      <w:rPr>
+        <w:rFonts w:ascii="Wingdings" w:hAnsi="Wingdings" w:hint="default"/>
+        <w:sz w:val="20"/>
+      </w:rPr>
+    </w:lvl>
+    <w:lvl w:ilvl="3" w:tentative="1">
+      <w:start w:val="1"/>
+      <w:numFmt w:val="bullet"/>
+      <w:lvlText w:val=""/>
+      <w:lvlJc w:val="left"/>
+      <w:pPr>
+        <w:tabs>
+          <w:tab w:val="num" w:pos="2880"/>
+        </w:tabs>
+        <w:ind w:left="2880" w:hanging="360"/>
+      </w:pPr>
+      <w:rPr>
+        <w:rFonts w:ascii="Wingdings" w:hAnsi="Wingdings" w:hint="default"/>
+        <w:sz w:val="20"/>
+      </w:rPr>
+    </w:lvl>
+    <w:lvl w:ilvl="4" w:tentative="1">
+      <w:start w:val="1"/>
+      <w:numFmt w:val="bullet"/>
+      <w:lvlText w:val=""/>
+      <w:lvlJc w:val="left"/>
+      <w:pPr>
+        <w:tabs>
+          <w:tab w:val="num" w:pos="3600"/>
+        </w:tabs>
+        <w:ind w:left="3600" w:hanging="360"/>
+      </w:pPr>
+      <w:rPr>
+        <w:rFonts w:ascii="Wingdings" w:hAnsi="Wingdings" w:hint="default"/>
+        <w:sz w:val="20"/>
+      </w:rPr>
+    </w:lvl>
+    <w:lvl w:ilvl="5" w:tentative="1">
+      <w:start w:val="1"/>
+      <w:numFmt w:val="bullet"/>
+      <w:lvlText w:val=""/>
+      <w:lvlJc w:val="left"/>
+      <w:pPr>
+        <w:tabs>
+          <w:tab w:val="num" w:pos="4320"/>
+        </w:tabs>
+        <w:ind w:left="4320" w:hanging="360"/>
+      </w:pPr>
+      <w:rPr>
+        <w:rFonts w:ascii="Wingdings" w:hAnsi="Wingdings" w:hint="default"/>
+        <w:sz w:val="20"/>
+      </w:rPr>
+    </w:lvl>
+    <w:lvl w:ilvl="6" w:tentative="1">
+      <w:start w:val="1"/>
+      <w:numFmt w:val="bullet"/>
+      <w:lvlText w:val=""/>
+      <w:lvlJc w:val="left"/>
+      <w:pPr>
+        <w:tabs>
+          <w:tab w:val="num" w:pos="5040"/>
+        </w:tabs>
+        <w:ind w:left="5040" w:hanging="360"/>
+      </w:pPr>
+      <w:rPr>
+        <w:rFonts w:ascii="Wingdings" w:hAnsi="Wingdings" w:hint="default"/>
+        <w:sz w:val="20"/>
+      </w:rPr>
+    </w:lvl>
+    <w:lvl w:ilvl="7" w:tentative="1">
+      <w:start w:val="1"/>
+      <w:numFmt w:val="bullet"/>
+      <w:lvlText w:val=""/>
+      <w:lvlJc w:val="left"/>
+      <w:pPr>
+        <w:tabs>
+          <w:tab w:val="num" w:pos="5760"/>
+        </w:tabs>
+        <w:ind w:left="5760" w:hanging="360"/>
+      </w:pPr>
+      <w:rPr>
+        <w:rFonts w:ascii="Wingdings" w:hAnsi="Wingdings" w:hint="default"/>
+        <w:sz w:val="20"/>
+      </w:rPr>
+    </w:lvl>
+    <w:lvl w:ilvl="8" w:tentative="1">
+      <w:start w:val="1"/>
+      <w:numFmt w:val="bullet"/>
+      <w:lvlText w:val=""/>
+      <w:lvlJc w:val="left"/>
+      <w:pPr>
+        <w:tabs>
+          <w:tab w:val="num" w:pos="6480"/>
+        </w:tabs>
+        <w:ind w:left="6480" w:hanging="360"/>
+      </w:pPr>
+      <w:rPr>
+        <w:rFonts w:ascii="Wingdings" w:hAnsi="Wingdings" w:hint="default"/>
+        <w:sz w:val="20"/>
+      </w:rPr>
+    </w:lvl>
+  </w:abstractNum>
+  <w:abstractNum w:abstractNumId="12" w15:restartNumberingAfterBreak="0">
+    <w:nsid w:val="796569AA"/>
+    <w:multiLevelType w:val="multilevel"/>
+    <w:tmpl w:val="CFA2006E"/>
+    <w:lvl w:ilvl="0">
+      <w:start w:val="1"/>
+      <w:numFmt w:val="bullet"/>
+      <w:lvlText w:val=""/>
+      <w:lvlJc w:val="left"/>
+      <w:pPr>
+        <w:tabs>
+          <w:tab w:val="num" w:pos="720"/>
+        </w:tabs>
+        <w:ind w:left="720" w:hanging="360"/>
+      </w:pPr>
+      <w:rPr>
+        <w:rFonts w:ascii="Symbol" w:hAnsi="Symbol" w:hint="default"/>
+        <w:sz w:val="20"/>
+      </w:rPr>
+    </w:lvl>
+    <w:lvl w:ilvl="1" w:tentative="1">
+      <w:start w:val="1"/>
+      <w:numFmt w:val="bullet"/>
+      <w:lvlText w:val="o"/>
+      <w:lvlJc w:val="left"/>
+      <w:pPr>
+        <w:tabs>
+          <w:tab w:val="num" w:pos="1440"/>
+        </w:tabs>
+        <w:ind w:left="1440" w:hanging="360"/>
+      </w:pPr>
+      <w:rPr>
+        <w:rFonts w:ascii="Courier New" w:hAnsi="Courier New" w:hint="default"/>
+        <w:sz w:val="20"/>
+      </w:rPr>
+    </w:lvl>
+    <w:lvl w:ilvl="2" w:tentative="1">
+      <w:start w:val="1"/>
+      <w:numFmt w:val="bullet"/>
+      <w:lvlText w:val=""/>
+      <w:lvlJc w:val="left"/>
+      <w:pPr>
+        <w:tabs>
+          <w:tab w:val="num" w:pos="2160"/>
+        </w:tabs>
+        <w:ind w:left="2160" w:hanging="360"/>
+      </w:pPr>
+      <w:rPr>
+        <w:rFonts w:ascii="Wingdings" w:hAnsi="Wingdings" w:hint="default"/>
+        <w:sz w:val="20"/>
+      </w:rPr>
+    </w:lvl>
+    <w:lvl w:ilvl="3" w:tentative="1">
+      <w:start w:val="1"/>
+      <w:numFmt w:val="bullet"/>
+      <w:lvlText w:val=""/>
+      <w:lvlJc w:val="left"/>
+      <w:pPr>
+        <w:tabs>
+          <w:tab w:val="num" w:pos="2880"/>
+        </w:tabs>
+        <w:ind w:left="2880" w:hanging="360"/>
+      </w:pPr>
+      <w:rPr>
+        <w:rFonts w:ascii="Wingdings" w:hAnsi="Wingdings" w:hint="default"/>
+        <w:sz w:val="20"/>
+      </w:rPr>
+    </w:lvl>
+    <w:lvl w:ilvl="4" w:tentative="1">
+      <w:start w:val="1"/>
+      <w:numFmt w:val="bullet"/>
+      <w:lvlText w:val=""/>
+      <w:lvlJc w:val="left"/>
+      <w:pPr>
+        <w:tabs>
+          <w:tab w:val="num" w:pos="3600"/>
+        </w:tabs>
+        <w:ind w:left="3600" w:hanging="360"/>
+      </w:pPr>
+      <w:rPr>
+        <w:rFonts w:ascii="Wingdings" w:hAnsi="Wingdings" w:hint="default"/>
+        <w:sz w:val="20"/>
+      </w:rPr>
+    </w:lvl>
+    <w:lvl w:ilvl="5" w:tentative="1">
+      <w:start w:val="1"/>
+      <w:numFmt w:val="bullet"/>
+      <w:lvlText w:val=""/>
+      <w:lvlJc w:val="left"/>
+      <w:pPr>
+        <w:tabs>
+          <w:tab w:val="num" w:pos="4320"/>
+        </w:tabs>
+        <w:ind w:left="4320" w:hanging="360"/>
+      </w:pPr>
+      <w:rPr>
+        <w:rFonts w:ascii="Wingdings" w:hAnsi="Wingdings" w:hint="default"/>
+        <w:sz w:val="20"/>
+      </w:rPr>
+    </w:lvl>
+    <w:lvl w:ilvl="6" w:tentative="1">
+      <w:start w:val="1"/>
+      <w:numFmt w:val="bullet"/>
+      <w:lvlText w:val=""/>
+      <w:lvlJc w:val="left"/>
+      <w:pPr>
+        <w:tabs>
+          <w:tab w:val="num" w:pos="5040"/>
+        </w:tabs>
+        <w:ind w:left="5040" w:hanging="360"/>
+      </w:pPr>
+      <w:rPr>
+        <w:rFonts w:ascii="Wingdings" w:hAnsi="Wingdings" w:hint="default"/>
+        <w:sz w:val="20"/>
+      </w:rPr>
+    </w:lvl>
+    <w:lvl w:ilvl="7" w:tentative="1">
+      <w:start w:val="1"/>
+      <w:numFmt w:val="bullet"/>
+      <w:lvlText w:val=""/>
+      <w:lvlJc w:val="left"/>
+      <w:pPr>
+        <w:tabs>
+          <w:tab w:val="num" w:pos="5760"/>
+        </w:tabs>
+        <w:ind w:left="5760" w:hanging="360"/>
+      </w:pPr>
+      <w:rPr>
+        <w:rFonts w:ascii="Wingdings" w:hAnsi="Wingdings" w:hint="default"/>
+        <w:sz w:val="20"/>
+      </w:rPr>
+    </w:lvl>
+    <w:lvl w:ilvl="8" w:tentative="1">
+      <w:start w:val="1"/>
+      <w:numFmt w:val="bullet"/>
+      <w:lvlText w:val=""/>
+      <w:lvlJc w:val="left"/>
+      <w:pPr>
+        <w:tabs>
+          <w:tab w:val="num" w:pos="6480"/>
+        </w:tabs>
+        <w:ind w:left="6480" w:hanging="360"/>
+      </w:pPr>
+      <w:rPr>
+        <w:rFonts w:ascii="Wingdings" w:hAnsi="Wingdings" w:hint="default"/>
+        <w:sz w:val="20"/>
+      </w:rPr>
+    </w:lvl>
+  </w:abstractNum>
+  <w:abstractNum w:abstractNumId="13" w15:restartNumberingAfterBreak="0">
+    <w:nsid w:val="7BE84AB2"/>
+    <w:multiLevelType w:val="multilevel"/>
+    <w:tmpl w:val="9056BADC"/>
+    <w:lvl w:ilvl="0">
+      <w:start w:val="1"/>
+      <w:numFmt w:val="bullet"/>
+      <w:lvlText w:val=""/>
+      <w:lvlJc w:val="left"/>
+      <w:pPr>
+        <w:tabs>
+          <w:tab w:val="num" w:pos="720"/>
+        </w:tabs>
+        <w:ind w:left="720" w:hanging="360"/>
+      </w:pPr>
+      <w:rPr>
+        <w:rFonts w:ascii="Symbol" w:hAnsi="Symbol" w:hint="default"/>
+        <w:sz w:val="20"/>
+      </w:rPr>
+    </w:lvl>
+    <w:lvl w:ilvl="1" w:tentative="1">
+      <w:start w:val="1"/>
+      <w:numFmt w:val="bullet"/>
+      <w:lvlText w:val="o"/>
+      <w:lvlJc w:val="left"/>
+      <w:pPr>
+        <w:tabs>
+          <w:tab w:val="num" w:pos="1440"/>
+        </w:tabs>
+        <w:ind w:left="1440" w:hanging="360"/>
+      </w:pPr>
+      <w:rPr>
+        <w:rFonts w:ascii="Courier New" w:hAnsi="Courier New" w:hint="default"/>
+        <w:sz w:val="20"/>
+      </w:rPr>
+    </w:lvl>
+    <w:lvl w:ilvl="2" w:tentative="1">
+      <w:start w:val="1"/>
+      <w:numFmt w:val="bullet"/>
+      <w:lvlText w:val=""/>
+      <w:lvlJc w:val="left"/>
+      <w:pPr>
+        <w:tabs>
+          <w:tab w:val="num" w:pos="2160"/>
+        </w:tabs>
+        <w:ind w:left="2160" w:hanging="360"/>
+      </w:pPr>
+      <w:rPr>
+        <w:rFonts w:ascii="Wingdings" w:hAnsi="Wingdings" w:hint="default"/>
+        <w:sz w:val="20"/>
+      </w:rPr>
+    </w:lvl>
+    <w:lvl w:ilvl="3" w:tentative="1">
+      <w:start w:val="1"/>
+      <w:numFmt w:val="bullet"/>
+      <w:lvlText w:val=""/>
+      <w:lvlJc w:val="left"/>
+      <w:pPr>
+        <w:tabs>
+          <w:tab w:val="num" w:pos="2880"/>
+        </w:tabs>
+        <w:ind w:left="2880" w:hanging="360"/>
+      </w:pPr>
+      <w:rPr>
+        <w:rFonts w:ascii="Wingdings" w:hAnsi="Wingdings" w:hint="default"/>
+        <w:sz w:val="20"/>
+      </w:rPr>
+    </w:lvl>
+    <w:lvl w:ilvl="4" w:tentative="1">
+      <w:start w:val="1"/>
+      <w:numFmt w:val="bullet"/>
+      <w:lvlText w:val=""/>
+      <w:lvlJc w:val="left"/>
+      <w:pPr>
+        <w:tabs>
+          <w:tab w:val="num" w:pos="3600"/>
+        </w:tabs>
+        <w:ind w:left="3600" w:hanging="360"/>
+      </w:pPr>
+      <w:rPr>
+        <w:rFonts w:ascii="Wingdings" w:hAnsi="Wingdings" w:hint="default"/>
+        <w:sz w:val="20"/>
+      </w:rPr>
+    </w:lvl>
+    <w:lvl w:ilvl="5" w:tentative="1">
+      <w:start w:val="1"/>
+      <w:numFmt w:val="bullet"/>
+      <w:lvlText w:val=""/>
+      <w:lvlJc w:val="left"/>
+      <w:pPr>
+        <w:tabs>
+          <w:tab w:val="num" w:pos="4320"/>
+        </w:tabs>
+        <w:ind w:left="4320" w:hanging="360"/>
+      </w:pPr>
+      <w:rPr>
+        <w:rFonts w:ascii="Wingdings" w:hAnsi="Wingdings" w:hint="default"/>
+        <w:sz w:val="20"/>
+      </w:rPr>
+    </w:lvl>
+    <w:lvl w:ilvl="6" w:tentative="1">
+      <w:start w:val="1"/>
+      <w:numFmt w:val="bullet"/>
+      <w:lvlText w:val=""/>
+      <w:lvlJc w:val="left"/>
+      <w:pPr>
+        <w:tabs>
+          <w:tab w:val="num" w:pos="5040"/>
+        </w:tabs>
+        <w:ind w:left="5040" w:hanging="360"/>
+      </w:pPr>
+      <w:rPr>
+        <w:rFonts w:ascii="Wingdings" w:hAnsi="Wingdings" w:hint="default"/>
+        <w:sz w:val="20"/>
+      </w:rPr>
+    </w:lvl>
+    <w:lvl w:ilvl="7" w:tentative="1">
+      <w:start w:val="1"/>
+      <w:numFmt w:val="bullet"/>
+      <w:lvlText w:val=""/>
+      <w:lvlJc w:val="left"/>
+      <w:pPr>
+        <w:tabs>
+          <w:tab w:val="num" w:pos="5760"/>
+        </w:tabs>
+        <w:ind w:left="5760" w:hanging="360"/>
+      </w:pPr>
+      <w:rPr>
+        <w:rFonts w:ascii="Wingdings" w:hAnsi="Wingdings" w:hint="default"/>
+        <w:sz w:val="20"/>
+      </w:rPr>
+    </w:lvl>
+    <w:lvl w:ilvl="8" w:tentative="1">
+      <w:start w:val="1"/>
+      <w:numFmt w:val="bullet"/>
+      <w:lvlText w:val=""/>
+      <w:lvlJc w:val="left"/>
+      <w:pPr>
+        <w:tabs>
+          <w:tab w:val="num" w:pos="6480"/>
+        </w:tabs>
+        <w:ind w:left="6480" w:hanging="360"/>
+      </w:pPr>
+      <w:rPr>
+        <w:rFonts w:ascii="Wingdings" w:hAnsi="Wingdings" w:hint="default"/>
+        <w:sz w:val="20"/>
+      </w:rPr>
+    </w:lvl>
+  </w:abstractNum>
+  <w:abstractNum w:abstractNumId="14" w15:restartNumberingAfterBreak="0">
+    <w:nsid w:val="7D5C792D"/>
+    <w:multiLevelType w:val="multilevel"/>
+    <w:tmpl w:val="FF3C5A52"/>
+    <w:lvl w:ilvl="0">
+      <w:start w:val="1"/>
+      <w:numFmt w:val="bullet"/>
+      <w:lvlText w:val=""/>
+      <w:lvlJc w:val="left"/>
+      <w:pPr>
+        <w:tabs>
+          <w:tab w:val="num" w:pos="720"/>
+        </w:tabs>
+        <w:ind w:left="720" w:hanging="360"/>
+      </w:pPr>
+      <w:rPr>
+        <w:rFonts w:ascii="Symbol" w:hAnsi="Symbol" w:hint="default"/>
+        <w:sz w:val="20"/>
+      </w:rPr>
+    </w:lvl>
+    <w:lvl w:ilvl="1" w:tentative="1">
+      <w:start w:val="1"/>
+      <w:numFmt w:val="bullet"/>
+      <w:lvlText w:val="o"/>
+      <w:lvlJc w:val="left"/>
+      <w:pPr>
+        <w:tabs>
+          <w:tab w:val="num" w:pos="1440"/>
+        </w:tabs>
+        <w:ind w:left="1440" w:hanging="360"/>
+      </w:pPr>
+      <w:rPr>
+        <w:rFonts w:ascii="Courier New" w:hAnsi="Courier New" w:hint="default"/>
+        <w:sz w:val="20"/>
+      </w:rPr>
+    </w:lvl>
+    <w:lvl w:ilvl="2" w:tentative="1">
+      <w:start w:val="1"/>
+      <w:numFmt w:val="bullet"/>
+      <w:lvlText w:val=""/>
+      <w:lvlJc w:val="left"/>
+      <w:pPr>
+        <w:tabs>
+          <w:tab w:val="num" w:pos="2160"/>
+        </w:tabs>
+        <w:ind w:left="2160" w:hanging="360"/>
+      </w:pPr>
+      <w:rPr>
+        <w:rFonts w:ascii="Wingdings" w:hAnsi="Wingdings" w:hint="default"/>
+        <w:sz w:val="20"/>
+      </w:rPr>
+    </w:lvl>
+    <w:lvl w:ilvl="3" w:tentative="1">
+      <w:start w:val="1"/>
+      <w:numFmt w:val="bullet"/>
+      <w:lvlText w:val=""/>
+      <w:lvlJc w:val="left"/>
+      <w:pPr>
+        <w:tabs>
+          <w:tab w:val="num" w:pos="2880"/>
+        </w:tabs>
+        <w:ind w:left="2880" w:hanging="360"/>
+      </w:pPr>
+      <w:rPr>
+        <w:rFonts w:ascii="Wingdings" w:hAnsi="Wingdings" w:hint="default"/>
+        <w:sz w:val="20"/>
+      </w:rPr>
+    </w:lvl>
+    <w:lvl w:ilvl="4" w:tentative="1">
+      <w:start w:val="1"/>
+      <w:numFmt w:val="bullet"/>
+      <w:lvlText w:val=""/>
+      <w:lvlJc w:val="left"/>
+      <w:pPr>
+        <w:tabs>
+          <w:tab w:val="num" w:pos="3600"/>
+        </w:tabs>
+        <w:ind w:left="3600" w:hanging="360"/>
+      </w:pPr>
+      <w:rPr>
+        <w:rFonts w:ascii="Wingdings" w:hAnsi="Wingdings" w:hint="default"/>
+        <w:sz w:val="20"/>
+      </w:rPr>
+    </w:lvl>
+    <w:lvl w:ilvl="5" w:tentative="1">
+      <w:start w:val="1"/>
+      <w:numFmt w:val="bullet"/>
+      <w:lvlText w:val=""/>
+      <w:lvlJc w:val="left"/>
+      <w:pPr>
+        <w:tabs>
+          <w:tab w:val="num" w:pos="4320"/>
+        </w:tabs>
+        <w:ind w:left="4320" w:hanging="360"/>
+      </w:pPr>
+      <w:rPr>
+        <w:rFonts w:ascii="Wingdings" w:hAnsi="Wingdings" w:hint="default"/>
+        <w:sz w:val="20"/>
+      </w:rPr>
+    </w:lvl>
+    <w:lvl w:ilvl="6" w:tentative="1">
+      <w:start w:val="1"/>
+      <w:numFmt w:val="bullet"/>
+      <w:lvlText w:val=""/>
+      <w:lvlJc w:val="left"/>
+      <w:pPr>
+        <w:tabs>
+          <w:tab w:val="num" w:pos="5040"/>
+        </w:tabs>
+        <w:ind w:left="5040" w:hanging="360"/>
+      </w:pPr>
+      <w:rPr>
+        <w:rFonts w:ascii="Wingdings" w:hAnsi="Wingdings" w:hint="default"/>
+        <w:sz w:val="20"/>
+      </w:rPr>
+    </w:lvl>
+    <w:lvl w:ilvl="7" w:tentative="1">
+      <w:start w:val="1"/>
+      <w:numFmt w:val="bullet"/>
+      <w:lvlText w:val=""/>
+      <w:lvlJc w:val="left"/>
+      <w:pPr>
+        <w:tabs>
+          <w:tab w:val="num" w:pos="5760"/>
+        </w:tabs>
+        <w:ind w:left="5760" w:hanging="360"/>
+      </w:pPr>
+      <w:rPr>
+        <w:rFonts w:ascii="Wingdings" w:hAnsi="Wingdings" w:hint="default"/>
+        <w:sz w:val="20"/>
+      </w:rPr>
+    </w:lvl>
+    <w:lvl w:ilvl="8" w:tentative="1">
+      <w:start w:val="1"/>
+      <w:numFmt w:val="bullet"/>
+      <w:lvlText w:val=""/>
+      <w:lvlJc w:val="left"/>
+      <w:pPr>
+        <w:tabs>
+          <w:tab w:val="num" w:pos="6480"/>
+        </w:tabs>
+        <w:ind w:left="6480" w:hanging="360"/>
+      </w:pPr>
+      <w:rPr>
+        <w:rFonts w:ascii="Wingdings" w:hAnsi="Wingdings" w:hint="default"/>
+        <w:sz w:val="20"/>
+      </w:rPr>
+    </w:lvl>
+  </w:abstractNum>
+  <w:abstractNum w:abstractNumId="15" w15:restartNumberingAfterBreak="0">
     <w:nsid w:val="7E142B6E"/>
     <w:multiLevelType w:val="multilevel"/>
     <w:tmpl w:val="C8FAB37E"/>
@@ -5653,31 +8461,52 @@
     </w:lvl>
   </w:abstractNum>
   <w:num w:numId="1" w16cid:durableId="477040820">
-    <w:abstractNumId w:val="1"/>
+    <w:abstractNumId w:val="2"/>
   </w:num>
   <w:num w:numId="2" w16cid:durableId="1474448373">
-    <w:abstractNumId w:val="7"/>
+    <w:abstractNumId w:val="10"/>
   </w:num>
   <w:num w:numId="3" w16cid:durableId="916401406">
+    <w:abstractNumId w:val="4"/>
+  </w:num>
+  <w:num w:numId="4" w16cid:durableId="1627390881">
     <w:abstractNumId w:val="3"/>
   </w:num>
-  <w:num w:numId="4" w16cid:durableId="1627390881">
-    <w:abstractNumId w:val="2"/>
-  </w:num>
   <w:num w:numId="5" w16cid:durableId="566914713">
-    <w:abstractNumId w:val="4"/>
+    <w:abstractNumId w:val="6"/>
   </w:num>
   <w:num w:numId="6" w16cid:durableId="1284193791">
-    <w:abstractNumId w:val="8"/>
+    <w:abstractNumId w:val="15"/>
   </w:num>
   <w:num w:numId="7" w16cid:durableId="657420732">
-    <w:abstractNumId w:val="5"/>
+    <w:abstractNumId w:val="8"/>
   </w:num>
   <w:num w:numId="8" w16cid:durableId="1311246361">
     <w:abstractNumId w:val="0"/>
   </w:num>
   <w:num w:numId="9" w16cid:durableId="850484044">
-    <w:abstractNumId w:val="6"/>
+    <w:abstractNumId w:val="9"/>
+  </w:num>
+  <w:num w:numId="10" w16cid:durableId="1021593613">
+    <w:abstractNumId w:val="1"/>
+  </w:num>
+  <w:num w:numId="11" w16cid:durableId="653877594">
+    <w:abstractNumId w:val="14"/>
+  </w:num>
+  <w:num w:numId="12" w16cid:durableId="376928250">
+    <w:abstractNumId w:val="13"/>
+  </w:num>
+  <w:num w:numId="13" w16cid:durableId="1834489768">
+    <w:abstractNumId w:val="12"/>
+  </w:num>
+  <w:num w:numId="14" w16cid:durableId="1837111135">
+    <w:abstractNumId w:val="5"/>
+  </w:num>
+  <w:num w:numId="15" w16cid:durableId="1733113555">
+    <w:abstractNumId w:val="7"/>
+  </w:num>
+  <w:num w:numId="16" w16cid:durableId="1721199800">
+    <w:abstractNumId w:val="11"/>
   </w:num>
 </w:numbering>
 </file>

</xml_diff>

<commit_message>
feat: implementa ABM completo en memoria con selección desde GridView - Configuración de la propiedad DataKeyNames y CommandField en la grilla para la selección segura de registros. - Implementación del evento OnSelectedIndexChanged para capturar el ID y enviarlo vía QueryString. - Refactorización de AgregarCurso.aspx para operar en modo dual (Alta o Edición/Baja) según los parámetros de la URL. - Uso de expresiones Lambda (Find) para la búsqueda eficiente de objetos en la lista temporal. - Gestión dinámica de la visibilidad de los botones de acción (Agregar, Modificar, Eliminar) según el contexto. - Desarrollo de la lógica de actualización por referencia y eliminación mediante el método Remove() de la colección List<T>.
</commit_message>
<xml_diff>
--- a/Unidad 4 - Eventos/DOCUMENTACIÓN TÉCNICA DE EVENTOS.docx
+++ b/Unidad 4 - Eventos/DOCUMENTACIÓN TÉCNICA DE EVENTOS.docx
@@ -5924,7 +5924,7 @@
           <w:szCs w:val="32"/>
         </w:rPr>
         <w:pict w14:anchorId="3DE6DA94">
-          <v:rect id="_x0000_i1034" style="width:0;height:1.5pt" o:hralign="center" o:hrstd="t" o:hr="t" fillcolor="#a0a0a0" stroked="f"/>
+          <v:rect id="_x0000_i1028" style="width:0;height:1.5pt" o:hralign="center" o:hrstd="t" o:hr="t" fillcolor="#a0a0a0" stroked="f"/>
         </w:pict>
       </w:r>
     </w:p>
@@ -6069,6 +6069,1074 @@
         </w:rPr>
         <w:t>, basta con obtener su referencia, modificarlo y el cambio persistirá sin pasos extra.</w:t>
       </w:r>
+    </w:p>
+    <w:p>
+      <w:pPr>
+        <w:tabs>
+          <w:tab w:val="left" w:pos="2323"/>
+        </w:tabs>
+        <w:rPr>
+          <w:sz w:val="32"/>
+          <w:szCs w:val="32"/>
+        </w:rPr>
+      </w:pPr>
+      <w:r>
+        <w:rPr>
+          <w:b/>
+          <w:bCs/>
+          <w:sz w:val="32"/>
+          <w:szCs w:val="32"/>
+        </w:rPr>
+        <w:t xml:space="preserve">TEMA: Selección de Registros y </w:t>
+      </w:r>
+      <w:proofErr w:type="spellStart"/>
+      <w:r>
+        <w:rPr>
+          <w:b/>
+          <w:bCs/>
+          <w:sz w:val="32"/>
+          <w:szCs w:val="32"/>
+        </w:rPr>
+        <w:t>DataKeyNames</w:t>
+      </w:r>
+      <w:proofErr w:type="spellEnd"/>
+    </w:p>
+    <w:p>
+      <w:pPr>
+        <w:tabs>
+          <w:tab w:val="left" w:pos="2323"/>
+        </w:tabs>
+        <w:rPr>
+          <w:sz w:val="32"/>
+          <w:szCs w:val="32"/>
+        </w:rPr>
+      </w:pPr>
+      <w:r>
+        <w:rPr>
+          <w:b/>
+          <w:bCs/>
+          <w:sz w:val="32"/>
+          <w:szCs w:val="32"/>
+        </w:rPr>
+        <w:t xml:space="preserve">1. </w:t>
+      </w:r>
+      <w:proofErr w:type="spellStart"/>
+      <w:r>
+        <w:rPr>
+          <w:b/>
+          <w:bCs/>
+          <w:sz w:val="32"/>
+          <w:szCs w:val="32"/>
+        </w:rPr>
+        <w:t>CommandField</w:t>
+      </w:r>
+      <w:proofErr w:type="spellEnd"/>
+      <w:r>
+        <w:rPr>
+          <w:b/>
+          <w:bCs/>
+          <w:sz w:val="32"/>
+          <w:szCs w:val="32"/>
+        </w:rPr>
+        <w:t xml:space="preserve"> y Selección:</w:t>
+      </w:r>
+      <w:r>
+        <w:rPr>
+          <w:sz w:val="32"/>
+          <w:szCs w:val="32"/>
+        </w:rPr>
+        <w:t xml:space="preserve"> Es un tipo de columna especial que genera botones de comando automáticos (Seleccionar, Editar, Eliminar</w:t>
+      </w:r>
+      <w:proofErr w:type="gramStart"/>
+      <w:r>
+        <w:rPr>
+          <w:sz w:val="32"/>
+          <w:szCs w:val="32"/>
+        </w:rPr>
+        <w:t>) .</w:t>
+      </w:r>
+      <w:proofErr w:type="gramEnd"/>
+      <w:r>
+        <w:rPr>
+          <w:sz w:val="32"/>
+          <w:szCs w:val="32"/>
+        </w:rPr>
+        <w:t xml:space="preserve"> El botón "</w:t>
+      </w:r>
+      <w:proofErr w:type="spellStart"/>
+      <w:r>
+        <w:rPr>
+          <w:sz w:val="32"/>
+          <w:szCs w:val="32"/>
+        </w:rPr>
+        <w:t>Select</w:t>
+      </w:r>
+      <w:proofErr w:type="spellEnd"/>
+      <w:r>
+        <w:rPr>
+          <w:sz w:val="32"/>
+          <w:szCs w:val="32"/>
+        </w:rPr>
+        <w:t xml:space="preserve">" dispara el evento </w:t>
+      </w:r>
+      <w:proofErr w:type="spellStart"/>
+      <w:r>
+        <w:rPr>
+          <w:sz w:val="32"/>
+          <w:szCs w:val="32"/>
+        </w:rPr>
+        <w:t>OnSelectedIndexChanged</w:t>
+      </w:r>
+      <w:proofErr w:type="spellEnd"/>
+      <w:r>
+        <w:rPr>
+          <w:sz w:val="32"/>
+          <w:szCs w:val="32"/>
+        </w:rPr>
+        <w:t xml:space="preserve"> en el </w:t>
+      </w:r>
+      <w:proofErr w:type="gramStart"/>
+      <w:r>
+        <w:rPr>
+          <w:sz w:val="32"/>
+          <w:szCs w:val="32"/>
+        </w:rPr>
+        <w:t>servidor .</w:t>
+      </w:r>
+      <w:proofErr w:type="gramEnd"/>
+    </w:p>
+    <w:p>
+      <w:pPr>
+        <w:tabs>
+          <w:tab w:val="left" w:pos="2323"/>
+        </w:tabs>
+        <w:rPr>
+          <w:sz w:val="32"/>
+          <w:szCs w:val="32"/>
+        </w:rPr>
+      </w:pPr>
+      <w:r>
+        <w:rPr>
+          <w:b/>
+          <w:bCs/>
+          <w:sz w:val="32"/>
+          <w:szCs w:val="32"/>
+        </w:rPr>
+        <w:t xml:space="preserve">2. Propiedad </w:t>
+      </w:r>
+      <w:proofErr w:type="spellStart"/>
+      <w:r>
+        <w:rPr>
+          <w:b/>
+          <w:bCs/>
+          <w:sz w:val="32"/>
+          <w:szCs w:val="32"/>
+        </w:rPr>
+        <w:t>DataKeyNames</w:t>
+      </w:r>
+      <w:proofErr w:type="spellEnd"/>
+      <w:r>
+        <w:rPr>
+          <w:b/>
+          <w:bCs/>
+          <w:sz w:val="32"/>
+          <w:szCs w:val="32"/>
+        </w:rPr>
+        <w:t>:</w:t>
+      </w:r>
+    </w:p>
+    <w:p>
+      <w:pPr>
+        <w:numPr>
+          <w:ilvl w:val="0"/>
+          <w:numId w:val="17"/>
+        </w:numPr>
+        <w:tabs>
+          <w:tab w:val="left" w:pos="2323"/>
+        </w:tabs>
+        <w:rPr>
+          <w:sz w:val="32"/>
+          <w:szCs w:val="32"/>
+        </w:rPr>
+      </w:pPr>
+      <w:r>
+        <w:rPr>
+          <w:b/>
+          <w:bCs/>
+          <w:sz w:val="32"/>
+          <w:szCs w:val="32"/>
+        </w:rPr>
+        <w:t>Definición:</w:t>
+      </w:r>
+      <w:r>
+        <w:rPr>
+          <w:sz w:val="32"/>
+          <w:szCs w:val="32"/>
+        </w:rPr>
+        <w:t xml:space="preserve"> Es una colección de nombres de campos que actúan como la clave primaria del origen de </w:t>
+      </w:r>
+      <w:proofErr w:type="gramStart"/>
+      <w:r>
+        <w:rPr>
+          <w:sz w:val="32"/>
+          <w:szCs w:val="32"/>
+        </w:rPr>
+        <w:t>datos .</w:t>
+      </w:r>
+      <w:proofErr w:type="gramEnd"/>
+    </w:p>
+    <w:p>
+      <w:pPr>
+        <w:numPr>
+          <w:ilvl w:val="0"/>
+          <w:numId w:val="17"/>
+        </w:numPr>
+        <w:tabs>
+          <w:tab w:val="left" w:pos="2323"/>
+        </w:tabs>
+        <w:rPr>
+          <w:sz w:val="32"/>
+          <w:szCs w:val="32"/>
+        </w:rPr>
+      </w:pPr>
+      <w:r>
+        <w:rPr>
+          <w:b/>
+          <w:bCs/>
+          <w:sz w:val="32"/>
+          <w:szCs w:val="32"/>
+        </w:rPr>
+        <w:t>Ventaja técnica:</w:t>
+      </w:r>
+      <w:r>
+        <w:rPr>
+          <w:sz w:val="32"/>
+          <w:szCs w:val="32"/>
+        </w:rPr>
+        <w:t xml:space="preserve"> Permite al desarrollador acceder al valor del ID seleccionado de forma segura y directa, incluso si esa columna no es visible para el usuario en la interfaz </w:t>
+      </w:r>
+      <w:proofErr w:type="gramStart"/>
+      <w:r>
+        <w:rPr>
+          <w:sz w:val="32"/>
+          <w:szCs w:val="32"/>
+        </w:rPr>
+        <w:t>HTML .</w:t>
+      </w:r>
+      <w:proofErr w:type="gramEnd"/>
+      <w:r>
+        <w:rPr>
+          <w:sz w:val="32"/>
+          <w:szCs w:val="32"/>
+        </w:rPr>
+        <w:t xml:space="preserve"> Esto evita tener que ocultar columnas mediante CSS (</w:t>
+      </w:r>
+      <w:proofErr w:type="spellStart"/>
+      <w:r>
+        <w:rPr>
+          <w:sz w:val="32"/>
+          <w:szCs w:val="32"/>
+        </w:rPr>
+        <w:t>display</w:t>
+      </w:r>
+      <w:proofErr w:type="spellEnd"/>
+      <w:r>
+        <w:rPr>
+          <w:sz w:val="32"/>
+          <w:szCs w:val="32"/>
+        </w:rPr>
+        <w:t xml:space="preserve">: </w:t>
+      </w:r>
+      <w:proofErr w:type="spellStart"/>
+      <w:r>
+        <w:rPr>
+          <w:sz w:val="32"/>
+          <w:szCs w:val="32"/>
+        </w:rPr>
+        <w:t>none</w:t>
+      </w:r>
+      <w:proofErr w:type="spellEnd"/>
+      <w:proofErr w:type="gramStart"/>
+      <w:r>
+        <w:rPr>
+          <w:sz w:val="32"/>
+          <w:szCs w:val="32"/>
+        </w:rPr>
+        <w:t>) .</w:t>
+      </w:r>
+      <w:proofErr w:type="gramEnd"/>
+    </w:p>
+    <w:p>
+      <w:pPr>
+        <w:tabs>
+          <w:tab w:val="left" w:pos="2323"/>
+        </w:tabs>
+        <w:rPr>
+          <w:sz w:val="32"/>
+          <w:szCs w:val="32"/>
+        </w:rPr>
+      </w:pPr>
+      <w:r>
+        <w:rPr>
+          <w:b/>
+          <w:bCs/>
+          <w:sz w:val="32"/>
+          <w:szCs w:val="32"/>
+        </w:rPr>
+        <w:t>3. Obtención del valor seleccionado:</w:t>
+      </w:r>
+      <w:r>
+        <w:rPr>
+          <w:sz w:val="32"/>
+          <w:szCs w:val="32"/>
+        </w:rPr>
+        <w:t xml:space="preserve"> Se utiliza la propiedad </w:t>
+      </w:r>
+      <w:proofErr w:type="spellStart"/>
+      <w:r>
+        <w:rPr>
+          <w:sz w:val="32"/>
+          <w:szCs w:val="32"/>
+        </w:rPr>
+        <w:t>SelectedDataKey.Value</w:t>
+      </w:r>
+      <w:proofErr w:type="spellEnd"/>
+      <w:r>
+        <w:rPr>
+          <w:sz w:val="32"/>
+          <w:szCs w:val="32"/>
+        </w:rPr>
+        <w:t xml:space="preserve"> del objeto </w:t>
+      </w:r>
+      <w:proofErr w:type="spellStart"/>
+      <w:proofErr w:type="gramStart"/>
+      <w:r>
+        <w:rPr>
+          <w:sz w:val="32"/>
+          <w:szCs w:val="32"/>
+        </w:rPr>
+        <w:t>GridView</w:t>
+      </w:r>
+      <w:proofErr w:type="spellEnd"/>
+      <w:r>
+        <w:rPr>
+          <w:sz w:val="32"/>
+          <w:szCs w:val="32"/>
+        </w:rPr>
+        <w:t xml:space="preserve"> .</w:t>
+      </w:r>
+      <w:proofErr w:type="gramEnd"/>
+      <w:r>
+        <w:rPr>
+          <w:sz w:val="32"/>
+          <w:szCs w:val="32"/>
+        </w:rPr>
+        <w:t xml:space="preserve"> Este valor es el que comúnmente se envía a otra página mediante </w:t>
+      </w:r>
+      <w:proofErr w:type="spellStart"/>
+      <w:r>
+        <w:rPr>
+          <w:sz w:val="32"/>
+          <w:szCs w:val="32"/>
+        </w:rPr>
+        <w:t>Response.Redirect</w:t>
+      </w:r>
+      <w:proofErr w:type="spellEnd"/>
+      <w:r>
+        <w:rPr>
+          <w:sz w:val="32"/>
+          <w:szCs w:val="32"/>
+        </w:rPr>
+        <w:t xml:space="preserve"> con un parámetro en la URL (</w:t>
+      </w:r>
+      <w:proofErr w:type="spellStart"/>
+      <w:r>
+        <w:rPr>
+          <w:sz w:val="32"/>
+          <w:szCs w:val="32"/>
+        </w:rPr>
+        <w:t>QueryString</w:t>
+      </w:r>
+      <w:proofErr w:type="spellEnd"/>
+      <w:r>
+        <w:rPr>
+          <w:sz w:val="32"/>
+          <w:szCs w:val="32"/>
+        </w:rPr>
+        <w:t xml:space="preserve">) para realizar operaciones de edición o </w:t>
+      </w:r>
+      <w:proofErr w:type="gramStart"/>
+      <w:r>
+        <w:rPr>
+          <w:sz w:val="32"/>
+          <w:szCs w:val="32"/>
+        </w:rPr>
+        <w:t>borrado .</w:t>
+      </w:r>
+      <w:proofErr w:type="gramEnd"/>
+    </w:p>
+    <w:p>
+      <w:pPr>
+        <w:tabs>
+          <w:tab w:val="left" w:pos="2323"/>
+        </w:tabs>
+        <w:rPr>
+          <w:sz w:val="32"/>
+          <w:szCs w:val="32"/>
+          <w:u w:val="single"/>
+        </w:rPr>
+      </w:pPr>
+      <w:r>
+        <w:rPr>
+          <w:b/>
+          <w:bCs/>
+          <w:sz w:val="32"/>
+          <w:szCs w:val="32"/>
+          <w:u w:val="single"/>
+        </w:rPr>
+        <w:t xml:space="preserve">TEMA: </w:t>
+      </w:r>
+      <w:proofErr w:type="spellStart"/>
+      <w:r>
+        <w:rPr>
+          <w:b/>
+          <w:bCs/>
+          <w:sz w:val="32"/>
+          <w:szCs w:val="32"/>
+          <w:u w:val="single"/>
+        </w:rPr>
+        <w:t>DataKeyNames</w:t>
+      </w:r>
+      <w:proofErr w:type="spellEnd"/>
+      <w:r>
+        <w:rPr>
+          <w:b/>
+          <w:bCs/>
+          <w:sz w:val="32"/>
+          <w:szCs w:val="32"/>
+          <w:u w:val="single"/>
+        </w:rPr>
+        <w:t xml:space="preserve"> vs. Columnas Ocultas</w:t>
+      </w:r>
+    </w:p>
+    <w:p>
+      <w:pPr>
+        <w:numPr>
+          <w:ilvl w:val="0"/>
+          <w:numId w:val="18"/>
+        </w:numPr>
+        <w:tabs>
+          <w:tab w:val="left" w:pos="2323"/>
+        </w:tabs>
+        <w:rPr>
+          <w:sz w:val="32"/>
+          <w:szCs w:val="32"/>
+        </w:rPr>
+      </w:pPr>
+      <w:r>
+        <w:rPr>
+          <w:b/>
+          <w:bCs/>
+          <w:sz w:val="32"/>
+          <w:szCs w:val="32"/>
+        </w:rPr>
+        <w:t>Ocultar con CSS (</w:t>
+      </w:r>
+      <w:proofErr w:type="spellStart"/>
+      <w:r>
+        <w:rPr>
+          <w:b/>
+          <w:bCs/>
+          <w:sz w:val="32"/>
+          <w:szCs w:val="32"/>
+        </w:rPr>
+        <w:t>display</w:t>
+      </w:r>
+      <w:proofErr w:type="spellEnd"/>
+      <w:r>
+        <w:rPr>
+          <w:b/>
+          <w:bCs/>
+          <w:sz w:val="32"/>
+          <w:szCs w:val="32"/>
+        </w:rPr>
+        <w:t xml:space="preserve">: </w:t>
+      </w:r>
+      <w:proofErr w:type="spellStart"/>
+      <w:r>
+        <w:rPr>
+          <w:b/>
+          <w:bCs/>
+          <w:sz w:val="32"/>
+          <w:szCs w:val="32"/>
+        </w:rPr>
+        <w:t>none</w:t>
+      </w:r>
+      <w:proofErr w:type="spellEnd"/>
+      <w:r>
+        <w:rPr>
+          <w:b/>
+          <w:bCs/>
+          <w:sz w:val="32"/>
+          <w:szCs w:val="32"/>
+        </w:rPr>
+        <w:t>):</w:t>
+      </w:r>
+      <w:r>
+        <w:rPr>
+          <w:sz w:val="32"/>
+          <w:szCs w:val="32"/>
+        </w:rPr>
+        <w:t xml:space="preserve"> Renderiza el dato en el HTML y lo oculta visualmente. Es inseguro porque un usuario avanzado puede ver el dato inspeccionando el código fuente de la </w:t>
+      </w:r>
+      <w:proofErr w:type="gramStart"/>
+      <w:r>
+        <w:rPr>
+          <w:sz w:val="32"/>
+          <w:szCs w:val="32"/>
+        </w:rPr>
+        <w:t>página .</w:t>
+      </w:r>
+      <w:proofErr w:type="gramEnd"/>
+    </w:p>
+    <w:p>
+      <w:pPr>
+        <w:numPr>
+          <w:ilvl w:val="0"/>
+          <w:numId w:val="18"/>
+        </w:numPr>
+        <w:tabs>
+          <w:tab w:val="left" w:pos="2323"/>
+        </w:tabs>
+        <w:rPr>
+          <w:sz w:val="32"/>
+          <w:szCs w:val="32"/>
+        </w:rPr>
+      </w:pPr>
+      <w:r>
+        <w:rPr>
+          <w:b/>
+          <w:bCs/>
+          <w:sz w:val="32"/>
+          <w:szCs w:val="32"/>
+        </w:rPr>
+        <w:t xml:space="preserve">Propiedad </w:t>
+      </w:r>
+      <w:proofErr w:type="spellStart"/>
+      <w:r>
+        <w:rPr>
+          <w:b/>
+          <w:bCs/>
+          <w:sz w:val="32"/>
+          <w:szCs w:val="32"/>
+        </w:rPr>
+        <w:t>DataKeyNames</w:t>
+      </w:r>
+      <w:proofErr w:type="spellEnd"/>
+      <w:r>
+        <w:rPr>
+          <w:b/>
+          <w:bCs/>
+          <w:sz w:val="32"/>
+          <w:szCs w:val="32"/>
+        </w:rPr>
+        <w:t>:</w:t>
+      </w:r>
+      <w:r>
+        <w:rPr>
+          <w:sz w:val="32"/>
+          <w:szCs w:val="32"/>
+        </w:rPr>
+        <w:t xml:space="preserve"> Es la forma nativa y segura de ASP.NET. Almacena las claves primarias (como el ID) en el estado del control en el servidor (</w:t>
+      </w:r>
+      <w:proofErr w:type="spellStart"/>
+      <w:r>
+        <w:rPr>
+          <w:sz w:val="32"/>
+          <w:szCs w:val="32"/>
+        </w:rPr>
+        <w:t>ViewState</w:t>
+      </w:r>
+      <w:proofErr w:type="spellEnd"/>
+      <w:r>
+        <w:rPr>
+          <w:sz w:val="32"/>
+          <w:szCs w:val="32"/>
+        </w:rPr>
+        <w:t xml:space="preserve">), permitiendo interactuar con los registros sin necesidad de exponer información sensible en el HTML del </w:t>
+      </w:r>
+      <w:proofErr w:type="gramStart"/>
+      <w:r>
+        <w:rPr>
+          <w:sz w:val="32"/>
+          <w:szCs w:val="32"/>
+        </w:rPr>
+        <w:t>cliente .</w:t>
+      </w:r>
+      <w:proofErr w:type="gramEnd"/>
+    </w:p>
+    <w:p>
+      <w:pPr>
+        <w:tabs>
+          <w:tab w:val="left" w:pos="2323"/>
+        </w:tabs>
+        <w:rPr>
+          <w:sz w:val="32"/>
+          <w:szCs w:val="32"/>
+        </w:rPr>
+      </w:pPr>
+    </w:p>
+    <w:p>
+      <w:pPr>
+        <w:tabs>
+          <w:tab w:val="left" w:pos="2323"/>
+        </w:tabs>
+        <w:rPr>
+          <w:sz w:val="32"/>
+          <w:szCs w:val="32"/>
+        </w:rPr>
+      </w:pPr>
+    </w:p>
+    <w:p>
+      <w:pPr>
+        <w:tabs>
+          <w:tab w:val="left" w:pos="2323"/>
+        </w:tabs>
+        <w:rPr>
+          <w:sz w:val="32"/>
+          <w:szCs w:val="32"/>
+        </w:rPr>
+      </w:pPr>
+    </w:p>
+    <w:p>
+      <w:pPr>
+        <w:tabs>
+          <w:tab w:val="left" w:pos="2323"/>
+        </w:tabs>
+        <w:rPr>
+          <w:sz w:val="32"/>
+          <w:szCs w:val="32"/>
+        </w:rPr>
+      </w:pPr>
+      <w:r>
+        <w:rPr>
+          <w:b/>
+          <w:bCs/>
+          <w:sz w:val="32"/>
+          <w:szCs w:val="32"/>
+        </w:rPr>
+        <w:lastRenderedPageBreak/>
+        <w:t>TEMA: Control de Estados en Formularios ABM (Desafío Práctico)</w:t>
+      </w:r>
+    </w:p>
+    <w:p>
+      <w:pPr>
+        <w:numPr>
+          <w:ilvl w:val="0"/>
+          <w:numId w:val="19"/>
+        </w:numPr>
+        <w:tabs>
+          <w:tab w:val="left" w:pos="2323"/>
+        </w:tabs>
+        <w:rPr>
+          <w:sz w:val="32"/>
+          <w:szCs w:val="32"/>
+        </w:rPr>
+      </w:pPr>
+      <w:r>
+        <w:rPr>
+          <w:b/>
+          <w:bCs/>
+          <w:sz w:val="32"/>
+          <w:szCs w:val="32"/>
+        </w:rPr>
+        <w:t>Gestión de Interfaz Dinámica:</w:t>
+      </w:r>
+      <w:r>
+        <w:rPr>
+          <w:sz w:val="32"/>
+          <w:szCs w:val="32"/>
+        </w:rPr>
+        <w:t xml:space="preserve"> Un mismo archivo .</w:t>
+      </w:r>
+      <w:proofErr w:type="spellStart"/>
+      <w:r>
+        <w:rPr>
+          <w:sz w:val="32"/>
+          <w:szCs w:val="32"/>
+        </w:rPr>
+        <w:t>aspx</w:t>
+      </w:r>
+      <w:proofErr w:type="spellEnd"/>
+      <w:r>
+        <w:rPr>
+          <w:sz w:val="32"/>
+          <w:szCs w:val="32"/>
+        </w:rPr>
+        <w:t xml:space="preserve"> puede funcionar tanto para Alta (</w:t>
+      </w:r>
+      <w:proofErr w:type="spellStart"/>
+      <w:r>
+        <w:rPr>
+          <w:sz w:val="32"/>
+          <w:szCs w:val="32"/>
+        </w:rPr>
+        <w:t>Create</w:t>
+      </w:r>
+      <w:proofErr w:type="spellEnd"/>
+      <w:r>
+        <w:rPr>
+          <w:sz w:val="32"/>
+          <w:szCs w:val="32"/>
+        </w:rPr>
+        <w:t>) como para Modificación/Baja (</w:t>
+      </w:r>
+      <w:proofErr w:type="spellStart"/>
+      <w:r>
+        <w:rPr>
+          <w:sz w:val="32"/>
+          <w:szCs w:val="32"/>
+        </w:rPr>
+        <w:t>Update</w:t>
+      </w:r>
+      <w:proofErr w:type="spellEnd"/>
+      <w:r>
+        <w:rPr>
+          <w:sz w:val="32"/>
+          <w:szCs w:val="32"/>
+        </w:rPr>
+        <w:t>/</w:t>
+      </w:r>
+      <w:proofErr w:type="spellStart"/>
+      <w:r>
+        <w:rPr>
+          <w:sz w:val="32"/>
+          <w:szCs w:val="32"/>
+        </w:rPr>
+        <w:t>Delete</w:t>
+      </w:r>
+      <w:proofErr w:type="spellEnd"/>
+      <w:r>
+        <w:rPr>
+          <w:sz w:val="32"/>
+          <w:szCs w:val="32"/>
+        </w:rPr>
+        <w:t>). La clave es evaluar la existencia de parámetros en la URL (</w:t>
+      </w:r>
+      <w:proofErr w:type="spellStart"/>
+      <w:r>
+        <w:rPr>
+          <w:sz w:val="32"/>
+          <w:szCs w:val="32"/>
+        </w:rPr>
+        <w:t>Request.QueryString</w:t>
+      </w:r>
+      <w:proofErr w:type="spellEnd"/>
+      <w:r>
+        <w:rPr>
+          <w:sz w:val="32"/>
+          <w:szCs w:val="32"/>
+        </w:rPr>
+        <w:t xml:space="preserve">) durante el </w:t>
+      </w:r>
+      <w:proofErr w:type="spellStart"/>
+      <w:r>
+        <w:rPr>
+          <w:sz w:val="32"/>
+          <w:szCs w:val="32"/>
+        </w:rPr>
+        <w:t>Page_Load</w:t>
+      </w:r>
+      <w:proofErr w:type="spellEnd"/>
+      <w:r>
+        <w:rPr>
+          <w:sz w:val="32"/>
+          <w:szCs w:val="32"/>
+        </w:rPr>
+        <w:t xml:space="preserve"> inicial </w:t>
+      </w:r>
+      <w:proofErr w:type="gramStart"/>
+      <w:r>
+        <w:rPr>
+          <w:sz w:val="32"/>
+          <w:szCs w:val="32"/>
+        </w:rPr>
+        <w:t>(!</w:t>
+      </w:r>
+      <w:proofErr w:type="spellStart"/>
+      <w:r>
+        <w:rPr>
+          <w:sz w:val="32"/>
+          <w:szCs w:val="32"/>
+        </w:rPr>
+        <w:t>IsPostBack</w:t>
+      </w:r>
+      <w:proofErr w:type="spellEnd"/>
+      <w:proofErr w:type="gramEnd"/>
+      <w:r>
+        <w:rPr>
+          <w:sz w:val="32"/>
+          <w:szCs w:val="32"/>
+        </w:rPr>
+        <w:t>) para alternar la propiedad .Visible o .</w:t>
+      </w:r>
+      <w:proofErr w:type="spellStart"/>
+      <w:r>
+        <w:rPr>
+          <w:sz w:val="32"/>
+          <w:szCs w:val="32"/>
+        </w:rPr>
+        <w:t>Enabled</w:t>
+      </w:r>
+      <w:proofErr w:type="spellEnd"/>
+      <w:r>
+        <w:rPr>
+          <w:sz w:val="32"/>
+          <w:szCs w:val="32"/>
+        </w:rPr>
+        <w:t xml:space="preserve"> de los botones de acción.</w:t>
+      </w:r>
+    </w:p>
+    <w:p>
+      <w:pPr>
+        <w:numPr>
+          <w:ilvl w:val="0"/>
+          <w:numId w:val="19"/>
+        </w:numPr>
+        <w:tabs>
+          <w:tab w:val="left" w:pos="2323"/>
+        </w:tabs>
+        <w:rPr>
+          <w:sz w:val="32"/>
+          <w:szCs w:val="32"/>
+        </w:rPr>
+      </w:pPr>
+      <w:r>
+        <w:rPr>
+          <w:b/>
+          <w:bCs/>
+          <w:sz w:val="32"/>
+          <w:szCs w:val="32"/>
+        </w:rPr>
+        <w:t>Modificación en Memoria (</w:t>
+      </w:r>
+      <w:proofErr w:type="spellStart"/>
+      <w:r>
+        <w:rPr>
+          <w:b/>
+          <w:bCs/>
+          <w:sz w:val="32"/>
+          <w:szCs w:val="32"/>
+        </w:rPr>
+        <w:t>Update</w:t>
+      </w:r>
+      <w:proofErr w:type="spellEnd"/>
+      <w:r>
+        <w:rPr>
+          <w:b/>
+          <w:bCs/>
+          <w:sz w:val="32"/>
+          <w:szCs w:val="32"/>
+        </w:rPr>
+        <w:t>):</w:t>
+      </w:r>
+      <w:r>
+        <w:rPr>
+          <w:sz w:val="32"/>
+          <w:szCs w:val="32"/>
+        </w:rPr>
+        <w:t xml:space="preserve"> Al trabajar con la </w:t>
+      </w:r>
+      <w:proofErr w:type="spellStart"/>
+      <w:r>
+        <w:rPr>
+          <w:sz w:val="32"/>
+          <w:szCs w:val="32"/>
+        </w:rPr>
+        <w:t>Session</w:t>
+      </w:r>
+      <w:proofErr w:type="spellEnd"/>
+      <w:r>
+        <w:rPr>
+          <w:sz w:val="32"/>
+          <w:szCs w:val="32"/>
+        </w:rPr>
+        <w:t>, no es necesario hacer un "</w:t>
+      </w:r>
+      <w:proofErr w:type="spellStart"/>
+      <w:r>
+        <w:rPr>
+          <w:sz w:val="32"/>
+          <w:szCs w:val="32"/>
+        </w:rPr>
+        <w:t>Save</w:t>
+      </w:r>
+      <w:proofErr w:type="spellEnd"/>
+      <w:r>
+        <w:rPr>
+          <w:sz w:val="32"/>
+          <w:szCs w:val="32"/>
+        </w:rPr>
+        <w:t xml:space="preserve">" explícito luego de modificar. Al recuperar el objeto </w:t>
+      </w:r>
+      <w:proofErr w:type="gramStart"/>
+      <w:r>
+        <w:rPr>
+          <w:sz w:val="32"/>
+          <w:szCs w:val="32"/>
+        </w:rPr>
+        <w:t>mediante .</w:t>
+      </w:r>
+      <w:proofErr w:type="spellStart"/>
+      <w:r>
+        <w:rPr>
+          <w:sz w:val="32"/>
+          <w:szCs w:val="32"/>
+        </w:rPr>
+        <w:t>Find</w:t>
+      </w:r>
+      <w:proofErr w:type="spellEnd"/>
+      <w:proofErr w:type="gramEnd"/>
+      <w:r>
+        <w:rPr>
+          <w:sz w:val="32"/>
+          <w:szCs w:val="32"/>
+        </w:rPr>
+        <w:t xml:space="preserve">(), obtenemos su referencia en memoria. Cambiar sus propiedades (ej. </w:t>
+      </w:r>
+      <w:proofErr w:type="spellStart"/>
+      <w:proofErr w:type="gramStart"/>
+      <w:r>
+        <w:rPr>
+          <w:sz w:val="32"/>
+          <w:szCs w:val="32"/>
+        </w:rPr>
+        <w:t>objeto.Nombre</w:t>
+      </w:r>
+      <w:proofErr w:type="spellEnd"/>
+      <w:proofErr w:type="gramEnd"/>
+      <w:r>
+        <w:rPr>
+          <w:sz w:val="32"/>
+          <w:szCs w:val="32"/>
+        </w:rPr>
+        <w:t xml:space="preserve"> = "Nuevo") altera directamente el dato almacenado en el servidor.</w:t>
+      </w:r>
+    </w:p>
+    <w:p>
+      <w:pPr>
+        <w:numPr>
+          <w:ilvl w:val="0"/>
+          <w:numId w:val="19"/>
+        </w:numPr>
+        <w:tabs>
+          <w:tab w:val="left" w:pos="2323"/>
+        </w:tabs>
+        <w:rPr>
+          <w:sz w:val="32"/>
+          <w:szCs w:val="32"/>
+        </w:rPr>
+      </w:pPr>
+      <w:r>
+        <w:rPr>
+          <w:b/>
+          <w:bCs/>
+          <w:sz w:val="32"/>
+          <w:szCs w:val="32"/>
+        </w:rPr>
+        <w:t>Eliminación en Memoria (</w:t>
+      </w:r>
+      <w:proofErr w:type="spellStart"/>
+      <w:r>
+        <w:rPr>
+          <w:b/>
+          <w:bCs/>
+          <w:sz w:val="32"/>
+          <w:szCs w:val="32"/>
+        </w:rPr>
+        <w:t>Delete</w:t>
+      </w:r>
+      <w:proofErr w:type="spellEnd"/>
+      <w:r>
+        <w:rPr>
+          <w:b/>
+          <w:bCs/>
+          <w:sz w:val="32"/>
+          <w:szCs w:val="32"/>
+        </w:rPr>
+        <w:t>):</w:t>
+      </w:r>
+      <w:r>
+        <w:rPr>
+          <w:sz w:val="32"/>
+          <w:szCs w:val="32"/>
+        </w:rPr>
+        <w:t xml:space="preserve"> Se aplica el </w:t>
+      </w:r>
+      <w:proofErr w:type="gramStart"/>
+      <w:r>
+        <w:rPr>
+          <w:sz w:val="32"/>
+          <w:szCs w:val="32"/>
+        </w:rPr>
+        <w:t>método .</w:t>
+      </w:r>
+      <w:proofErr w:type="spellStart"/>
+      <w:r>
+        <w:rPr>
+          <w:sz w:val="32"/>
+          <w:szCs w:val="32"/>
+        </w:rPr>
+        <w:t>Remove</w:t>
+      </w:r>
+      <w:proofErr w:type="spellEnd"/>
+      <w:proofErr w:type="gramEnd"/>
+      <w:r>
+        <w:rPr>
+          <w:sz w:val="32"/>
+          <w:szCs w:val="32"/>
+        </w:rPr>
+        <w:t xml:space="preserve">(objeto) de la clase </w:t>
+      </w:r>
+      <w:proofErr w:type="spellStart"/>
+      <w:r>
+        <w:rPr>
+          <w:sz w:val="32"/>
+          <w:szCs w:val="32"/>
+        </w:rPr>
+        <w:t>List</w:t>
+      </w:r>
+      <w:proofErr w:type="spellEnd"/>
+      <w:r>
+        <w:rPr>
+          <w:sz w:val="32"/>
+          <w:szCs w:val="32"/>
+        </w:rPr>
+        <w:t>&lt;T&gt;. Este método busca la referencia exacta del objeto dentro de la colección y lo desvincula, eliminándolo de la lista de forma permanente para la sesión actual.</w:t>
+      </w:r>
+    </w:p>
+    <w:p>
+      <w:pPr>
+        <w:tabs>
+          <w:tab w:val="left" w:pos="2323"/>
+        </w:tabs>
+        <w:rPr>
+          <w:sz w:val="32"/>
+          <w:szCs w:val="32"/>
+        </w:rPr>
+      </w:pPr>
+    </w:p>
+    <w:p>
+      <w:pPr>
+        <w:tabs>
+          <w:tab w:val="left" w:pos="2323"/>
+        </w:tabs>
+        <w:rPr>
+          <w:sz w:val="32"/>
+          <w:szCs w:val="32"/>
+          <w:u w:val="single"/>
+        </w:rPr>
+      </w:pPr>
     </w:p>
     <w:p>
       <w:pPr>
@@ -6822,6 +7890,268 @@
     </w:lvl>
   </w:abstractNum>
   <w:abstractNum w:abstractNumId="5" w15:restartNumberingAfterBreak="0">
+    <w:nsid w:val="2B837F55"/>
+    <w:multiLevelType w:val="multilevel"/>
+    <w:tmpl w:val="4ADC4BFA"/>
+    <w:lvl w:ilvl="0">
+      <w:start w:val="1"/>
+      <w:numFmt w:val="decimal"/>
+      <w:lvlText w:val="%1."/>
+      <w:lvlJc w:val="left"/>
+      <w:pPr>
+        <w:tabs>
+          <w:tab w:val="num" w:pos="720"/>
+        </w:tabs>
+        <w:ind w:left="720" w:hanging="360"/>
+      </w:pPr>
+    </w:lvl>
+    <w:lvl w:ilvl="1" w:tentative="1">
+      <w:start w:val="1"/>
+      <w:numFmt w:val="decimal"/>
+      <w:lvlText w:val="%2."/>
+      <w:lvlJc w:val="left"/>
+      <w:pPr>
+        <w:tabs>
+          <w:tab w:val="num" w:pos="1440"/>
+        </w:tabs>
+        <w:ind w:left="1440" w:hanging="360"/>
+      </w:pPr>
+    </w:lvl>
+    <w:lvl w:ilvl="2" w:tentative="1">
+      <w:start w:val="1"/>
+      <w:numFmt w:val="decimal"/>
+      <w:lvlText w:val="%3."/>
+      <w:lvlJc w:val="left"/>
+      <w:pPr>
+        <w:tabs>
+          <w:tab w:val="num" w:pos="2160"/>
+        </w:tabs>
+        <w:ind w:left="2160" w:hanging="360"/>
+      </w:pPr>
+    </w:lvl>
+    <w:lvl w:ilvl="3" w:tentative="1">
+      <w:start w:val="1"/>
+      <w:numFmt w:val="decimal"/>
+      <w:lvlText w:val="%4."/>
+      <w:lvlJc w:val="left"/>
+      <w:pPr>
+        <w:tabs>
+          <w:tab w:val="num" w:pos="2880"/>
+        </w:tabs>
+        <w:ind w:left="2880" w:hanging="360"/>
+      </w:pPr>
+    </w:lvl>
+    <w:lvl w:ilvl="4" w:tentative="1">
+      <w:start w:val="1"/>
+      <w:numFmt w:val="decimal"/>
+      <w:lvlText w:val="%5."/>
+      <w:lvlJc w:val="left"/>
+      <w:pPr>
+        <w:tabs>
+          <w:tab w:val="num" w:pos="3600"/>
+        </w:tabs>
+        <w:ind w:left="3600" w:hanging="360"/>
+      </w:pPr>
+    </w:lvl>
+    <w:lvl w:ilvl="5" w:tentative="1">
+      <w:start w:val="1"/>
+      <w:numFmt w:val="decimal"/>
+      <w:lvlText w:val="%6."/>
+      <w:lvlJc w:val="left"/>
+      <w:pPr>
+        <w:tabs>
+          <w:tab w:val="num" w:pos="4320"/>
+        </w:tabs>
+        <w:ind w:left="4320" w:hanging="360"/>
+      </w:pPr>
+    </w:lvl>
+    <w:lvl w:ilvl="6" w:tentative="1">
+      <w:start w:val="1"/>
+      <w:numFmt w:val="decimal"/>
+      <w:lvlText w:val="%7."/>
+      <w:lvlJc w:val="left"/>
+      <w:pPr>
+        <w:tabs>
+          <w:tab w:val="num" w:pos="5040"/>
+        </w:tabs>
+        <w:ind w:left="5040" w:hanging="360"/>
+      </w:pPr>
+    </w:lvl>
+    <w:lvl w:ilvl="7" w:tentative="1">
+      <w:start w:val="1"/>
+      <w:numFmt w:val="decimal"/>
+      <w:lvlText w:val="%8."/>
+      <w:lvlJc w:val="left"/>
+      <w:pPr>
+        <w:tabs>
+          <w:tab w:val="num" w:pos="5760"/>
+        </w:tabs>
+        <w:ind w:left="5760" w:hanging="360"/>
+      </w:pPr>
+    </w:lvl>
+    <w:lvl w:ilvl="8" w:tentative="1">
+      <w:start w:val="1"/>
+      <w:numFmt w:val="decimal"/>
+      <w:lvlText w:val="%9."/>
+      <w:lvlJc w:val="left"/>
+      <w:pPr>
+        <w:tabs>
+          <w:tab w:val="num" w:pos="6480"/>
+        </w:tabs>
+        <w:ind w:left="6480" w:hanging="360"/>
+      </w:pPr>
+    </w:lvl>
+  </w:abstractNum>
+  <w:abstractNum w:abstractNumId="6" w15:restartNumberingAfterBreak="0">
+    <w:nsid w:val="2CDF2AA8"/>
+    <w:multiLevelType w:val="multilevel"/>
+    <w:tmpl w:val="55E82F0C"/>
+    <w:lvl w:ilvl="0">
+      <w:start w:val="1"/>
+      <w:numFmt w:val="bullet"/>
+      <w:lvlText w:val=""/>
+      <w:lvlJc w:val="left"/>
+      <w:pPr>
+        <w:tabs>
+          <w:tab w:val="num" w:pos="720"/>
+        </w:tabs>
+        <w:ind w:left="720" w:hanging="360"/>
+      </w:pPr>
+      <w:rPr>
+        <w:rFonts w:ascii="Symbol" w:hAnsi="Symbol" w:hint="default"/>
+        <w:sz w:val="20"/>
+      </w:rPr>
+    </w:lvl>
+    <w:lvl w:ilvl="1" w:tentative="1">
+      <w:start w:val="1"/>
+      <w:numFmt w:val="bullet"/>
+      <w:lvlText w:val="o"/>
+      <w:lvlJc w:val="left"/>
+      <w:pPr>
+        <w:tabs>
+          <w:tab w:val="num" w:pos="1440"/>
+        </w:tabs>
+        <w:ind w:left="1440" w:hanging="360"/>
+      </w:pPr>
+      <w:rPr>
+        <w:rFonts w:ascii="Courier New" w:hAnsi="Courier New" w:hint="default"/>
+        <w:sz w:val="20"/>
+      </w:rPr>
+    </w:lvl>
+    <w:lvl w:ilvl="2" w:tentative="1">
+      <w:start w:val="1"/>
+      <w:numFmt w:val="bullet"/>
+      <w:lvlText w:val=""/>
+      <w:lvlJc w:val="left"/>
+      <w:pPr>
+        <w:tabs>
+          <w:tab w:val="num" w:pos="2160"/>
+        </w:tabs>
+        <w:ind w:left="2160" w:hanging="360"/>
+      </w:pPr>
+      <w:rPr>
+        <w:rFonts w:ascii="Wingdings" w:hAnsi="Wingdings" w:hint="default"/>
+        <w:sz w:val="20"/>
+      </w:rPr>
+    </w:lvl>
+    <w:lvl w:ilvl="3" w:tentative="1">
+      <w:start w:val="1"/>
+      <w:numFmt w:val="bullet"/>
+      <w:lvlText w:val=""/>
+      <w:lvlJc w:val="left"/>
+      <w:pPr>
+        <w:tabs>
+          <w:tab w:val="num" w:pos="2880"/>
+        </w:tabs>
+        <w:ind w:left="2880" w:hanging="360"/>
+      </w:pPr>
+      <w:rPr>
+        <w:rFonts w:ascii="Wingdings" w:hAnsi="Wingdings" w:hint="default"/>
+        <w:sz w:val="20"/>
+      </w:rPr>
+    </w:lvl>
+    <w:lvl w:ilvl="4" w:tentative="1">
+      <w:start w:val="1"/>
+      <w:numFmt w:val="bullet"/>
+      <w:lvlText w:val=""/>
+      <w:lvlJc w:val="left"/>
+      <w:pPr>
+        <w:tabs>
+          <w:tab w:val="num" w:pos="3600"/>
+        </w:tabs>
+        <w:ind w:left="3600" w:hanging="360"/>
+      </w:pPr>
+      <w:rPr>
+        <w:rFonts w:ascii="Wingdings" w:hAnsi="Wingdings" w:hint="default"/>
+        <w:sz w:val="20"/>
+      </w:rPr>
+    </w:lvl>
+    <w:lvl w:ilvl="5" w:tentative="1">
+      <w:start w:val="1"/>
+      <w:numFmt w:val="bullet"/>
+      <w:lvlText w:val=""/>
+      <w:lvlJc w:val="left"/>
+      <w:pPr>
+        <w:tabs>
+          <w:tab w:val="num" w:pos="4320"/>
+        </w:tabs>
+        <w:ind w:left="4320" w:hanging="360"/>
+      </w:pPr>
+      <w:rPr>
+        <w:rFonts w:ascii="Wingdings" w:hAnsi="Wingdings" w:hint="default"/>
+        <w:sz w:val="20"/>
+      </w:rPr>
+    </w:lvl>
+    <w:lvl w:ilvl="6" w:tentative="1">
+      <w:start w:val="1"/>
+      <w:numFmt w:val="bullet"/>
+      <w:lvlText w:val=""/>
+      <w:lvlJc w:val="left"/>
+      <w:pPr>
+        <w:tabs>
+          <w:tab w:val="num" w:pos="5040"/>
+        </w:tabs>
+        <w:ind w:left="5040" w:hanging="360"/>
+      </w:pPr>
+      <w:rPr>
+        <w:rFonts w:ascii="Wingdings" w:hAnsi="Wingdings" w:hint="default"/>
+        <w:sz w:val="20"/>
+      </w:rPr>
+    </w:lvl>
+    <w:lvl w:ilvl="7" w:tentative="1">
+      <w:start w:val="1"/>
+      <w:numFmt w:val="bullet"/>
+      <w:lvlText w:val=""/>
+      <w:lvlJc w:val="left"/>
+      <w:pPr>
+        <w:tabs>
+          <w:tab w:val="num" w:pos="5760"/>
+        </w:tabs>
+        <w:ind w:left="5760" w:hanging="360"/>
+      </w:pPr>
+      <w:rPr>
+        <w:rFonts w:ascii="Wingdings" w:hAnsi="Wingdings" w:hint="default"/>
+        <w:sz w:val="20"/>
+      </w:rPr>
+    </w:lvl>
+    <w:lvl w:ilvl="8" w:tentative="1">
+      <w:start w:val="1"/>
+      <w:numFmt w:val="bullet"/>
+      <w:lvlText w:val=""/>
+      <w:lvlJc w:val="left"/>
+      <w:pPr>
+        <w:tabs>
+          <w:tab w:val="num" w:pos="6480"/>
+        </w:tabs>
+        <w:ind w:left="6480" w:hanging="360"/>
+      </w:pPr>
+      <w:rPr>
+        <w:rFonts w:ascii="Wingdings" w:hAnsi="Wingdings" w:hint="default"/>
+        <w:sz w:val="20"/>
+      </w:rPr>
+    </w:lvl>
+  </w:abstractNum>
+  <w:abstractNum w:abstractNumId="7" w15:restartNumberingAfterBreak="0">
     <w:nsid w:val="310B33C8"/>
     <w:multiLevelType w:val="multilevel"/>
     <w:tmpl w:val="92124254"/>
@@ -6970,7 +8300,7 @@
       </w:rPr>
     </w:lvl>
   </w:abstractNum>
-  <w:abstractNum w:abstractNumId="6" w15:restartNumberingAfterBreak="0">
+  <w:abstractNum w:abstractNumId="8" w15:restartNumberingAfterBreak="0">
     <w:nsid w:val="3C5140D7"/>
     <w:multiLevelType w:val="multilevel"/>
     <w:tmpl w:val="524A6932"/>
@@ -7119,7 +8449,7 @@
       </w:rPr>
     </w:lvl>
   </w:abstractNum>
-  <w:abstractNum w:abstractNumId="7" w15:restartNumberingAfterBreak="0">
+  <w:abstractNum w:abstractNumId="9" w15:restartNumberingAfterBreak="0">
     <w:nsid w:val="4A235944"/>
     <w:multiLevelType w:val="multilevel"/>
     <w:tmpl w:val="86D88C52"/>
@@ -7268,7 +8598,7 @@
       </w:rPr>
     </w:lvl>
   </w:abstractNum>
-  <w:abstractNum w:abstractNumId="8" w15:restartNumberingAfterBreak="0">
+  <w:abstractNum w:abstractNumId="10" w15:restartNumberingAfterBreak="0">
     <w:nsid w:val="54A92773"/>
     <w:multiLevelType w:val="multilevel"/>
     <w:tmpl w:val="1E52947E"/>
@@ -7417,7 +8747,7 @@
       </w:rPr>
     </w:lvl>
   </w:abstractNum>
-  <w:abstractNum w:abstractNumId="9" w15:restartNumberingAfterBreak="0">
+  <w:abstractNum w:abstractNumId="11" w15:restartNumberingAfterBreak="0">
     <w:nsid w:val="596B1DFE"/>
     <w:multiLevelType w:val="multilevel"/>
     <w:tmpl w:val="A5FA00B4"/>
@@ -7566,7 +8896,7 @@
       </w:rPr>
     </w:lvl>
   </w:abstractNum>
-  <w:abstractNum w:abstractNumId="10" w15:restartNumberingAfterBreak="0">
+  <w:abstractNum w:abstractNumId="12" w15:restartNumberingAfterBreak="0">
     <w:nsid w:val="6A7B460C"/>
     <w:multiLevelType w:val="multilevel"/>
     <w:tmpl w:val="E27AE180"/>
@@ -7715,7 +9045,7 @@
       </w:rPr>
     </w:lvl>
   </w:abstractNum>
-  <w:abstractNum w:abstractNumId="11" w15:restartNumberingAfterBreak="0">
+  <w:abstractNum w:abstractNumId="13" w15:restartNumberingAfterBreak="0">
     <w:nsid w:val="6DDE2F84"/>
     <w:multiLevelType w:val="multilevel"/>
     <w:tmpl w:val="40544238"/>
@@ -7864,7 +9194,156 @@
       </w:rPr>
     </w:lvl>
   </w:abstractNum>
-  <w:abstractNum w:abstractNumId="12" w15:restartNumberingAfterBreak="0">
+  <w:abstractNum w:abstractNumId="14" w15:restartNumberingAfterBreak="0">
+    <w:nsid w:val="727B19F9"/>
+    <w:multiLevelType w:val="multilevel"/>
+    <w:tmpl w:val="269A3E5C"/>
+    <w:lvl w:ilvl="0">
+      <w:start w:val="1"/>
+      <w:numFmt w:val="bullet"/>
+      <w:lvlText w:val=""/>
+      <w:lvlJc w:val="left"/>
+      <w:pPr>
+        <w:tabs>
+          <w:tab w:val="num" w:pos="720"/>
+        </w:tabs>
+        <w:ind w:left="720" w:hanging="360"/>
+      </w:pPr>
+      <w:rPr>
+        <w:rFonts w:ascii="Symbol" w:hAnsi="Symbol" w:hint="default"/>
+        <w:sz w:val="20"/>
+      </w:rPr>
+    </w:lvl>
+    <w:lvl w:ilvl="1" w:tentative="1">
+      <w:start w:val="1"/>
+      <w:numFmt w:val="bullet"/>
+      <w:lvlText w:val="o"/>
+      <w:lvlJc w:val="left"/>
+      <w:pPr>
+        <w:tabs>
+          <w:tab w:val="num" w:pos="1440"/>
+        </w:tabs>
+        <w:ind w:left="1440" w:hanging="360"/>
+      </w:pPr>
+      <w:rPr>
+        <w:rFonts w:ascii="Courier New" w:hAnsi="Courier New" w:hint="default"/>
+        <w:sz w:val="20"/>
+      </w:rPr>
+    </w:lvl>
+    <w:lvl w:ilvl="2" w:tentative="1">
+      <w:start w:val="1"/>
+      <w:numFmt w:val="bullet"/>
+      <w:lvlText w:val=""/>
+      <w:lvlJc w:val="left"/>
+      <w:pPr>
+        <w:tabs>
+          <w:tab w:val="num" w:pos="2160"/>
+        </w:tabs>
+        <w:ind w:left="2160" w:hanging="360"/>
+      </w:pPr>
+      <w:rPr>
+        <w:rFonts w:ascii="Wingdings" w:hAnsi="Wingdings" w:hint="default"/>
+        <w:sz w:val="20"/>
+      </w:rPr>
+    </w:lvl>
+    <w:lvl w:ilvl="3" w:tentative="1">
+      <w:start w:val="1"/>
+      <w:numFmt w:val="bullet"/>
+      <w:lvlText w:val=""/>
+      <w:lvlJc w:val="left"/>
+      <w:pPr>
+        <w:tabs>
+          <w:tab w:val="num" w:pos="2880"/>
+        </w:tabs>
+        <w:ind w:left="2880" w:hanging="360"/>
+      </w:pPr>
+      <w:rPr>
+        <w:rFonts w:ascii="Wingdings" w:hAnsi="Wingdings" w:hint="default"/>
+        <w:sz w:val="20"/>
+      </w:rPr>
+    </w:lvl>
+    <w:lvl w:ilvl="4" w:tentative="1">
+      <w:start w:val="1"/>
+      <w:numFmt w:val="bullet"/>
+      <w:lvlText w:val=""/>
+      <w:lvlJc w:val="left"/>
+      <w:pPr>
+        <w:tabs>
+          <w:tab w:val="num" w:pos="3600"/>
+        </w:tabs>
+        <w:ind w:left="3600" w:hanging="360"/>
+      </w:pPr>
+      <w:rPr>
+        <w:rFonts w:ascii="Wingdings" w:hAnsi="Wingdings" w:hint="default"/>
+        <w:sz w:val="20"/>
+      </w:rPr>
+    </w:lvl>
+    <w:lvl w:ilvl="5" w:tentative="1">
+      <w:start w:val="1"/>
+      <w:numFmt w:val="bullet"/>
+      <w:lvlText w:val=""/>
+      <w:lvlJc w:val="left"/>
+      <w:pPr>
+        <w:tabs>
+          <w:tab w:val="num" w:pos="4320"/>
+        </w:tabs>
+        <w:ind w:left="4320" w:hanging="360"/>
+      </w:pPr>
+      <w:rPr>
+        <w:rFonts w:ascii="Wingdings" w:hAnsi="Wingdings" w:hint="default"/>
+        <w:sz w:val="20"/>
+      </w:rPr>
+    </w:lvl>
+    <w:lvl w:ilvl="6" w:tentative="1">
+      <w:start w:val="1"/>
+      <w:numFmt w:val="bullet"/>
+      <w:lvlText w:val=""/>
+      <w:lvlJc w:val="left"/>
+      <w:pPr>
+        <w:tabs>
+          <w:tab w:val="num" w:pos="5040"/>
+        </w:tabs>
+        <w:ind w:left="5040" w:hanging="360"/>
+      </w:pPr>
+      <w:rPr>
+        <w:rFonts w:ascii="Wingdings" w:hAnsi="Wingdings" w:hint="default"/>
+        <w:sz w:val="20"/>
+      </w:rPr>
+    </w:lvl>
+    <w:lvl w:ilvl="7" w:tentative="1">
+      <w:start w:val="1"/>
+      <w:numFmt w:val="bullet"/>
+      <w:lvlText w:val=""/>
+      <w:lvlJc w:val="left"/>
+      <w:pPr>
+        <w:tabs>
+          <w:tab w:val="num" w:pos="5760"/>
+        </w:tabs>
+        <w:ind w:left="5760" w:hanging="360"/>
+      </w:pPr>
+      <w:rPr>
+        <w:rFonts w:ascii="Wingdings" w:hAnsi="Wingdings" w:hint="default"/>
+        <w:sz w:val="20"/>
+      </w:rPr>
+    </w:lvl>
+    <w:lvl w:ilvl="8" w:tentative="1">
+      <w:start w:val="1"/>
+      <w:numFmt w:val="bullet"/>
+      <w:lvlText w:val=""/>
+      <w:lvlJc w:val="left"/>
+      <w:pPr>
+        <w:tabs>
+          <w:tab w:val="num" w:pos="6480"/>
+        </w:tabs>
+        <w:ind w:left="6480" w:hanging="360"/>
+      </w:pPr>
+      <w:rPr>
+        <w:rFonts w:ascii="Wingdings" w:hAnsi="Wingdings" w:hint="default"/>
+        <w:sz w:val="20"/>
+      </w:rPr>
+    </w:lvl>
+  </w:abstractNum>
+  <w:abstractNum w:abstractNumId="15" w15:restartNumberingAfterBreak="0">
     <w:nsid w:val="796569AA"/>
     <w:multiLevelType w:val="multilevel"/>
     <w:tmpl w:val="CFA2006E"/>
@@ -8013,7 +9492,7 @@
       </w:rPr>
     </w:lvl>
   </w:abstractNum>
-  <w:abstractNum w:abstractNumId="13" w15:restartNumberingAfterBreak="0">
+  <w:abstractNum w:abstractNumId="16" w15:restartNumberingAfterBreak="0">
     <w:nsid w:val="7BE84AB2"/>
     <w:multiLevelType w:val="multilevel"/>
     <w:tmpl w:val="9056BADC"/>
@@ -8162,7 +9641,7 @@
       </w:rPr>
     </w:lvl>
   </w:abstractNum>
-  <w:abstractNum w:abstractNumId="14" w15:restartNumberingAfterBreak="0">
+  <w:abstractNum w:abstractNumId="17" w15:restartNumberingAfterBreak="0">
     <w:nsid w:val="7D5C792D"/>
     <w:multiLevelType w:val="multilevel"/>
     <w:tmpl w:val="FF3C5A52"/>
@@ -8311,7 +9790,7 @@
       </w:rPr>
     </w:lvl>
   </w:abstractNum>
-  <w:abstractNum w:abstractNumId="15" w15:restartNumberingAfterBreak="0">
+  <w:abstractNum w:abstractNumId="18" w15:restartNumberingAfterBreak="0">
     <w:nsid w:val="7E142B6E"/>
     <w:multiLevelType w:val="multilevel"/>
     <w:tmpl w:val="C8FAB37E"/>
@@ -8464,7 +9943,7 @@
     <w:abstractNumId w:val="2"/>
   </w:num>
   <w:num w:numId="2" w16cid:durableId="1474448373">
-    <w:abstractNumId w:val="10"/>
+    <w:abstractNumId w:val="12"/>
   </w:num>
   <w:num w:numId="3" w16cid:durableId="916401406">
     <w:abstractNumId w:val="4"/>
@@ -8473,40 +9952,49 @@
     <w:abstractNumId w:val="3"/>
   </w:num>
   <w:num w:numId="5" w16cid:durableId="566914713">
-    <w:abstractNumId w:val="6"/>
+    <w:abstractNumId w:val="8"/>
   </w:num>
   <w:num w:numId="6" w16cid:durableId="1284193791">
-    <w:abstractNumId w:val="15"/>
+    <w:abstractNumId w:val="18"/>
   </w:num>
   <w:num w:numId="7" w16cid:durableId="657420732">
-    <w:abstractNumId w:val="8"/>
+    <w:abstractNumId w:val="10"/>
   </w:num>
   <w:num w:numId="8" w16cid:durableId="1311246361">
     <w:abstractNumId w:val="0"/>
   </w:num>
   <w:num w:numId="9" w16cid:durableId="850484044">
-    <w:abstractNumId w:val="9"/>
+    <w:abstractNumId w:val="11"/>
   </w:num>
   <w:num w:numId="10" w16cid:durableId="1021593613">
     <w:abstractNumId w:val="1"/>
   </w:num>
   <w:num w:numId="11" w16cid:durableId="653877594">
+    <w:abstractNumId w:val="17"/>
+  </w:num>
+  <w:num w:numId="12" w16cid:durableId="376928250">
+    <w:abstractNumId w:val="16"/>
+  </w:num>
+  <w:num w:numId="13" w16cid:durableId="1834489768">
+    <w:abstractNumId w:val="15"/>
+  </w:num>
+  <w:num w:numId="14" w16cid:durableId="1837111135">
+    <w:abstractNumId w:val="7"/>
+  </w:num>
+  <w:num w:numId="15" w16cid:durableId="1733113555">
+    <w:abstractNumId w:val="9"/>
+  </w:num>
+  <w:num w:numId="16" w16cid:durableId="1721199800">
+    <w:abstractNumId w:val="13"/>
+  </w:num>
+  <w:num w:numId="17" w16cid:durableId="569467167">
+    <w:abstractNumId w:val="6"/>
+  </w:num>
+  <w:num w:numId="18" w16cid:durableId="1755512913">
     <w:abstractNumId w:val="14"/>
   </w:num>
-  <w:num w:numId="12" w16cid:durableId="376928250">
-    <w:abstractNumId w:val="13"/>
-  </w:num>
-  <w:num w:numId="13" w16cid:durableId="1834489768">
-    <w:abstractNumId w:val="12"/>
-  </w:num>
-  <w:num w:numId="14" w16cid:durableId="1837111135">
+  <w:num w:numId="19" w16cid:durableId="192422744">
     <w:abstractNumId w:val="5"/>
-  </w:num>
-  <w:num w:numId="15" w16cid:durableId="1733113555">
-    <w:abstractNumId w:val="7"/>
-  </w:num>
-  <w:num w:numId="16" w16cid:durableId="1721199800">
-    <w:abstractNumId w:val="11"/>
   </w:num>
 </w:numbering>
 </file>

</xml_diff>